<commit_message>
Changed MOU Template and pricing structure
</commit_message>
<xml_diff>
--- a/templates/mou/lia-mou-automation-template.docx
+++ b/templates/mou/lia-mou-automation-template.docx
@@ -8493,6 +8493,8 @@
         <w:rPr>
           <w:rFonts w:ascii="Arimo" w:cs="Arimo" w:eastAsia="Arimo" w:hAnsi="Arimo"/>
         </w:rPr>
+        <w:pageBreakBefore/>
+        <w:pageBreakBefore/>
       </w:pPr>
       <w:r>
         <w:rPr>
@@ -8519,16 +8521,19 @@
         <w:gridCol w:w="2825"/>
       </w:tblGrid>
       <w:tr>
+        <w:trPr>
+          <w:cantSplit/>
+        </w:trPr>
         <w:tc>
           <w:tcPr>
             <w:tcW w:type="dxa" w:w="10728"/>
             <w:vAlign w:val="center"/>
             <w:gridSpan w:val="2"/>
             <w:tcMar>
-              <w:top w:w="120" w:type="dxa"/>
-              <w:start w:w="140" w:type="dxa"/>
-              <w:bottom w:w="120" w:type="dxa"/>
-              <w:end w:w="140" w:type="dxa"/>
+              <w:top w:w="70" w:type="dxa"/>
+              <w:start w:w="120" w:type="dxa"/>
+              <w:bottom w:w="70" w:type="dxa"/>
+              <w:end w:w="120" w:type="dxa"/>
             </w:tcMar>
             <w:shd w:fill="C4122F"/>
           </w:tcPr>
@@ -8542,23 +8547,26 @@
                 <w:rFonts w:ascii="Arimo" w:hAnsi="Arimo"/>
                 <w:b/>
                 <w:color w:val="FFFFFF"/>
-                <w:sz w:val="20"/>
+                <w:sz w:val="18"/>
               </w:rPr>
-              <w:t>FIRST-YEAR LAUNCH PRICING - {{launch_school_year}}</w:t>
+              <w:t>INITIAL START-UP COSTS - {{launch_school_year}}</w:t>
             </w:r>
           </w:p>
         </w:tc>
       </w:tr>
       <w:tr>
+        <w:trPr>
+          <w:cantSplit/>
+        </w:trPr>
         <w:tc>
           <w:tcPr>
             <w:tcW w:type="dxa" w:w="7920"/>
             <w:vAlign w:val="center"/>
             <w:tcMar>
-              <w:top w:w="120" w:type="dxa"/>
-              <w:start w:w="140" w:type="dxa"/>
-              <w:bottom w:w="120" w:type="dxa"/>
-              <w:end w:w="140" w:type="dxa"/>
+              <w:top w:w="70" w:type="dxa"/>
+              <w:start w:w="120" w:type="dxa"/>
+              <w:bottom w:w="70" w:type="dxa"/>
+              <w:end w:w="120" w:type="dxa"/>
             </w:tcMar>
           </w:tcPr>
           <w:p>
@@ -8571,9 +8579,9 @@
                 <w:rFonts w:ascii="Arimo" w:hAnsi="Arimo"/>
                 <w:b w:val="0"/>
                 <w:color w:val="222222"/>
-                <w:sz w:val="20"/>
+                <w:sz w:val="18"/>
               </w:rPr>
-              <w:t>First-Year Launch Price</w:t>
+              <w:t>Start-up fee, onboarding, and first-year training — per Middle or High School</w:t>
             </w:r>
           </w:p>
         </w:tc>
@@ -8582,10 +8590,10 @@
             <w:tcW w:type="dxa" w:w="2808"/>
             <w:vAlign w:val="center"/>
             <w:tcMar>
-              <w:top w:w="120" w:type="dxa"/>
-              <w:start w:w="140" w:type="dxa"/>
-              <w:bottom w:w="120" w:type="dxa"/>
-              <w:end w:w="140" w:type="dxa"/>
+              <w:top w:w="70" w:type="dxa"/>
+              <w:start w:w="120" w:type="dxa"/>
+              <w:bottom w:w="70" w:type="dxa"/>
+              <w:end w:w="120" w:type="dxa"/>
             </w:tcMar>
           </w:tcPr>
           <w:p>
@@ -8599,23 +8607,26 @@
                 <w:rFonts w:ascii="Arimo" w:hAnsi="Arimo"/>
                 <w:b w:val="0"/>
                 <w:color w:val="222222"/>
-                <w:sz w:val="20"/>
+                <w:sz w:val="18"/>
               </w:rPr>
-              <w:t>{{launch_base_price}}</w:t>
+              <w:t>$2,500</w:t>
             </w:r>
           </w:p>
         </w:tc>
       </w:tr>
       <w:tr>
+        <w:trPr>
+          <w:cantSplit/>
+        </w:trPr>
         <w:tc>
           <w:tcPr>
             <w:tcW w:type="dxa" w:w="7920"/>
             <w:vAlign w:val="center"/>
             <w:tcMar>
-              <w:top w:w="120" w:type="dxa"/>
-              <w:start w:w="140" w:type="dxa"/>
-              <w:bottom w:w="120" w:type="dxa"/>
-              <w:end w:w="140" w:type="dxa"/>
+              <w:top w:w="70" w:type="dxa"/>
+              <w:start w:w="120" w:type="dxa"/>
+              <w:bottom w:w="70" w:type="dxa"/>
+              <w:end w:w="120" w:type="dxa"/>
             </w:tcMar>
           </w:tcPr>
           <w:p>
@@ -8628,9 +8639,9 @@
                 <w:rFonts w:ascii="Arimo" w:hAnsi="Arimo"/>
                 <w:b w:val="0"/>
                 <w:color w:val="222222"/>
-                <w:sz w:val="20"/>
+                <w:sz w:val="18"/>
               </w:rPr>
-              <w:t>Launch Discount - {{launch_discount_name}}</w:t>
+              <w:t>Launching LIA: implementation training, teacher certification, and administrator/counselor training</w:t>
             </w:r>
           </w:p>
         </w:tc>
@@ -8639,10 +8650,10 @@
             <w:tcW w:type="dxa" w:w="2808"/>
             <w:vAlign w:val="center"/>
             <w:tcMar>
-              <w:top w:w="120" w:type="dxa"/>
-              <w:start w:w="140" w:type="dxa"/>
-              <w:bottom w:w="120" w:type="dxa"/>
-              <w:end w:w="140" w:type="dxa"/>
+              <w:top w:w="70" w:type="dxa"/>
+              <w:start w:w="120" w:type="dxa"/>
+              <w:bottom w:w="70" w:type="dxa"/>
+              <w:end w:w="120" w:type="dxa"/>
             </w:tcMar>
           </w:tcPr>
           <w:p>
@@ -8656,9 +8667,1518 @@
                 <w:rFonts w:ascii="Arimo" w:hAnsi="Arimo"/>
                 <w:b w:val="0"/>
                 <w:color w:val="222222"/>
-                <w:sz w:val="20"/>
+                <w:sz w:val="18"/>
               </w:rPr>
-              <w:t>- {{launch_discount_amount}}</w:t>
+              <w:t>Included</w:t>
+            </w:r>
+          </w:p>
+        </w:tc>
+      </w:tr>
+      <w:tr>
+        <w:trPr>
+          <w:cantSplit/>
+        </w:trPr>
+        <w:tc>
+          <w:tcPr>
+            <w:tcW w:type="dxa" w:w="7920"/>
+            <w:vAlign w:val="center"/>
+            <w:tcMar>
+              <w:top w:w="70" w:type="dxa"/>
+              <w:start w:w="120" w:type="dxa"/>
+              <w:bottom w:w="70" w:type="dxa"/>
+              <w:end w:w="120" w:type="dxa"/>
+            </w:tcMar>
+          </w:tcPr>
+          <w:p>
+            <w:pPr>
+              <w:spacing w:before="0" w:after="0"/>
+            </w:pPr>
+            <w:r/>
+            <w:r>
+              <w:rPr>
+                <w:rFonts w:ascii="Arimo" w:hAnsi="Arimo"/>
+                <w:b w:val="0"/>
+                <w:color w:val="222222"/>
+                <w:sz w:val="18"/>
+              </w:rPr>
+              <w:t>Travel fees: Dr. José Enriquez initial meeting and founder visit</w:t>
+            </w:r>
+          </w:p>
+        </w:tc>
+        <w:tc>
+          <w:tcPr>
+            <w:tcW w:type="dxa" w:w="2808"/>
+            <w:vAlign w:val="center"/>
+            <w:tcMar>
+              <w:top w:w="70" w:type="dxa"/>
+              <w:start w:w="120" w:type="dxa"/>
+              <w:bottom w:w="70" w:type="dxa"/>
+              <w:end w:w="120" w:type="dxa"/>
+            </w:tcMar>
+          </w:tcPr>
+          <w:p>
+            <w:pPr>
+              <w:spacing w:before="0" w:after="0"/>
+              <w:jc w:val="right"/>
+            </w:pPr>
+            <w:r/>
+            <w:r>
+              <w:rPr>
+                <w:rFonts w:ascii="Arimo" w:hAnsi="Arimo"/>
+                <w:b w:val="0"/>
+                <w:color w:val="222222"/>
+                <w:sz w:val="18"/>
+              </w:rPr>
+              <w:t>$2,000</w:t>
+            </w:r>
+          </w:p>
+        </w:tc>
+      </w:tr>
+      <w:tr>
+        <w:trPr>
+          <w:cantSplit/>
+        </w:trPr>
+        <w:tc>
+          <w:tcPr>
+            <w:tcW w:type="dxa" w:w="7920"/>
+            <w:vAlign w:val="center"/>
+            <w:tcMar>
+              <w:top w:w="70" w:type="dxa"/>
+              <w:start w:w="120" w:type="dxa"/>
+              <w:bottom w:w="70" w:type="dxa"/>
+              <w:end w:w="120" w:type="dxa"/>
+            </w:tcMar>
+          </w:tcPr>
+          <w:p>
+            <w:pPr>
+              <w:spacing w:before="0" w:after="0"/>
+            </w:pPr>
+            <w:r/>
+            <w:r>
+              <w:rPr>
+                <w:rFonts w:ascii="Arimo" w:hAnsi="Arimo"/>
+                <w:b w:val="0"/>
+                <w:color w:val="222222"/>
+                <w:sz w:val="18"/>
+              </w:rPr>
+              <w:t>{{startup_discount_name}} ({{startup_discount_percent}}%)</w:t>
+            </w:r>
+          </w:p>
+        </w:tc>
+        <w:tc>
+          <w:tcPr>
+            <w:tcW w:type="dxa" w:w="2808"/>
+            <w:vAlign w:val="center"/>
+            <w:tcMar>
+              <w:top w:w="70" w:type="dxa"/>
+              <w:start w:w="120" w:type="dxa"/>
+              <w:bottom w:w="70" w:type="dxa"/>
+              <w:end w:w="120" w:type="dxa"/>
+            </w:tcMar>
+          </w:tcPr>
+          <w:p>
+            <w:pPr>
+              <w:spacing w:before="0" w:after="0"/>
+              <w:jc w:val="right"/>
+            </w:pPr>
+            <w:r/>
+            <w:r>
+              <w:rPr>
+                <w:rFonts w:ascii="Arimo" w:hAnsi="Arimo"/>
+                <w:b w:val="0"/>
+                <w:color w:val="222222"/>
+                <w:sz w:val="18"/>
+              </w:rPr>
+              <w:t>- {{startup_discount_amount}}</w:t>
+            </w:r>
+          </w:p>
+        </w:tc>
+      </w:tr>
+      <w:tr>
+        <w:trPr>
+          <w:cantSplit/>
+        </w:trPr>
+        <w:tc>
+          <w:tcPr>
+            <w:tcW w:type="dxa" w:w="7920"/>
+            <w:vAlign w:val="center"/>
+            <w:tcMar>
+              <w:top w:w="70" w:type="dxa"/>
+              <w:start w:w="120" w:type="dxa"/>
+              <w:bottom w:w="70" w:type="dxa"/>
+              <w:end w:w="120" w:type="dxa"/>
+            </w:tcMar>
+            <w:shd w:fill="F2F2F2"/>
+          </w:tcPr>
+          <w:p>
+            <w:pPr>
+              <w:spacing w:before="0" w:after="0"/>
+            </w:pPr>
+            <w:r/>
+            <w:r>
+              <w:rPr>
+                <w:rFonts w:ascii="Arimo" w:hAnsi="Arimo"/>
+                <w:b/>
+                <w:color w:val="222222"/>
+                <w:sz w:val="18"/>
+              </w:rPr>
+              <w:t>Start-up Fee — Total</w:t>
+            </w:r>
+          </w:p>
+        </w:tc>
+        <w:tc>
+          <w:tcPr>
+            <w:tcW w:type="dxa" w:w="2808"/>
+            <w:vAlign w:val="center"/>
+            <w:tcMar>
+              <w:top w:w="70" w:type="dxa"/>
+              <w:start w:w="120" w:type="dxa"/>
+              <w:bottom w:w="70" w:type="dxa"/>
+              <w:end w:w="120" w:type="dxa"/>
+            </w:tcMar>
+            <w:shd w:fill="F2F2F2"/>
+          </w:tcPr>
+          <w:p>
+            <w:pPr>
+              <w:spacing w:before="0" w:after="0"/>
+              <w:jc w:val="right"/>
+            </w:pPr>
+            <w:r/>
+            <w:r>
+              <w:rPr>
+                <w:rFonts w:ascii="Arimo" w:hAnsi="Arimo"/>
+                <w:b/>
+                <w:color w:val="222222"/>
+                <w:sz w:val="18"/>
+              </w:rPr>
+              <w:t>{{startup_final_price}}</w:t>
+            </w:r>
+          </w:p>
+        </w:tc>
+      </w:tr>
+      <w:tr>
+        <w:trPr>
+          <w:cantSplit/>
+        </w:trPr>
+        <w:tc>
+          <w:tcPr>
+            <w:tcW w:type="dxa" w:w="10728"/>
+            <w:vAlign w:val="center"/>
+            <w:gridSpan w:val="2"/>
+            <w:tcMar>
+              <w:top w:w="70" w:type="dxa"/>
+              <w:start w:w="120" w:type="dxa"/>
+              <w:bottom w:w="70" w:type="dxa"/>
+              <w:end w:w="120" w:type="dxa"/>
+            </w:tcMar>
+            <w:shd w:fill="C4122F"/>
+          </w:tcPr>
+          <w:p>
+            <w:pPr>
+              <w:spacing w:before="0" w:after="0"/>
+            </w:pPr>
+            <w:r/>
+            <w:r>
+              <w:rPr>
+                <w:rFonts w:ascii="Arimo" w:hAnsi="Arimo"/>
+                <w:b/>
+                <w:color w:val="FFFFFF"/>
+                <w:sz w:val="18"/>
+              </w:rPr>
+              <w:t>LIA PROGRAM COSTS — FIRST YEAR - {{launch_school_year}}</w:t>
+            </w:r>
+          </w:p>
+        </w:tc>
+      </w:tr>
+      <w:tr>
+        <w:trPr>
+          <w:cantSplit/>
+        </w:trPr>
+        <w:tc>
+          <w:tcPr>
+            <w:tcW w:type="dxa" w:w="7920"/>
+            <w:vAlign w:val="center"/>
+            <w:tcMar>
+              <w:top w:w="70" w:type="dxa"/>
+              <w:start w:w="120" w:type="dxa"/>
+              <w:bottom w:w="70" w:type="dxa"/>
+              <w:end w:w="120" w:type="dxa"/>
+            </w:tcMar>
+          </w:tcPr>
+          <w:p>
+            <w:pPr>
+              <w:spacing w:before="0" w:after="0"/>
+            </w:pPr>
+            <w:r/>
+            <w:r>
+              <w:rPr>
+                <w:rFonts w:ascii="Arimo" w:hAnsi="Arimo"/>
+                <w:b w:val="0"/>
+                <w:color w:val="222222"/>
+                <w:sz w:val="18"/>
+              </w:rPr>
+              <w:t>LIA Portal Access</w:t>
+            </w:r>
+          </w:p>
+        </w:tc>
+        <w:tc>
+          <w:tcPr>
+            <w:tcW w:type="dxa" w:w="2808"/>
+            <w:vAlign w:val="center"/>
+            <w:tcMar>
+              <w:top w:w="70" w:type="dxa"/>
+              <w:start w:w="120" w:type="dxa"/>
+              <w:bottom w:w="70" w:type="dxa"/>
+              <w:end w:w="120" w:type="dxa"/>
+            </w:tcMar>
+          </w:tcPr>
+          <w:p>
+            <w:pPr>
+              <w:spacing w:before="0" w:after="0"/>
+              <w:jc w:val="right"/>
+            </w:pPr>
+            <w:r/>
+            <w:r>
+              <w:rPr>
+                <w:rFonts w:ascii="Arimo" w:hAnsi="Arimo"/>
+                <w:b w:val="0"/>
+                <w:color w:val="222222"/>
+                <w:sz w:val="18"/>
+              </w:rPr>
+              <w:t>$2,000</w:t>
+            </w:r>
+          </w:p>
+        </w:tc>
+      </w:tr>
+      <w:tr>
+        <w:trPr>
+          <w:cantSplit/>
+        </w:trPr>
+        <w:tc>
+          <w:tcPr>
+            <w:tcW w:type="dxa" w:w="7920"/>
+            <w:vAlign w:val="center"/>
+            <w:tcMar>
+              <w:top w:w="70" w:type="dxa"/>
+              <w:start w:w="120" w:type="dxa"/>
+              <w:bottom w:w="70" w:type="dxa"/>
+              <w:end w:w="120" w:type="dxa"/>
+            </w:tcMar>
+          </w:tcPr>
+          <w:p>
+            <w:pPr>
+              <w:spacing w:before="0" w:after="0"/>
+            </w:pPr>
+            <w:r/>
+            <w:r>
+              <w:rPr>
+                <w:rFonts w:ascii="Arimo" w:hAnsi="Arimo"/>
+                <w:b w:val="0"/>
+                <w:color w:val="222222"/>
+                <w:sz w:val="18"/>
+              </w:rPr>
+              <w:t>Access to Online Curriculum</w:t>
+            </w:r>
+          </w:p>
+        </w:tc>
+        <w:tc>
+          <w:tcPr>
+            <w:tcW w:type="dxa" w:w="2808"/>
+            <w:vAlign w:val="center"/>
+            <w:tcMar>
+              <w:top w:w="70" w:type="dxa"/>
+              <w:start w:w="120" w:type="dxa"/>
+              <w:bottom w:w="70" w:type="dxa"/>
+              <w:end w:w="120" w:type="dxa"/>
+            </w:tcMar>
+          </w:tcPr>
+          <w:p>
+            <w:pPr>
+              <w:spacing w:before="0" w:after="0"/>
+              <w:jc w:val="right"/>
+            </w:pPr>
+            <w:r/>
+            <w:r>
+              <w:rPr>
+                <w:rFonts w:ascii="Arimo" w:hAnsi="Arimo"/>
+                <w:b w:val="0"/>
+                <w:color w:val="222222"/>
+                <w:sz w:val="18"/>
+              </w:rPr>
+              <w:t>$1,000</w:t>
+            </w:r>
+          </w:p>
+        </w:tc>
+      </w:tr>
+      <w:tr>
+        <w:trPr>
+          <w:cantSplit/>
+        </w:trPr>
+        <w:tc>
+          <w:tcPr>
+            <w:tcW w:type="dxa" w:w="7920"/>
+            <w:vAlign w:val="center"/>
+            <w:tcMar>
+              <w:top w:w="70" w:type="dxa"/>
+              <w:start w:w="120" w:type="dxa"/>
+              <w:bottom w:w="70" w:type="dxa"/>
+              <w:end w:w="120" w:type="dxa"/>
+            </w:tcMar>
+          </w:tcPr>
+          <w:p>
+            <w:pPr>
+              <w:spacing w:before="0" w:after="0"/>
+            </w:pPr>
+            <w:r/>
+            <w:r>
+              <w:rPr>
+                <w:rFonts w:ascii="Arimo" w:hAnsi="Arimo"/>
+                <w:b w:val="0"/>
+                <w:color w:val="222222"/>
+                <w:sz w:val="18"/>
+              </w:rPr>
+              <w:t>Personalized Teacher Support throughout the school year — unlimited emails, calls, and meetings</w:t>
+            </w:r>
+          </w:p>
+        </w:tc>
+        <w:tc>
+          <w:tcPr>
+            <w:tcW w:type="dxa" w:w="2808"/>
+            <w:vAlign w:val="center"/>
+            <w:tcMar>
+              <w:top w:w="70" w:type="dxa"/>
+              <w:start w:w="120" w:type="dxa"/>
+              <w:bottom w:w="70" w:type="dxa"/>
+              <w:end w:w="120" w:type="dxa"/>
+            </w:tcMar>
+          </w:tcPr>
+          <w:p>
+            <w:pPr>
+              <w:spacing w:before="0" w:after="0"/>
+              <w:jc w:val="right"/>
+            </w:pPr>
+            <w:r/>
+            <w:r>
+              <w:rPr>
+                <w:rFonts w:ascii="Arimo" w:hAnsi="Arimo"/>
+                <w:b w:val="0"/>
+                <w:color w:val="222222"/>
+                <w:sz w:val="18"/>
+              </w:rPr>
+              <w:t>$1,400</w:t>
+            </w:r>
+          </w:p>
+        </w:tc>
+      </w:tr>
+      <w:tr>
+        <w:trPr>
+          <w:cantSplit/>
+        </w:trPr>
+        <w:tc>
+          <w:tcPr>
+            <w:tcW w:type="dxa" w:w="7920"/>
+            <w:vAlign w:val="center"/>
+            <w:tcMar>
+              <w:top w:w="70" w:type="dxa"/>
+              <w:start w:w="120" w:type="dxa"/>
+              <w:bottom w:w="70" w:type="dxa"/>
+              <w:end w:w="120" w:type="dxa"/>
+            </w:tcMar>
+          </w:tcPr>
+          <w:p>
+            <w:pPr>
+              <w:spacing w:before="0" w:after="0"/>
+            </w:pPr>
+            <w:r/>
+            <w:r>
+              <w:rPr>
+                <w:rFonts w:ascii="Arimo" w:hAnsi="Arimo"/>
+                <w:b w:val="0"/>
+                <w:color w:val="222222"/>
+                <w:sz w:val="18"/>
+              </w:rPr>
+              <w:t>LIA Youth Leadership Conference</w:t>
+            </w:r>
+          </w:p>
+        </w:tc>
+        <w:tc>
+          <w:tcPr>
+            <w:tcW w:type="dxa" w:w="2808"/>
+            <w:vAlign w:val="center"/>
+            <w:tcMar>
+              <w:top w:w="70" w:type="dxa"/>
+              <w:start w:w="120" w:type="dxa"/>
+              <w:bottom w:w="70" w:type="dxa"/>
+              <w:end w:w="120" w:type="dxa"/>
+            </w:tcMar>
+          </w:tcPr>
+          <w:p>
+            <w:pPr>
+              <w:spacing w:before="0" w:after="0"/>
+              <w:jc w:val="right"/>
+            </w:pPr>
+            <w:r/>
+            <w:r>
+              <w:rPr>
+                <w:rFonts w:ascii="Arimo" w:hAnsi="Arimo"/>
+                <w:b w:val="0"/>
+                <w:color w:val="222222"/>
+                <w:sz w:val="18"/>
+              </w:rPr>
+              <w:t>$800</w:t>
+            </w:r>
+          </w:p>
+        </w:tc>
+      </w:tr>
+      <w:tr>
+        <w:trPr>
+          <w:cantSplit/>
+        </w:trPr>
+        <w:tc>
+          <w:tcPr>
+            <w:tcW w:type="dxa" w:w="7920"/>
+            <w:vAlign w:val="center"/>
+            <w:tcMar>
+              <w:top w:w="70" w:type="dxa"/>
+              <w:start w:w="120" w:type="dxa"/>
+              <w:bottom w:w="70" w:type="dxa"/>
+              <w:end w:w="120" w:type="dxa"/>
+            </w:tcMar>
+          </w:tcPr>
+          <w:p>
+            <w:pPr>
+              <w:spacing w:before="0" w:after="0"/>
+            </w:pPr>
+            <w:r/>
+            <w:r>
+              <w:rPr>
+                <w:rFonts w:ascii="Arimo" w:hAnsi="Arimo"/>
+                <w:b w:val="0"/>
+                <w:color w:val="222222"/>
+                <w:sz w:val="18"/>
+              </w:rPr>
+              <w:t>LIA Leadership Boot Camp</w:t>
+            </w:r>
+          </w:p>
+        </w:tc>
+        <w:tc>
+          <w:tcPr>
+            <w:tcW w:type="dxa" w:w="2808"/>
+            <w:vAlign w:val="center"/>
+            <w:tcMar>
+              <w:top w:w="70" w:type="dxa"/>
+              <w:start w:w="120" w:type="dxa"/>
+              <w:bottom w:w="70" w:type="dxa"/>
+              <w:end w:w="120" w:type="dxa"/>
+            </w:tcMar>
+          </w:tcPr>
+          <w:p>
+            <w:pPr>
+              <w:spacing w:before="0" w:after="0"/>
+              <w:jc w:val="right"/>
+            </w:pPr>
+            <w:r/>
+            <w:r>
+              <w:rPr>
+                <w:rFonts w:ascii="Arimo" w:hAnsi="Arimo"/>
+                <w:b w:val="0"/>
+                <w:color w:val="222222"/>
+                <w:sz w:val="18"/>
+              </w:rPr>
+              <w:t>$500</w:t>
+            </w:r>
+          </w:p>
+        </w:tc>
+      </w:tr>
+      <w:tr>
+        <w:trPr>
+          <w:cantSplit/>
+        </w:trPr>
+        <w:tc>
+          <w:tcPr>
+            <w:tcW w:type="dxa" w:w="7920"/>
+            <w:vAlign w:val="center"/>
+            <w:tcMar>
+              <w:top w:w="70" w:type="dxa"/>
+              <w:start w:w="120" w:type="dxa"/>
+              <w:bottom w:w="70" w:type="dxa"/>
+              <w:end w:w="120" w:type="dxa"/>
+            </w:tcMar>
+          </w:tcPr>
+          <w:p>
+            <w:pPr>
+              <w:spacing w:before="0" w:after="0"/>
+            </w:pPr>
+            <w:r/>
+            <w:r>
+              <w:rPr>
+                <w:rFonts w:ascii="Arimo" w:hAnsi="Arimo"/>
+                <w:b w:val="0"/>
+                <w:color w:val="222222"/>
+                <w:sz w:val="18"/>
+              </w:rPr>
+              <w:t>Educator Institute</w:t>
+            </w:r>
+          </w:p>
+        </w:tc>
+        <w:tc>
+          <w:tcPr>
+            <w:tcW w:type="dxa" w:w="2808"/>
+            <w:vAlign w:val="center"/>
+            <w:tcMar>
+              <w:top w:w="70" w:type="dxa"/>
+              <w:start w:w="120" w:type="dxa"/>
+              <w:bottom w:w="70" w:type="dxa"/>
+              <w:end w:w="120" w:type="dxa"/>
+            </w:tcMar>
+          </w:tcPr>
+          <w:p>
+            <w:pPr>
+              <w:spacing w:before="0" w:after="0"/>
+              <w:jc w:val="right"/>
+            </w:pPr>
+            <w:r/>
+            <w:r>
+              <w:rPr>
+                <w:rFonts w:ascii="Arimo" w:hAnsi="Arimo"/>
+                <w:b w:val="0"/>
+                <w:color w:val="222222"/>
+                <w:sz w:val="18"/>
+              </w:rPr>
+              <w:t>$200</w:t>
+            </w:r>
+          </w:p>
+        </w:tc>
+      </w:tr>
+      <w:tr>
+        <w:trPr>
+          <w:cantSplit/>
+        </w:trPr>
+        <w:tc>
+          <w:tcPr>
+            <w:tcW w:type="dxa" w:w="7920"/>
+            <w:vAlign w:val="center"/>
+            <w:tcMar>
+              <w:top w:w="70" w:type="dxa"/>
+              <w:start w:w="120" w:type="dxa"/>
+              <w:bottom w:w="70" w:type="dxa"/>
+              <w:end w:w="120" w:type="dxa"/>
+            </w:tcMar>
+          </w:tcPr>
+          <w:p>
+            <w:pPr>
+              <w:spacing w:before="0" w:after="0"/>
+            </w:pPr>
+            <w:r/>
+            <w:r>
+              <w:rPr>
+                <w:rFonts w:ascii="Arimo" w:hAnsi="Arimo"/>
+                <w:b w:val="0"/>
+                <w:color w:val="222222"/>
+                <w:sz w:val="18"/>
+              </w:rPr>
+              <w:t>Masterminds</w:t>
+            </w:r>
+          </w:p>
+        </w:tc>
+        <w:tc>
+          <w:tcPr>
+            <w:tcW w:type="dxa" w:w="2808"/>
+            <w:vAlign w:val="center"/>
+            <w:tcMar>
+              <w:top w:w="70" w:type="dxa"/>
+              <w:start w:w="120" w:type="dxa"/>
+              <w:bottom w:w="70" w:type="dxa"/>
+              <w:end w:w="120" w:type="dxa"/>
+            </w:tcMar>
+          </w:tcPr>
+          <w:p>
+            <w:pPr>
+              <w:spacing w:before="0" w:after="0"/>
+              <w:jc w:val="right"/>
+            </w:pPr>
+            <w:r/>
+            <w:r>
+              <w:rPr>
+                <w:rFonts w:ascii="Arimo" w:hAnsi="Arimo"/>
+                <w:b w:val="0"/>
+                <w:color w:val="222222"/>
+                <w:sz w:val="18"/>
+              </w:rPr>
+              <w:t>$100</w:t>
+            </w:r>
+          </w:p>
+        </w:tc>
+      </w:tr>
+      <w:tr>
+        <w:trPr>
+          <w:cantSplit/>
+        </w:trPr>
+        <w:tc>
+          <w:tcPr>
+            <w:tcW w:type="dxa" w:w="7920"/>
+            <w:vAlign w:val="center"/>
+            <w:tcMar>
+              <w:top w:w="70" w:type="dxa"/>
+              <w:start w:w="120" w:type="dxa"/>
+              <w:bottom w:w="70" w:type="dxa"/>
+              <w:end w:w="120" w:type="dxa"/>
+            </w:tcMar>
+          </w:tcPr>
+          <w:p>
+            <w:pPr>
+              <w:spacing w:before="0" w:after="0"/>
+            </w:pPr>
+            <w:r/>
+            <w:r>
+              <w:rPr>
+                <w:rFonts w:ascii="Arimo" w:hAnsi="Arimo"/>
+                <w:b w:val="0"/>
+                <w:color w:val="222222"/>
+                <w:sz w:val="18"/>
+              </w:rPr>
+              <w:t>{{first_year_discount_name}} ({{first_year_discount_percent}}%)</w:t>
+            </w:r>
+          </w:p>
+        </w:tc>
+        <w:tc>
+          <w:tcPr>
+            <w:tcW w:type="dxa" w:w="2808"/>
+            <w:vAlign w:val="center"/>
+            <w:tcMar>
+              <w:top w:w="70" w:type="dxa"/>
+              <w:start w:w="120" w:type="dxa"/>
+              <w:bottom w:w="70" w:type="dxa"/>
+              <w:end w:w="120" w:type="dxa"/>
+            </w:tcMar>
+          </w:tcPr>
+          <w:p>
+            <w:pPr>
+              <w:spacing w:before="0" w:after="0"/>
+              <w:jc w:val="right"/>
+            </w:pPr>
+            <w:r/>
+            <w:r>
+              <w:rPr>
+                <w:rFonts w:ascii="Arimo" w:hAnsi="Arimo"/>
+                <w:b w:val="0"/>
+                <w:color w:val="222222"/>
+                <w:sz w:val="18"/>
+              </w:rPr>
+              <w:t>- {{first_year_discount_amount}}</w:t>
+            </w:r>
+          </w:p>
+        </w:tc>
+      </w:tr>
+      <w:tr>
+        <w:trPr>
+          <w:cantSplit/>
+        </w:trPr>
+        <w:tc>
+          <w:tcPr>
+            <w:tcW w:type="dxa" w:w="7920"/>
+            <w:vAlign w:val="center"/>
+            <w:tcMar>
+              <w:top w:w="70" w:type="dxa"/>
+              <w:start w:w="120" w:type="dxa"/>
+              <w:bottom w:w="70" w:type="dxa"/>
+              <w:end w:w="120" w:type="dxa"/>
+            </w:tcMar>
+            <w:shd w:fill="F2F2F2"/>
+          </w:tcPr>
+          <w:p>
+            <w:pPr>
+              <w:spacing w:before="0" w:after="0"/>
+            </w:pPr>
+            <w:r/>
+            <w:r>
+              <w:rPr>
+                <w:rFonts w:ascii="Arimo" w:hAnsi="Arimo"/>
+                <w:b/>
+                <w:color w:val="222222"/>
+                <w:sz w:val="18"/>
+              </w:rPr>
+              <w:t>First-Year Program Total</w:t>
+            </w:r>
+          </w:p>
+        </w:tc>
+        <w:tc>
+          <w:tcPr>
+            <w:tcW w:type="dxa" w:w="2808"/>
+            <w:vAlign w:val="center"/>
+            <w:tcMar>
+              <w:top w:w="70" w:type="dxa"/>
+              <w:start w:w="120" w:type="dxa"/>
+              <w:bottom w:w="70" w:type="dxa"/>
+              <w:end w:w="120" w:type="dxa"/>
+            </w:tcMar>
+            <w:shd w:fill="F2F2F2"/>
+          </w:tcPr>
+          <w:p>
+            <w:pPr>
+              <w:spacing w:before="0" w:after="0"/>
+              <w:jc w:val="right"/>
+            </w:pPr>
+            <w:r/>
+            <w:r>
+              <w:rPr>
+                <w:rFonts w:ascii="Arimo" w:hAnsi="Arimo"/>
+                <w:b/>
+                <w:color w:val="222222"/>
+                <w:sz w:val="18"/>
+              </w:rPr>
+              <w:t>{{first_year_final_price}}</w:t>
+            </w:r>
+          </w:p>
+        </w:tc>
+      </w:tr>
+      <w:tr>
+        <w:trPr>
+          <w:cantSplit/>
+        </w:trPr>
+        <w:tc>
+          <w:tcPr>
+            <w:tcW w:type="dxa" w:w="7920"/>
+            <w:vAlign w:val="center"/>
+            <w:tcMar>
+              <w:top w:w="70" w:type="dxa"/>
+              <w:start w:w="120" w:type="dxa"/>
+              <w:bottom w:w="70" w:type="dxa"/>
+              <w:end w:w="120" w:type="dxa"/>
+            </w:tcMar>
+            <w:shd w:fill="F2F2F2"/>
+          </w:tcPr>
+          <w:p>
+            <w:pPr>
+              <w:spacing w:before="0" w:after="0"/>
+            </w:pPr>
+            <w:r/>
+            <w:r>
+              <w:rPr>
+                <w:rFonts w:ascii="Arimo" w:hAnsi="Arimo"/>
+                <w:b/>
+                <w:color w:val="222222"/>
+                <w:sz w:val="18"/>
+              </w:rPr>
+              <w:t>Grand Total First-Year Implementation</w:t>
+            </w:r>
+          </w:p>
+        </w:tc>
+        <w:tc>
+          <w:tcPr>
+            <w:tcW w:type="dxa" w:w="2808"/>
+            <w:vAlign w:val="center"/>
+            <w:tcMar>
+              <w:top w:w="70" w:type="dxa"/>
+              <w:start w:w="120" w:type="dxa"/>
+              <w:bottom w:w="70" w:type="dxa"/>
+              <w:end w:w="120" w:type="dxa"/>
+            </w:tcMar>
+            <w:shd w:fill="F2F2F2"/>
+          </w:tcPr>
+          <w:p>
+            <w:pPr>
+              <w:spacing w:before="0" w:after="0"/>
+              <w:jc w:val="right"/>
+            </w:pPr>
+            <w:r/>
+            <w:r>
+              <w:rPr>
+                <w:rFonts w:ascii="Arimo" w:hAnsi="Arimo"/>
+                <w:b/>
+                <w:color w:val="222222"/>
+                <w:sz w:val="18"/>
+              </w:rPr>
+              <w:t>{{first_year_grand_total}}</w:t>
+            </w:r>
+          </w:p>
+        </w:tc>
+      </w:tr>
+      <w:tr>
+        <w:trPr>
+          <w:cantSplit/>
+        </w:trPr>
+        <w:tc>
+          <w:tcPr>
+            <w:tcW w:type="dxa" w:w="10728"/>
+            <w:vAlign w:val="center"/>
+            <w:gridSpan w:val="2"/>
+            <w:tcMar>
+              <w:top w:w="70" w:type="dxa"/>
+              <w:start w:w="120" w:type="dxa"/>
+              <w:bottom w:w="70" w:type="dxa"/>
+              <w:end w:w="120" w:type="dxa"/>
+            </w:tcMar>
+            <w:shd w:fill="C4122F"/>
+          </w:tcPr>
+          <w:p>
+            <w:pPr>
+              <w:spacing w:before="0" w:after="0"/>
+            </w:pPr>
+            <w:r/>
+            <w:r>
+              <w:rPr>
+                <w:rFonts w:ascii="Arimo" w:hAnsi="Arimo"/>
+                <w:b/>
+                <w:color w:val="FFFFFF"/>
+                <w:sz w:val="18"/>
+              </w:rPr>
+              <w:t>ANNUAL RENEWAL PRICING - {{renewal_school_year}}</w:t>
+            </w:r>
+          </w:p>
+        </w:tc>
+      </w:tr>
+      <w:tr>
+        <w:trPr>
+          <w:cantSplit/>
+        </w:trPr>
+        <w:tc>
+          <w:tcPr>
+            <w:tcW w:type="dxa" w:w="7920"/>
+            <w:vAlign w:val="center"/>
+            <w:tcMar>
+              <w:top w:w="70" w:type="dxa"/>
+              <w:start w:w="120" w:type="dxa"/>
+              <w:bottom w:w="70" w:type="dxa"/>
+              <w:end w:w="120" w:type="dxa"/>
+            </w:tcMar>
+          </w:tcPr>
+          <w:p>
+            <w:pPr>
+              <w:spacing w:before="0" w:after="0"/>
+            </w:pPr>
+            <w:r/>
+            <w:r>
+              <w:rPr>
+                <w:rFonts w:ascii="Arimo" w:hAnsi="Arimo"/>
+                <w:b w:val="0"/>
+                <w:color w:val="222222"/>
+                <w:sz w:val="18"/>
+              </w:rPr>
+              <w:t>LIA Portal Access</w:t>
+            </w:r>
+          </w:p>
+        </w:tc>
+        <w:tc>
+          <w:tcPr>
+            <w:tcW w:type="dxa" w:w="2808"/>
+            <w:vAlign w:val="center"/>
+            <w:tcMar>
+              <w:top w:w="70" w:type="dxa"/>
+              <w:start w:w="120" w:type="dxa"/>
+              <w:bottom w:w="70" w:type="dxa"/>
+              <w:end w:w="120" w:type="dxa"/>
+            </w:tcMar>
+          </w:tcPr>
+          <w:p>
+            <w:pPr>
+              <w:spacing w:before="0" w:after="0"/>
+              <w:jc w:val="right"/>
+            </w:pPr>
+            <w:r/>
+            <w:r>
+              <w:rPr>
+                <w:rFonts w:ascii="Arimo" w:hAnsi="Arimo"/>
+                <w:b w:val="0"/>
+                <w:color w:val="222222"/>
+                <w:sz w:val="18"/>
+              </w:rPr>
+              <w:t>$2,000</w:t>
+            </w:r>
+          </w:p>
+        </w:tc>
+      </w:tr>
+      <w:tr>
+        <w:trPr>
+          <w:cantSplit/>
+        </w:trPr>
+        <w:tc>
+          <w:tcPr>
+            <w:tcW w:type="dxa" w:w="7920"/>
+            <w:vAlign w:val="center"/>
+            <w:tcMar>
+              <w:top w:w="70" w:type="dxa"/>
+              <w:start w:w="120" w:type="dxa"/>
+              <w:bottom w:w="70" w:type="dxa"/>
+              <w:end w:w="120" w:type="dxa"/>
+            </w:tcMar>
+          </w:tcPr>
+          <w:p>
+            <w:pPr>
+              <w:spacing w:before="0" w:after="0"/>
+            </w:pPr>
+            <w:r/>
+            <w:r>
+              <w:rPr>
+                <w:rFonts w:ascii="Arimo" w:hAnsi="Arimo"/>
+                <w:b w:val="0"/>
+                <w:color w:val="222222"/>
+                <w:sz w:val="18"/>
+              </w:rPr>
+              <w:t>Access to Online Curriculum</w:t>
+            </w:r>
+          </w:p>
+        </w:tc>
+        <w:tc>
+          <w:tcPr>
+            <w:tcW w:type="dxa" w:w="2808"/>
+            <w:vAlign w:val="center"/>
+            <w:tcMar>
+              <w:top w:w="70" w:type="dxa"/>
+              <w:start w:w="120" w:type="dxa"/>
+              <w:bottom w:w="70" w:type="dxa"/>
+              <w:end w:w="120" w:type="dxa"/>
+            </w:tcMar>
+          </w:tcPr>
+          <w:p>
+            <w:pPr>
+              <w:spacing w:before="0" w:after="0"/>
+              <w:jc w:val="right"/>
+            </w:pPr>
+            <w:r/>
+            <w:r>
+              <w:rPr>
+                <w:rFonts w:ascii="Arimo" w:hAnsi="Arimo"/>
+                <w:b w:val="0"/>
+                <w:color w:val="222222"/>
+                <w:sz w:val="18"/>
+              </w:rPr>
+              <w:t>$1,000</w:t>
+            </w:r>
+          </w:p>
+        </w:tc>
+      </w:tr>
+      <w:tr>
+        <w:trPr>
+          <w:cantSplit/>
+        </w:trPr>
+        <w:tc>
+          <w:tcPr>
+            <w:tcW w:type="dxa" w:w="7920"/>
+            <w:vAlign w:val="center"/>
+            <w:tcMar>
+              <w:top w:w="70" w:type="dxa"/>
+              <w:start w:w="120" w:type="dxa"/>
+              <w:bottom w:w="70" w:type="dxa"/>
+              <w:end w:w="120" w:type="dxa"/>
+            </w:tcMar>
+          </w:tcPr>
+          <w:p>
+            <w:pPr>
+              <w:spacing w:before="0" w:after="0"/>
+            </w:pPr>
+            <w:r/>
+            <w:r>
+              <w:rPr>
+                <w:rFonts w:ascii="Arimo" w:hAnsi="Arimo"/>
+                <w:b w:val="0"/>
+                <w:color w:val="222222"/>
+                <w:sz w:val="18"/>
+              </w:rPr>
+              <w:t>Personalized Teacher Support throughout the school year — unlimited emails, calls, and meetings</w:t>
+            </w:r>
+          </w:p>
+        </w:tc>
+        <w:tc>
+          <w:tcPr>
+            <w:tcW w:type="dxa" w:w="2808"/>
+            <w:vAlign w:val="center"/>
+            <w:tcMar>
+              <w:top w:w="70" w:type="dxa"/>
+              <w:start w:w="120" w:type="dxa"/>
+              <w:bottom w:w="70" w:type="dxa"/>
+              <w:end w:w="120" w:type="dxa"/>
+            </w:tcMar>
+          </w:tcPr>
+          <w:p>
+            <w:pPr>
+              <w:spacing w:before="0" w:after="0"/>
+              <w:jc w:val="right"/>
+            </w:pPr>
+            <w:r/>
+            <w:r>
+              <w:rPr>
+                <w:rFonts w:ascii="Arimo" w:hAnsi="Arimo"/>
+                <w:b w:val="0"/>
+                <w:color w:val="222222"/>
+                <w:sz w:val="18"/>
+              </w:rPr>
+              <w:t>$1,400</w:t>
+            </w:r>
+          </w:p>
+        </w:tc>
+      </w:tr>
+      <w:tr>
+        <w:trPr>
+          <w:cantSplit/>
+        </w:trPr>
+        <w:tc>
+          <w:tcPr>
+            <w:tcW w:type="dxa" w:w="7920"/>
+            <w:vAlign w:val="center"/>
+            <w:tcMar>
+              <w:top w:w="70" w:type="dxa"/>
+              <w:start w:w="120" w:type="dxa"/>
+              <w:bottom w:w="70" w:type="dxa"/>
+              <w:end w:w="120" w:type="dxa"/>
+            </w:tcMar>
+          </w:tcPr>
+          <w:p>
+            <w:pPr>
+              <w:spacing w:before="0" w:after="0"/>
+            </w:pPr>
+            <w:r/>
+            <w:r>
+              <w:rPr>
+                <w:rFonts w:ascii="Arimo" w:hAnsi="Arimo"/>
+                <w:b w:val="0"/>
+                <w:color w:val="222222"/>
+                <w:sz w:val="18"/>
+              </w:rPr>
+              <w:t>LIA Youth Leadership Conference</w:t>
+            </w:r>
+          </w:p>
+        </w:tc>
+        <w:tc>
+          <w:tcPr>
+            <w:tcW w:type="dxa" w:w="2808"/>
+            <w:vAlign w:val="center"/>
+            <w:tcMar>
+              <w:top w:w="70" w:type="dxa"/>
+              <w:start w:w="120" w:type="dxa"/>
+              <w:bottom w:w="70" w:type="dxa"/>
+              <w:end w:w="120" w:type="dxa"/>
+            </w:tcMar>
+          </w:tcPr>
+          <w:p>
+            <w:pPr>
+              <w:spacing w:before="0" w:after="0"/>
+              <w:jc w:val="right"/>
+            </w:pPr>
+            <w:r/>
+            <w:r>
+              <w:rPr>
+                <w:rFonts w:ascii="Arimo" w:hAnsi="Arimo"/>
+                <w:b w:val="0"/>
+                <w:color w:val="222222"/>
+                <w:sz w:val="18"/>
+              </w:rPr>
+              <w:t>$800</w:t>
+            </w:r>
+          </w:p>
+        </w:tc>
+      </w:tr>
+      <w:tr>
+        <w:trPr>
+          <w:cantSplit/>
+        </w:trPr>
+        <w:tc>
+          <w:tcPr>
+            <w:tcW w:type="dxa" w:w="7920"/>
+            <w:vAlign w:val="center"/>
+            <w:tcMar>
+              <w:top w:w="70" w:type="dxa"/>
+              <w:start w:w="120" w:type="dxa"/>
+              <w:bottom w:w="70" w:type="dxa"/>
+              <w:end w:w="120" w:type="dxa"/>
+            </w:tcMar>
+          </w:tcPr>
+          <w:p>
+            <w:pPr>
+              <w:spacing w:before="0" w:after="0"/>
+            </w:pPr>
+            <w:r/>
+            <w:r>
+              <w:rPr>
+                <w:rFonts w:ascii="Arimo" w:hAnsi="Arimo"/>
+                <w:b w:val="0"/>
+                <w:color w:val="222222"/>
+                <w:sz w:val="18"/>
+              </w:rPr>
+              <w:t>LIA Leadership Boot Camp</w:t>
+            </w:r>
+          </w:p>
+        </w:tc>
+        <w:tc>
+          <w:tcPr>
+            <w:tcW w:type="dxa" w:w="2808"/>
+            <w:vAlign w:val="center"/>
+            <w:tcMar>
+              <w:top w:w="70" w:type="dxa"/>
+              <w:start w:w="120" w:type="dxa"/>
+              <w:bottom w:w="70" w:type="dxa"/>
+              <w:end w:w="120" w:type="dxa"/>
+            </w:tcMar>
+          </w:tcPr>
+          <w:p>
+            <w:pPr>
+              <w:spacing w:before="0" w:after="0"/>
+              <w:jc w:val="right"/>
+            </w:pPr>
+            <w:r/>
+            <w:r>
+              <w:rPr>
+                <w:rFonts w:ascii="Arimo" w:hAnsi="Arimo"/>
+                <w:b w:val="0"/>
+                <w:color w:val="222222"/>
+                <w:sz w:val="18"/>
+              </w:rPr>
+              <w:t>$500</w:t>
+            </w:r>
+          </w:p>
+        </w:tc>
+      </w:tr>
+      <w:tr>
+        <w:trPr>
+          <w:cantSplit/>
+        </w:trPr>
+        <w:tc>
+          <w:tcPr>
+            <w:tcW w:type="dxa" w:w="7920"/>
+            <w:vAlign w:val="center"/>
+            <w:tcMar>
+              <w:top w:w="70" w:type="dxa"/>
+              <w:start w:w="120" w:type="dxa"/>
+              <w:bottom w:w="70" w:type="dxa"/>
+              <w:end w:w="120" w:type="dxa"/>
+            </w:tcMar>
+          </w:tcPr>
+          <w:p>
+            <w:pPr>
+              <w:spacing w:before="0" w:after="0"/>
+            </w:pPr>
+            <w:r/>
+            <w:r>
+              <w:rPr>
+                <w:rFonts w:ascii="Arimo" w:hAnsi="Arimo"/>
+                <w:b w:val="0"/>
+                <w:color w:val="222222"/>
+                <w:sz w:val="18"/>
+              </w:rPr>
+              <w:t>Educator Institute</w:t>
+            </w:r>
+          </w:p>
+        </w:tc>
+        <w:tc>
+          <w:tcPr>
+            <w:tcW w:type="dxa" w:w="2808"/>
+            <w:vAlign w:val="center"/>
+            <w:tcMar>
+              <w:top w:w="70" w:type="dxa"/>
+              <w:start w:w="120" w:type="dxa"/>
+              <w:bottom w:w="70" w:type="dxa"/>
+              <w:end w:w="120" w:type="dxa"/>
+            </w:tcMar>
+          </w:tcPr>
+          <w:p>
+            <w:pPr>
+              <w:spacing w:before="0" w:after="0"/>
+              <w:jc w:val="right"/>
+            </w:pPr>
+            <w:r/>
+            <w:r>
+              <w:rPr>
+                <w:rFonts w:ascii="Arimo" w:hAnsi="Arimo"/>
+                <w:b w:val="0"/>
+                <w:color w:val="222222"/>
+                <w:sz w:val="18"/>
+              </w:rPr>
+              <w:t>$200</w:t>
+            </w:r>
+          </w:p>
+        </w:tc>
+      </w:tr>
+      <w:tr>
+        <w:trPr>
+          <w:cantSplit/>
+        </w:trPr>
+        <w:tc>
+          <w:tcPr>
+            <w:tcW w:type="dxa" w:w="7920"/>
+            <w:vAlign w:val="center"/>
+            <w:tcMar>
+              <w:top w:w="70" w:type="dxa"/>
+              <w:start w:w="120" w:type="dxa"/>
+              <w:bottom w:w="70" w:type="dxa"/>
+              <w:end w:w="120" w:type="dxa"/>
+            </w:tcMar>
+          </w:tcPr>
+          <w:p>
+            <w:pPr>
+              <w:spacing w:before="0" w:after="0"/>
+            </w:pPr>
+            <w:r/>
+            <w:r>
+              <w:rPr>
+                <w:rFonts w:ascii="Arimo" w:hAnsi="Arimo"/>
+                <w:b w:val="0"/>
+                <w:color w:val="222222"/>
+                <w:sz w:val="18"/>
+              </w:rPr>
+              <w:t>Masterminds</w:t>
+            </w:r>
+          </w:p>
+        </w:tc>
+        <w:tc>
+          <w:tcPr>
+            <w:tcW w:type="dxa" w:w="2808"/>
+            <w:vAlign w:val="center"/>
+            <w:tcMar>
+              <w:top w:w="70" w:type="dxa"/>
+              <w:start w:w="120" w:type="dxa"/>
+              <w:bottom w:w="70" w:type="dxa"/>
+              <w:end w:w="120" w:type="dxa"/>
+            </w:tcMar>
+          </w:tcPr>
+          <w:p>
+            <w:pPr>
+              <w:spacing w:before="0" w:after="0"/>
+              <w:jc w:val="right"/>
+            </w:pPr>
+            <w:r/>
+            <w:r>
+              <w:rPr>
+                <w:rFonts w:ascii="Arimo" w:hAnsi="Arimo"/>
+                <w:b w:val="0"/>
+                <w:color w:val="222222"/>
+                <w:sz w:val="18"/>
+              </w:rPr>
+              <w:t>$100</w:t>
+            </w:r>
+          </w:p>
+        </w:tc>
+      </w:tr>
+      <w:tr>
+        <w:trPr>
+          <w:cantSplit/>
+        </w:trPr>
+        <w:tc>
+          <w:tcPr>
+            <w:tcW w:type="dxa" w:w="7920"/>
+            <w:vAlign w:val="center"/>
+            <w:tcMar>
+              <w:top w:w="70" w:type="dxa"/>
+              <w:start w:w="120" w:type="dxa"/>
+              <w:bottom w:w="70" w:type="dxa"/>
+              <w:end w:w="120" w:type="dxa"/>
+            </w:tcMar>
+          </w:tcPr>
+          <w:p>
+            <w:pPr>
+              <w:spacing w:before="0" w:after="0"/>
+            </w:pPr>
+            <w:r/>
+            <w:r>
+              <w:rPr>
+                <w:rFonts w:ascii="Arimo" w:hAnsi="Arimo"/>
+                <w:b w:val="0"/>
+                <w:color w:val="222222"/>
+                <w:sz w:val="18"/>
+              </w:rPr>
+              <w:t>{{renewal_discount_name}} ({{renewal_discount_percent}}%)</w:t>
+            </w:r>
+          </w:p>
+        </w:tc>
+        <w:tc>
+          <w:tcPr>
+            <w:tcW w:type="dxa" w:w="2808"/>
+            <w:vAlign w:val="center"/>
+            <w:tcMar>
+              <w:top w:w="70" w:type="dxa"/>
+              <w:start w:w="120" w:type="dxa"/>
+              <w:bottom w:w="70" w:type="dxa"/>
+              <w:end w:w="120" w:type="dxa"/>
+            </w:tcMar>
+          </w:tcPr>
+          <w:p>
+            <w:pPr>
+              <w:spacing w:before="0" w:after="0"/>
+              <w:jc w:val="right"/>
+            </w:pPr>
+            <w:r/>
+            <w:r>
+              <w:rPr>
+                <w:rFonts w:ascii="Arimo" w:hAnsi="Arimo"/>
+                <w:b w:val="0"/>
+                <w:color w:val="222222"/>
+                <w:sz w:val="18"/>
+              </w:rPr>
+              <w:t>- {{renewal_discount_amount}}</w:t>
+            </w:r>
+          </w:p>
+        </w:tc>
+      </w:tr>
+      <w:tr>
+        <w:trPr>
+          <w:cantSplit/>
+        </w:trPr>
+        <w:tc>
+          <w:tcPr>
+            <w:tcW w:type="dxa" w:w="7920"/>
+            <w:vAlign w:val="center"/>
+            <w:tcMar>
+              <w:top w:w="70" w:type="dxa"/>
+              <w:start w:w="120" w:type="dxa"/>
+              <w:bottom w:w="70" w:type="dxa"/>
+              <w:end w:w="120" w:type="dxa"/>
+            </w:tcMar>
+            <w:shd w:fill="F2F2F2"/>
+          </w:tcPr>
+          <w:p>
+            <w:pPr>
+              <w:spacing w:before="0" w:after="0"/>
+            </w:pPr>
+            <w:r/>
+            <w:r>
+              <w:rPr>
+                <w:rFonts w:ascii="Arimo" w:hAnsi="Arimo"/>
+                <w:b/>
+                <w:color w:val="222222"/>
+                <w:sz w:val="18"/>
+              </w:rPr>
+              <w:t>Total Second-Year Annual Renewal Membership Fee</w:t>
+            </w:r>
+          </w:p>
+        </w:tc>
+        <w:tc>
+          <w:tcPr>
+            <w:tcW w:type="dxa" w:w="2808"/>
+            <w:vAlign w:val="center"/>
+            <w:tcMar>
+              <w:top w:w="70" w:type="dxa"/>
+              <w:start w:w="120" w:type="dxa"/>
+              <w:bottom w:w="70" w:type="dxa"/>
+              <w:end w:w="120" w:type="dxa"/>
+            </w:tcMar>
+            <w:shd w:fill="F2F2F2"/>
+          </w:tcPr>
+          <w:p>
+            <w:pPr>
+              <w:spacing w:before="0" w:after="0"/>
+              <w:jc w:val="right"/>
+            </w:pPr>
+            <w:r/>
+            <w:r>
+              <w:rPr>
+                <w:rFonts w:ascii="Arimo" w:hAnsi="Arimo"/>
+                <w:b/>
+                <w:color w:val="222222"/>
+                <w:sz w:val="18"/>
+              </w:rPr>
+              <w:t>{{renewal_program_final_price}}</w:t>
+            </w:r>
+          </w:p>
+        </w:tc>
+      </w:tr>
+    </w:tbl>
+    <w:p>
+      <w:pPr>
+        <w:spacing w:before="200" w:after="0"/>
+      </w:pPr>
+      <w:r>
+        <w:rPr>
+          <w:rFonts w:ascii="Arimo" w:hAnsi="Arimo"/>
+          <w:b w:val="0"/>
+          <w:color w:val="222222"/>
+          <w:sz w:val="18"/>
+        </w:rPr>
+        <w:t>*After the second-year renewal, future renewal pricing will be based on the second-year renewal amount plus the applicable inflation percentage.</w:t>
+      </w:r>
+    </w:p>
+    <w:p>
+      <w:r>
+        <w:br w:type="page"/>
+      </w:r>
+    </w:p>
+    <w:p>
+      <w:pPr>
+        <w:spacing w:before="0" w:after="240"/>
+        <w:jc w:val="center"/>
+      </w:pPr>
+      <w:r>
+        <w:rPr>
+          <w:rFonts w:ascii="Arimo" w:hAnsi="Arimo"/>
+          <w:b/>
+          <w:color w:val="1F1F1F"/>
+          <w:sz w:val="44"/>
+        </w:rPr>
+        <w:t>AUTHORIZED SIGNATORIES</w:t>
+      </w:r>
+    </w:p>
+    <w:p>
+      <w:pPr>
+        <w:spacing w:after="360"/>
+      </w:pPr>
+      <w:r>
+        <w:rPr>
+          <w:rFonts w:ascii="Arimo" w:hAnsi="Arimo"/>
+          <w:b w:val="0"/>
+          <w:color w:val="222222"/>
+          <w:sz w:val="20"/>
+        </w:rPr>
+        <w:t>The undersigned parties agree to the expectations and terms stated in this Memorandum of Understanding.</w:t>
+      </w:r>
+    </w:p>
+    <w:tbl>
+      <w:tblPr>
+        <w:tblW w:type="dxa" w:w="10725"/>
+        <w:tblLayout w:type="fixed"/>
+        <w:tblLook w:firstColumn="1" w:firstRow="1" w:lastColumn="0" w:lastRow="0" w:noHBand="0" w:noVBand="1" w:val="04A0"/>
+      </w:tblPr>
+      <w:tblGrid>
+        <w:gridCol w:w="5362"/>
+        <w:gridCol w:w="5363"/>
+      </w:tblGrid>
+      <w:tr>
+        <w:tc>
+          <w:tcPr>
+            <w:tcW w:type="dxa" w:w="5400"/>
+            <w:tcMar>
+              <w:top w:w="100" w:type="dxa"/>
+              <w:start w:w="120" w:type="dxa"/>
+              <w:bottom w:w="100" w:type="dxa"/>
+              <w:end w:w="120" w:type="dxa"/>
+            </w:tcMar>
+          </w:tcPr>
+          <w:p>
+            <w:pPr>
+              <w:spacing w:before="0" w:after="0"/>
+            </w:pPr>
+            <w:r/>
+            <w:r>
+              <w:rPr>
+                <w:rFonts w:ascii="Arimo" w:hAnsi="Arimo"/>
+                <w:b/>
+                <w:color w:val="C4122F"/>
+                <w:sz w:val="18"/>
+              </w:rPr>
+              <w:t>LATINOS IN ACTION</w:t>
+            </w:r>
+          </w:p>
+        </w:tc>
+        <w:tc>
+          <w:tcPr>
+            <w:tcW w:type="dxa" w:w="5400"/>
+            <w:tcMar>
+              <w:top w:w="100" w:type="dxa"/>
+              <w:start w:w="120" w:type="dxa"/>
+              <w:bottom w:w="100" w:type="dxa"/>
+              <w:end w:w="120" w:type="dxa"/>
+            </w:tcMar>
+          </w:tcPr>
+          <w:p>
+            <w:pPr>
+              <w:spacing w:before="0" w:after="0"/>
+            </w:pPr>
+            <w:r/>
+            <w:r>
+              <w:rPr>
+                <w:rFonts w:ascii="Arimo" w:hAnsi="Arimo"/>
+                <w:b/>
+                <w:color w:val="C4122F"/>
+                <w:sz w:val="18"/>
+              </w:rPr>
+              <w:t>SCHOOL / DISTRICT</w:t>
             </w:r>
           </w:p>
         </w:tc>
@@ -8666,7 +10186,257 @@
       <w:tr>
         <w:tc>
           <w:tcPr>
-            <w:tcW w:type="dxa" w:w="7920"/>
+            <w:tcW w:type="dxa" w:w="5400"/>
+            <w:tcMar>
+              <w:top w:w="100" w:type="dxa"/>
+              <w:start w:w="120" w:type="dxa"/>
+              <w:bottom w:w="100" w:type="dxa"/>
+              <w:end w:w="120" w:type="dxa"/>
+            </w:tcMar>
+          </w:tcPr>
+          <w:p>
+            <w:pPr>
+              <w:spacing w:before="0" w:after="0"/>
+            </w:pPr>
+            <w:r/>
+            <w:r>
+              <w:rPr>
+                <w:rFonts w:ascii="Arimo" w:hAnsi="Arimo"/>
+                <w:b w:val="0"/>
+                <w:color w:val="222222"/>
+                <w:sz w:val="18"/>
+              </w:rPr>
+              <w:t>Dr. José Enriquez</w:t>
+              <w:br/>
+              <w:t>CEO and Founder</w:t>
+            </w:r>
+          </w:p>
+        </w:tc>
+        <w:tc>
+          <w:tcPr>
+            <w:tcW w:type="dxa" w:w="5400"/>
+            <w:tcMar>
+              <w:top w:w="100" w:type="dxa"/>
+              <w:start w:w="120" w:type="dxa"/>
+              <w:bottom w:w="100" w:type="dxa"/>
+              <w:end w:w="120" w:type="dxa"/>
+            </w:tcMar>
+          </w:tcPr>
+          <w:p>
+            <w:pPr>
+              <w:spacing w:before="0" w:after="0"/>
+            </w:pPr>
+            <w:r/>
+            <w:r>
+              <w:rPr>
+                <w:rFonts w:ascii="Arimo" w:hAnsi="Arimo"/>
+                <w:b w:val="0"/>
+                <w:color w:val="222222"/>
+                <w:sz w:val="18"/>
+              </w:rPr>
+              <w:t>{{authorized_signer_name}}</w:t>
+              <w:br/>
+              <w:t>Authorized Representative</w:t>
+            </w:r>
+          </w:p>
+        </w:tc>
+      </w:tr>
+      <w:tr>
+        <w:tc>
+          <w:tcPr>
+            <w:tcW w:type="dxa" w:w="5400"/>
+            <w:tcMar>
+              <w:top w:w="100" w:type="dxa"/>
+              <w:start w:w="120" w:type="dxa"/>
+              <w:bottom w:w="100" w:type="dxa"/>
+              <w:end w:w="120" w:type="dxa"/>
+            </w:tcMar>
+          </w:tcPr>
+          <w:p>
+            <w:pPr>
+              <w:spacing w:after="0"/>
+            </w:pPr>
+            <w:r/>
+            <w:r>
+              <w:drawing>
+                <wp:inline>
+                  <wp:extent cx="1920240" cy="552069"/>
+                  <wp:docPr id="1073741841" name="Picture 1073741841"/>
+                  <wp:cNvGraphicFramePr>
+                    <a:graphicFrameLocks noChangeAspect="1"/>
+                  </wp:cNvGraphicFramePr>
+                  <a:graphic>
+                    <a:graphicData uri="http://schemas.openxmlformats.org/drawingml/2006/picture">
+                      <pic:pic>
+                        <pic:nvPicPr>
+                          <pic:cNvPr id="0" name="image.png"/>
+                          <pic:cNvPicPr/>
+                        </pic:nvPicPr>
+                        <pic:blipFill>
+                          <a:blip r:embed="rId9"/>
+                          <a:stretch>
+                            <a:fillRect/>
+                          </a:stretch>
+                        </pic:blipFill>
+                        <pic:spPr>
+                          <a:xfrm>
+                            <a:off x="0" y="0"/>
+                            <a:ext cx="1920240" cy="552069"/>
+                          </a:xfrm>
+                          <a:prstGeom prst="rect"/>
+                        </pic:spPr>
+                      </pic:pic>
+                    </a:graphicData>
+                  </a:graphic>
+                </wp:inline>
+              </w:drawing>
+            </w:r>
+          </w:p>
+        </w:tc>
+        <w:tc>
+          <w:tcPr>
+            <w:tcW w:type="dxa" w:w="5400"/>
+            <w:tcMar>
+              <w:top w:w="100" w:type="dxa"/>
+              <w:start w:w="120" w:type="dxa"/>
+              <w:bottom w:w="100" w:type="dxa"/>
+              <w:end w:w="120" w:type="dxa"/>
+            </w:tcMar>
+          </w:tcPr>
+          <w:p>
+            <w:pPr>
+              <w:spacing w:before="0" w:after="0"/>
+            </w:pPr>
+            <w:r/>
+            <w:r>
+              <w:rPr>
+                <w:rFonts w:ascii="Arimo" w:hAnsi="Arimo"/>
+                <w:b w:val="0"/>
+                <w:color w:val="222222"/>
+                <w:sz w:val="18"/>
+              </w:rPr>
+              <w:t>________________________________</w:t>
+              <w:br/>
+              <w:t>Signature</w:t>
+            </w:r>
+          </w:p>
+        </w:tc>
+      </w:tr>
+      <w:tr>
+        <w:tc>
+          <w:tcPr>
+            <w:tcW w:type="dxa" w:w="5400"/>
+            <w:tcMar>
+              <w:top w:w="100" w:type="dxa"/>
+              <w:start w:w="120" w:type="dxa"/>
+              <w:bottom w:w="100" w:type="dxa"/>
+              <w:end w:w="120" w:type="dxa"/>
+            </w:tcMar>
+          </w:tcPr>
+          <w:p>
+            <w:pPr>
+              <w:spacing w:before="0" w:after="0"/>
+            </w:pPr>
+            <w:r/>
+            <w:r>
+              <w:rPr>
+                <w:rFonts w:ascii="Arimo" w:hAnsi="Arimo"/>
+                <w:b w:val="0"/>
+                <w:color w:val="222222"/>
+                <w:sz w:val="18"/>
+              </w:rPr>
+              <w:t>{{lia_signature_date}}</w:t>
+              <w:br/>
+              <w:t>Date</w:t>
+            </w:r>
+          </w:p>
+        </w:tc>
+        <w:tc>
+          <w:tcPr>
+            <w:tcW w:type="dxa" w:w="5400"/>
+            <w:tcMar>
+              <w:top w:w="100" w:type="dxa"/>
+              <w:start w:w="120" w:type="dxa"/>
+              <w:bottom w:w="100" w:type="dxa"/>
+              <w:end w:w="120" w:type="dxa"/>
+            </w:tcMar>
+          </w:tcPr>
+          <w:p>
+            <w:pPr>
+              <w:spacing w:before="0" w:after="0"/>
+            </w:pPr>
+            <w:r/>
+            <w:r>
+              <w:rPr>
+                <w:rFonts w:ascii="Arimo" w:hAnsi="Arimo"/>
+                <w:b w:val="0"/>
+                <w:color w:val="222222"/>
+                <w:sz w:val="18"/>
+              </w:rPr>
+              <w:t>________________________________</w:t>
+              <w:br/>
+              <w:t>Date</w:t>
+            </w:r>
+          </w:p>
+        </w:tc>
+      </w:tr>
+    </w:tbl>
+    <w:p>
+      <w:r>
+        <w:br w:type="page"/>
+      </w:r>
+    </w:p>
+    <w:p>
+      <w:pPr>
+        <w:spacing w:before="0" w:after="240"/>
+        <w:jc w:val="center"/>
+      </w:pPr>
+      <w:r>
+        <w:rPr>
+          <w:rFonts w:ascii="Arimo" w:hAnsi="Arimo"/>
+          <w:b/>
+          <w:color w:val="1F1F1F"/>
+          <w:sz w:val="44"/>
+        </w:rPr>
+        <w:t>INVOICE PROCESS</w:t>
+      </w:r>
+    </w:p>
+    <w:p>
+      <w:pPr>
+        <w:spacing w:after="280"/>
+      </w:pPr>
+      <w:r>
+        <w:rPr>
+          <w:rFonts w:ascii="Arimo" w:hAnsi="Arimo"/>
+          <w:b w:val="0"/>
+          <w:color w:val="222222"/>
+          <w:sz w:val="20"/>
+        </w:rPr>
+        <w:t>Thank you for joining the Latinos In Action familia. After the MOU is signed, LIA will send an invoice for the agreed fees. Please provide the information below so the invoice can be processed correctly.</w:t>
+      </w:r>
+    </w:p>
+    <w:tbl>
+      <w:tblPr>
+        <w:tblW w:type="dxa" w:w="10725"/>
+        <w:tblLayout w:type="fixed"/>
+        <w:tblLook w:firstColumn="1" w:firstRow="1" w:lastColumn="0" w:lastRow="0" w:noHBand="0" w:noVBand="1" w:val="04A0"/>
+        <w:tblBorders>
+          <w:top w:val="single" w:sz="6" w:space="0" w:color="D9D9D9"/>
+          <w:left w:val="single" w:sz="6" w:space="0" w:color="D9D9D9"/>
+          <w:bottom w:val="single" w:sz="6" w:space="0" w:color="D9D9D9"/>
+          <w:right w:val="single" w:sz="6" w:space="0" w:color="D9D9D9"/>
+          <w:insideH w:val="single" w:sz="6" w:space="0" w:color="D9D9D9"/>
+          <w:insideV w:val="single" w:sz="6" w:space="0" w:color="D9D9D9"/>
+        </w:tblBorders>
+      </w:tblPr>
+      <w:tblGrid>
+        <w:gridCol w:w="2700"/>
+        <w:gridCol w:w="8025"/>
+      </w:tblGrid>
+      <w:tr>
+        <w:tc>
+          <w:tcPr>
+            <w:tcW w:type="dxa" w:w="5400"/>
             <w:vAlign w:val="center"/>
             <w:tcMar>
               <w:top w:w="120" w:type="dxa"/>
@@ -8686,15 +10456,15 @@
                 <w:rFonts w:ascii="Arimo" w:hAnsi="Arimo"/>
                 <w:b/>
                 <w:color w:val="222222"/>
-                <w:sz w:val="20"/>
+                <w:sz w:val="18"/>
               </w:rPr>
-              <w:t>Final First-Year Launch Price</w:t>
+              <w:t>PURCHASE ORDER</w:t>
             </w:r>
           </w:p>
         </w:tc>
         <w:tc>
           <w:tcPr>
-            <w:tcW w:type="dxa" w:w="2808"/>
+            <w:tcW w:type="dxa" w:w="5400"/>
             <w:vAlign w:val="center"/>
             <w:tcMar>
               <w:top w:w="120" w:type="dxa"/>
@@ -8707,17 +10477,18 @@
           <w:p>
             <w:pPr>
               <w:spacing w:before="0" w:after="0"/>
-              <w:jc w:val="right"/>
             </w:pPr>
             <w:r/>
             <w:r>
               <w:rPr>
                 <w:rFonts w:ascii="Arimo" w:hAnsi="Arimo"/>
-                <w:b/>
+                <w:b w:val="0"/>
                 <w:color w:val="222222"/>
-                <w:sz w:val="20"/>
+                <w:sz w:val="18"/>
               </w:rPr>
-              <w:t>{{launch_final_price}}</w:t>
+              <w:t>Does your organization require a purchase order?  ☐ Yes  ☐ No</w:t>
+              <w:br/>
+              <w:t>________________________________________</w:t>
             </w:r>
           </w:p>
         </w:tc>
@@ -8725,16 +10496,14 @@
       <w:tr>
         <w:tc>
           <w:tcPr>
-            <w:tcW w:type="dxa" w:w="10728"/>
+            <w:tcW w:type="dxa" w:w="5400"/>
             <w:vAlign w:val="center"/>
-            <w:gridSpan w:val="2"/>
             <w:tcMar>
               <w:top w:w="120" w:type="dxa"/>
               <w:start w:w="140" w:type="dxa"/>
               <w:bottom w:w="120" w:type="dxa"/>
               <w:end w:w="140" w:type="dxa"/>
             </w:tcMar>
-            <w:shd w:fill="C4122F"/>
           </w:tcPr>
           <w:p>
             <w:pPr>
@@ -8745,18 +10514,16 @@
               <w:rPr>
                 <w:rFonts w:ascii="Arimo" w:hAnsi="Arimo"/>
                 <w:b/>
-                <w:color w:val="FFFFFF"/>
-                <w:sz w:val="20"/>
+                <w:color w:val="222222"/>
+                <w:sz w:val="18"/>
               </w:rPr>
-              <w:t>ANNUAL RENEWAL PRICING - {{renewal_school_year}}</w:t>
+              <w:t>PO contact</w:t>
             </w:r>
           </w:p>
         </w:tc>
-      </w:tr>
-      <w:tr>
         <w:tc>
           <w:tcPr>
-            <w:tcW w:type="dxa" w:w="7920"/>
+            <w:tcW w:type="dxa" w:w="5400"/>
             <w:vAlign w:val="center"/>
             <w:tcMar>
               <w:top w:w="120" w:type="dxa"/>
@@ -8775,15 +10542,19 @@
                 <w:rFonts w:ascii="Arimo" w:hAnsi="Arimo"/>
                 <w:b w:val="0"/>
                 <w:color w:val="222222"/>
-                <w:sz w:val="20"/>
+                <w:sz w:val="18"/>
               </w:rPr>
-              <w:t>Annual Renewal Price</w:t>
+              <w:t>Name of person who receives the quote</w:t>
+              <w:br/>
+              <w:t>________________________________________</w:t>
             </w:r>
           </w:p>
         </w:tc>
+      </w:tr>
+      <w:tr>
         <w:tc>
           <w:tcPr>
-            <w:tcW w:type="dxa" w:w="2808"/>
+            <w:tcW w:type="dxa" w:w="5400"/>
             <w:vAlign w:val="center"/>
             <w:tcMar>
               <w:top w:w="120" w:type="dxa"/>
@@ -8795,25 +10566,22 @@
           <w:p>
             <w:pPr>
               <w:spacing w:before="0" w:after="0"/>
-              <w:jc w:val="right"/>
             </w:pPr>
             <w:r/>
             <w:r>
               <w:rPr>
                 <w:rFonts w:ascii="Arimo" w:hAnsi="Arimo"/>
-                <w:b w:val="0"/>
+                <w:b/>
                 <w:color w:val="222222"/>
-                <w:sz w:val="20"/>
+                <w:sz w:val="18"/>
               </w:rPr>
-              <w:t>{{renewal_base_price}}</w:t>
+              <w:t>PO contact email</w:t>
             </w:r>
           </w:p>
         </w:tc>
-      </w:tr>
-      <w:tr>
         <w:tc>
           <w:tcPr>
-            <w:tcW w:type="dxa" w:w="7920"/>
+            <w:tcW w:type="dxa" w:w="5400"/>
             <w:vAlign w:val="center"/>
             <w:tcMar>
               <w:top w:w="120" w:type="dxa"/>
@@ -8832,15 +10600,19 @@
                 <w:rFonts w:ascii="Arimo" w:hAnsi="Arimo"/>
                 <w:b w:val="0"/>
                 <w:color w:val="222222"/>
-                <w:sz w:val="20"/>
+                <w:sz w:val="18"/>
               </w:rPr>
-              <w:t>Renewal Discount - {{renewal_discount_name}}</w:t>
+              <w:t>Email address</w:t>
+              <w:br/>
+              <w:t>________________________________________</w:t>
             </w:r>
           </w:p>
         </w:tc>
+      </w:tr>
+      <w:tr>
         <w:tc>
           <w:tcPr>
-            <w:tcW w:type="dxa" w:w="2808"/>
+            <w:tcW w:type="dxa" w:w="5400"/>
             <w:vAlign w:val="center"/>
             <w:tcMar>
               <w:top w:w="120" w:type="dxa"/>
@@ -8852,7 +10624,33 @@
           <w:p>
             <w:pPr>
               <w:spacing w:before="0" w:after="0"/>
-              <w:jc w:val="right"/>
+            </w:pPr>
+            <w:r/>
+            <w:r>
+              <w:rPr>
+                <w:rFonts w:ascii="Arimo" w:hAnsi="Arimo"/>
+                <w:b/>
+                <w:color w:val="222222"/>
+                <w:sz w:val="18"/>
+              </w:rPr>
+              <w:t>PO contact phone</w:t>
+            </w:r>
+          </w:p>
+        </w:tc>
+        <w:tc>
+          <w:tcPr>
+            <w:tcW w:type="dxa" w:w="5400"/>
+            <w:vAlign w:val="center"/>
+            <w:tcMar>
+              <w:top w:w="120" w:type="dxa"/>
+              <w:start w:w="140" w:type="dxa"/>
+              <w:bottom w:w="120" w:type="dxa"/>
+              <w:end w:w="140" w:type="dxa"/>
+            </w:tcMar>
+          </w:tcPr>
+          <w:p>
+            <w:pPr>
+              <w:spacing w:before="0" w:after="0"/>
             </w:pPr>
             <w:r/>
             <w:r>
@@ -8860,9 +10658,11 @@
                 <w:rFonts w:ascii="Arimo" w:hAnsi="Arimo"/>
                 <w:b w:val="0"/>
                 <w:color w:val="222222"/>
-                <w:sz w:val="20"/>
+                <w:sz w:val="18"/>
               </w:rPr>
-              <w:t>- {{renewal_discount_amount}}</w:t>
+              <w:t>Phone number</w:t>
+              <w:br/>
+              <w:t>________________________________________</w:t>
             </w:r>
           </w:p>
         </w:tc>
@@ -8870,7 +10670,65 @@
       <w:tr>
         <w:tc>
           <w:tcPr>
-            <w:tcW w:type="dxa" w:w="7920"/>
+            <w:tcW w:type="dxa" w:w="5400"/>
+            <w:vAlign w:val="center"/>
+            <w:tcMar>
+              <w:top w:w="120" w:type="dxa"/>
+              <w:start w:w="140" w:type="dxa"/>
+              <w:bottom w:w="120" w:type="dxa"/>
+              <w:end w:w="140" w:type="dxa"/>
+            </w:tcMar>
+          </w:tcPr>
+          <w:p>
+            <w:pPr>
+              <w:spacing w:before="0" w:after="0"/>
+            </w:pPr>
+            <w:r/>
+            <w:r>
+              <w:rPr>
+                <w:rFonts w:ascii="Arimo" w:hAnsi="Arimo"/>
+                <w:b/>
+                <w:color w:val="222222"/>
+                <w:sz w:val="18"/>
+              </w:rPr>
+              <w:t>Quote requirements</w:t>
+            </w:r>
+          </w:p>
+        </w:tc>
+        <w:tc>
+          <w:tcPr>
+            <w:tcW w:type="dxa" w:w="5400"/>
+            <w:vAlign w:val="center"/>
+            <w:tcMar>
+              <w:top w:w="120" w:type="dxa"/>
+              <w:start w:w="140" w:type="dxa"/>
+              <w:bottom w:w="120" w:type="dxa"/>
+              <w:end w:w="140" w:type="dxa"/>
+            </w:tcMar>
+          </w:tcPr>
+          <w:p>
+            <w:pPr>
+              <w:spacing w:before="0" w:after="0"/>
+            </w:pPr>
+            <w:r/>
+            <w:r>
+              <w:rPr>
+                <w:rFonts w:ascii="Arimo" w:hAnsi="Arimo"/>
+                <w:b w:val="0"/>
+                <w:color w:val="222222"/>
+                <w:sz w:val="18"/>
+              </w:rPr>
+              <w:t>Information that must appear on the quote</w:t>
+              <w:br/>
+              <w:t>________________________________________</w:t>
+            </w:r>
+          </w:p>
+        </w:tc>
+      </w:tr>
+      <w:tr>
+        <w:tc>
+          <w:tcPr>
+            <w:tcW w:type="dxa" w:w="5400"/>
             <w:vAlign w:val="center"/>
             <w:tcMar>
               <w:top w:w="120" w:type="dxa"/>
@@ -8890,15 +10748,15 @@
                 <w:rFonts w:ascii="Arimo" w:hAnsi="Arimo"/>
                 <w:b/>
                 <w:color w:val="222222"/>
-                <w:sz w:val="20"/>
+                <w:sz w:val="18"/>
               </w:rPr>
-              <w:t>Final Annual Renewal Price</w:t>
+              <w:t>INVOICE CONTACT</w:t>
             </w:r>
           </w:p>
         </w:tc>
         <w:tc>
           <w:tcPr>
-            <w:tcW w:type="dxa" w:w="2808"/>
+            <w:tcW w:type="dxa" w:w="5400"/>
             <w:vAlign w:val="center"/>
             <w:tcMar>
               <w:top w:w="120" w:type="dxa"/>
@@ -8911,7 +10769,37 @@
           <w:p>
             <w:pPr>
               <w:spacing w:before="0" w:after="0"/>
-              <w:jc w:val="right"/>
+            </w:pPr>
+            <w:r/>
+            <w:r>
+              <w:rPr>
+                <w:rFonts w:ascii="Arimo" w:hAnsi="Arimo"/>
+                <w:b w:val="0"/>
+                <w:color w:val="222222"/>
+                <w:sz w:val="18"/>
+              </w:rPr>
+              <w:t>Complete this section if no purchase order is required.</w:t>
+              <w:br/>
+              <w:t>________________________________________</w:t>
+            </w:r>
+          </w:p>
+        </w:tc>
+      </w:tr>
+      <w:tr>
+        <w:tc>
+          <w:tcPr>
+            <w:tcW w:type="dxa" w:w="5400"/>
+            <w:vAlign w:val="center"/>
+            <w:tcMar>
+              <w:top w:w="120" w:type="dxa"/>
+              <w:start w:w="140" w:type="dxa"/>
+              <w:bottom w:w="120" w:type="dxa"/>
+              <w:end w:w="140" w:type="dxa"/>
+            </w:tcMar>
+          </w:tcPr>
+          <w:p>
+            <w:pPr>
+              <w:spacing w:before="0" w:after="0"/>
             </w:pPr>
             <w:r/>
             <w:r>
@@ -8919,9 +10807,216 @@
                 <w:rFonts w:ascii="Arimo" w:hAnsi="Arimo"/>
                 <w:b/>
                 <w:color w:val="222222"/>
-                <w:sz w:val="20"/>
+                <w:sz w:val="18"/>
               </w:rPr>
-              <w:t>{{renewal_final_price}}</w:t>
+              <w:t>Invoice contact</w:t>
+            </w:r>
+          </w:p>
+        </w:tc>
+        <w:tc>
+          <w:tcPr>
+            <w:tcW w:type="dxa" w:w="5400"/>
+            <w:vAlign w:val="center"/>
+            <w:tcMar>
+              <w:top w:w="120" w:type="dxa"/>
+              <w:start w:w="140" w:type="dxa"/>
+              <w:bottom w:w="120" w:type="dxa"/>
+              <w:end w:w="140" w:type="dxa"/>
+            </w:tcMar>
+          </w:tcPr>
+          <w:p>
+            <w:pPr>
+              <w:spacing w:before="0" w:after="0"/>
+            </w:pPr>
+            <w:r/>
+            <w:r>
+              <w:rPr>
+                <w:rFonts w:ascii="Arimo" w:hAnsi="Arimo"/>
+                <w:b w:val="0"/>
+                <w:color w:val="222222"/>
+                <w:sz w:val="18"/>
+              </w:rPr>
+              <w:t>Name of person who receives the invoice</w:t>
+              <w:br/>
+              <w:t>________________________________________</w:t>
+            </w:r>
+          </w:p>
+        </w:tc>
+      </w:tr>
+      <w:tr>
+        <w:tc>
+          <w:tcPr>
+            <w:tcW w:type="dxa" w:w="5400"/>
+            <w:vAlign w:val="center"/>
+            <w:tcMar>
+              <w:top w:w="120" w:type="dxa"/>
+              <w:start w:w="140" w:type="dxa"/>
+              <w:bottom w:w="120" w:type="dxa"/>
+              <w:end w:w="140" w:type="dxa"/>
+            </w:tcMar>
+          </w:tcPr>
+          <w:p>
+            <w:pPr>
+              <w:spacing w:before="0" w:after="0"/>
+            </w:pPr>
+            <w:r/>
+            <w:r>
+              <w:rPr>
+                <w:rFonts w:ascii="Arimo" w:hAnsi="Arimo"/>
+                <w:b/>
+                <w:color w:val="222222"/>
+                <w:sz w:val="18"/>
+              </w:rPr>
+              <w:t>Invoice email</w:t>
+            </w:r>
+          </w:p>
+        </w:tc>
+        <w:tc>
+          <w:tcPr>
+            <w:tcW w:type="dxa" w:w="5400"/>
+            <w:vAlign w:val="center"/>
+            <w:tcMar>
+              <w:top w:w="120" w:type="dxa"/>
+              <w:start w:w="140" w:type="dxa"/>
+              <w:bottom w:w="120" w:type="dxa"/>
+              <w:end w:w="140" w:type="dxa"/>
+            </w:tcMar>
+          </w:tcPr>
+          <w:p>
+            <w:pPr>
+              <w:spacing w:before="0" w:after="0"/>
+            </w:pPr>
+            <w:r/>
+            <w:r>
+              <w:rPr>
+                <w:rFonts w:ascii="Arimo" w:hAnsi="Arimo"/>
+                <w:b w:val="0"/>
+                <w:color w:val="222222"/>
+                <w:sz w:val="18"/>
+              </w:rPr>
+              <w:t>Email address</w:t>
+              <w:br/>
+              <w:t>________________________________________</w:t>
+            </w:r>
+          </w:p>
+        </w:tc>
+      </w:tr>
+      <w:tr>
+        <w:tc>
+          <w:tcPr>
+            <w:tcW w:type="dxa" w:w="5400"/>
+            <w:vAlign w:val="center"/>
+            <w:tcMar>
+              <w:top w:w="120" w:type="dxa"/>
+              <w:start w:w="140" w:type="dxa"/>
+              <w:bottom w:w="120" w:type="dxa"/>
+              <w:end w:w="140" w:type="dxa"/>
+            </w:tcMar>
+          </w:tcPr>
+          <w:p>
+            <w:pPr>
+              <w:spacing w:before="0" w:after="0"/>
+            </w:pPr>
+            <w:r/>
+            <w:r>
+              <w:rPr>
+                <w:rFonts w:ascii="Arimo" w:hAnsi="Arimo"/>
+                <w:b/>
+                <w:color w:val="222222"/>
+                <w:sz w:val="18"/>
+              </w:rPr>
+              <w:t>Invoice phone</w:t>
+            </w:r>
+          </w:p>
+        </w:tc>
+        <w:tc>
+          <w:tcPr>
+            <w:tcW w:type="dxa" w:w="5400"/>
+            <w:vAlign w:val="center"/>
+            <w:tcMar>
+              <w:top w:w="120" w:type="dxa"/>
+              <w:start w:w="140" w:type="dxa"/>
+              <w:bottom w:w="120" w:type="dxa"/>
+              <w:end w:w="140" w:type="dxa"/>
+            </w:tcMar>
+          </w:tcPr>
+          <w:p>
+            <w:pPr>
+              <w:spacing w:before="0" w:after="0"/>
+            </w:pPr>
+            <w:r/>
+            <w:r>
+              <w:rPr>
+                <w:rFonts w:ascii="Arimo" w:hAnsi="Arimo"/>
+                <w:b w:val="0"/>
+                <w:color w:val="222222"/>
+                <w:sz w:val="18"/>
+              </w:rPr>
+              <w:t>Phone number</w:t>
+              <w:br/>
+              <w:t>________________________________________</w:t>
+            </w:r>
+          </w:p>
+        </w:tc>
+      </w:tr>
+      <w:tr>
+        <w:tc>
+          <w:tcPr>
+            <w:tcW w:type="dxa" w:w="5400"/>
+            <w:vAlign w:val="center"/>
+            <w:tcMar>
+              <w:top w:w="120" w:type="dxa"/>
+              <w:start w:w="140" w:type="dxa"/>
+              <w:bottom w:w="120" w:type="dxa"/>
+              <w:end w:w="140" w:type="dxa"/>
+            </w:tcMar>
+            <w:shd w:fill="F2F2F2"/>
+          </w:tcPr>
+          <w:p>
+            <w:pPr>
+              <w:spacing w:before="0" w:after="0"/>
+            </w:pPr>
+            <w:r/>
+            <w:r>
+              <w:rPr>
+                <w:rFonts w:ascii="Arimo" w:hAnsi="Arimo"/>
+                <w:b/>
+                <w:color w:val="222222"/>
+                <w:sz w:val="18"/>
+              </w:rPr>
+              <w:t>VENDOR SETUP</w:t>
+            </w:r>
+          </w:p>
+        </w:tc>
+        <w:tc>
+          <w:tcPr>
+            <w:tcW w:type="dxa" w:w="5400"/>
+            <w:vAlign w:val="center"/>
+            <w:tcMar>
+              <w:top w:w="120" w:type="dxa"/>
+              <w:start w:w="140" w:type="dxa"/>
+              <w:bottom w:w="120" w:type="dxa"/>
+              <w:end w:w="140" w:type="dxa"/>
+            </w:tcMar>
+            <w:shd w:fill="F2F2F2"/>
+          </w:tcPr>
+          <w:p>
+            <w:pPr>
+              <w:spacing w:before="0" w:after="0"/>
+            </w:pPr>
+            <w:r/>
+            <w:r>
+              <w:rPr>
+                <w:rFonts w:ascii="Arimo" w:hAnsi="Arimo"/>
+                <w:b w:val="0"/>
+                <w:color w:val="222222"/>
+                <w:sz w:val="18"/>
+              </w:rPr>
+              <w:t>Is vendor registration required?  ☐ Yes  ☐ No</w:t>
+              <w:br/>
+              <w:t>Required forms/documents:</w:t>
+              <w:br/>
+              <w:t>________________________________________</w:t>
             </w:r>
           </w:p>
         </w:tc>
@@ -8929,2284 +11024,36 @@
     </w:tbl>
     <w:p>
       <w:pPr>
-        <w:keepNext w:val="0"/>
-        <w:keepLines w:val="0"/>
-        <w:pageBreakBefore w:val="0"/>
-        <w:widowControl w:val="1"/>
-        <w:pBdr>
-          <w:top w:space="0" w:sz="0" w:val="nil"/>
-          <w:left w:space="0" w:sz="0" w:val="nil"/>
-          <w:bottom w:space="0" w:sz="0" w:val="nil"/>
-          <w:right w:space="0" w:sz="0" w:val="nil"/>
-          <w:between w:space="0" w:sz="0" w:val="nil"/>
-        </w:pBdr>
-        <w:shd w:fill="auto" w:val="clear"/>
-        <w:spacing w:after="160" w:before="0" w:line="259" w:lineRule="auto"/>
-        <w:ind w:left="0" w:right="0" w:firstLine="0"/>
-        <w:jc w:val="left"/>
-        <w:rPr>
-          <w:rFonts w:ascii="Arimo" w:cs="Arimo" w:eastAsia="Arimo" w:hAnsi="Arimo"/>
-        </w:rPr>
-      </w:pPr>
-      <w:r>
-        <w:rPr>
-          <w:rtl w:val="0"/>
-        </w:rPr>
+        <w:spacing w:before="240" w:after="240"/>
+      </w:pPr>
+      <w:r>
+        <w:rPr>
+          <w:rFonts w:ascii="Arimo" w:hAnsi="Arimo"/>
+          <w:b/>
+          <w:color w:val="C4122F"/>
+          <w:sz w:val="20"/>
+        </w:rPr>
+        <w:t>Return vendor forms or invoicing questions to Brayan Zuniga at brayan@latinosinaction.org.</w:t>
       </w:r>
     </w:p>
     <w:p>
-      <w:pPr>
-        <w:keepNext w:val="0"/>
-        <w:keepLines w:val="0"/>
-        <w:pageBreakBefore w:val="0"/>
-        <w:widowControl w:val="1"/>
-        <w:pBdr>
-          <w:top w:space="0" w:sz="0" w:val="nil"/>
-          <w:left w:space="0" w:sz="0" w:val="nil"/>
-          <w:bottom w:space="0" w:sz="0" w:val="nil"/>
-          <w:right w:space="0" w:sz="0" w:val="nil"/>
-          <w:between w:space="0" w:sz="0" w:val="nil"/>
-        </w:pBdr>
-        <w:shd w:fill="auto" w:val="clear"/>
-        <w:spacing w:after="160" w:before="0" w:line="259" w:lineRule="auto"/>
-        <w:ind w:left="0" w:right="0" w:firstLine="0"/>
-        <w:jc w:val="left"/>
-        <w:rPr>
-          <w:rFonts w:ascii="Arimo" w:cs="Arimo" w:eastAsia="Arimo" w:hAnsi="Arimo"/>
-        </w:rPr>
-      </w:pPr>
-      <w:r>
-        <w:rPr>
-          <w:rtl w:val="0"/>
-        </w:rPr>
-      </w:r>
-    </w:p>
-    <w:p>
-      <w:pPr>
-        <w:keepNext w:val="0"/>
-        <w:keepLines w:val="0"/>
-        <w:pageBreakBefore w:val="0"/>
-        <w:widowControl w:val="1"/>
-        <w:pBdr>
-          <w:top w:space="0" w:sz="0" w:val="nil"/>
-          <w:left w:space="0" w:sz="0" w:val="nil"/>
-          <w:bottom w:space="0" w:sz="0" w:val="nil"/>
-          <w:right w:space="0" w:sz="0" w:val="nil"/>
-          <w:between w:space="0" w:sz="0" w:val="nil"/>
-        </w:pBdr>
-        <w:shd w:fill="auto" w:val="clear"/>
-        <w:spacing w:after="160" w:before="0" w:line="259" w:lineRule="auto"/>
-        <w:ind w:left="0" w:right="0" w:firstLine="0"/>
-        <w:jc w:val="left"/>
-        <w:rPr>
-          <w:rFonts w:ascii="Arimo" w:cs="Arimo" w:eastAsia="Arimo" w:hAnsi="Arimo"/>
-        </w:rPr>
-      </w:pPr>
-      <w:r>
-        <w:rPr>
-          <w:rtl w:val="0"/>
-        </w:rPr>
-      </w:r>
-    </w:p>
-    <w:p>
-      <w:pPr>
-        <w:keepNext w:val="0"/>
-        <w:keepLines w:val="0"/>
-        <w:pageBreakBefore w:val="0"/>
-        <w:widowControl w:val="1"/>
-        <w:pBdr>
-          <w:top w:space="0" w:sz="0" w:val="nil"/>
-          <w:left w:space="0" w:sz="0" w:val="nil"/>
-          <w:bottom w:space="0" w:sz="0" w:val="nil"/>
-          <w:right w:space="0" w:sz="0" w:val="nil"/>
-          <w:between w:space="0" w:sz="0" w:val="nil"/>
-        </w:pBdr>
-        <w:shd w:fill="auto" w:val="clear"/>
-        <w:spacing w:after="160" w:before="0" w:line="259" w:lineRule="auto"/>
-        <w:ind w:left="0" w:right="0" w:firstLine="0"/>
-        <w:jc w:val="left"/>
-        <w:rPr>
-          <w:rFonts w:ascii="Arimo" w:cs="Arimo" w:eastAsia="Arimo" w:hAnsi="Arimo"/>
-        </w:rPr>
-      </w:pPr>
-      <w:r>
-        <w:rPr>
-          <w:rtl w:val="0"/>
-        </w:rPr>
-      </w:r>
-    </w:p>
-    <w:p>
-      <w:pPr>
-        <w:keepNext w:val="0"/>
-        <w:keepLines w:val="0"/>
-        <w:pageBreakBefore w:val="0"/>
-        <w:widowControl w:val="1"/>
-        <w:pBdr>
-          <w:top w:space="0" w:sz="0" w:val="nil"/>
-          <w:left w:space="0" w:sz="0" w:val="nil"/>
-          <w:bottom w:space="0" w:sz="0" w:val="nil"/>
-          <w:right w:space="0" w:sz="0" w:val="nil"/>
-          <w:between w:space="0" w:sz="0" w:val="nil"/>
-        </w:pBdr>
-        <w:shd w:fill="auto" w:val="clear"/>
-        <w:spacing w:after="160" w:before="0" w:line="259" w:lineRule="auto"/>
-        <w:ind w:left="0" w:right="0" w:firstLine="0"/>
-        <w:jc w:val="left"/>
-        <w:rPr>
-          <w:rFonts w:ascii="Arimo" w:cs="Arimo" w:eastAsia="Arimo" w:hAnsi="Arimo"/>
-        </w:rPr>
-      </w:pPr>
-      <w:r>
-        <w:rPr>
-          <w:rtl w:val="0"/>
-        </w:rPr>
-      </w:r>
-    </w:p>
-    <w:p>
-      <w:pPr>
-        <w:keepNext w:val="0"/>
-        <w:keepLines w:val="0"/>
-        <w:pageBreakBefore w:val="0"/>
-        <w:widowControl w:val="1"/>
-        <w:pBdr>
-          <w:top w:space="0" w:sz="0" w:val="nil"/>
-          <w:left w:space="0" w:sz="0" w:val="nil"/>
-          <w:bottom w:space="0" w:sz="0" w:val="nil"/>
-          <w:right w:space="0" w:sz="0" w:val="nil"/>
-          <w:between w:space="0" w:sz="0" w:val="nil"/>
-        </w:pBdr>
-        <w:shd w:fill="auto" w:val="clear"/>
-        <w:spacing w:after="160" w:before="0" w:line="259" w:lineRule="auto"/>
-        <w:ind w:left="0" w:right="0" w:firstLine="0"/>
-        <w:jc w:val="left"/>
-        <w:rPr>
-          <w:rFonts w:ascii="Arimo" w:cs="Arimo" w:eastAsia="Arimo" w:hAnsi="Arimo"/>
-        </w:rPr>
-      </w:pPr>
-      <w:r>
-        <w:rPr>
-          <w:rtl w:val="0"/>
-        </w:rPr>
-      </w:r>
-    </w:p>
-    <w:p>
-      <w:pPr>
-        <w:spacing w:after="160" w:line="259" w:lineRule="auto"/>
-        <w:ind w:left="990" w:firstLine="0"/>
-        <w:rPr>
-          <w:rFonts w:ascii="Helvetica Neue" w:cs="Helvetica Neue" w:eastAsia="Helvetica Neue" w:hAnsi="Helvetica Neue"/>
-          <w:sz w:val="22"/>
-          <w:szCs w:val="22"/>
-        </w:rPr>
-      </w:pPr>
-      <w:r>
-        <w:rPr>
-          <w:rtl w:val="0"/>
-        </w:rPr>
-      </w:r>
-    </w:p>
-    <w:p>
-      <w:pPr>
-        <w:spacing w:after="160" w:line="259" w:lineRule="auto"/>
-        <w:rPr>
-          <w:rFonts w:ascii="Arimo" w:cs="Arimo" w:eastAsia="Arimo" w:hAnsi="Arimo"/>
-        </w:rPr>
-      </w:pPr>
-      <w:r>
-        <w:rPr>
-          <w:rFonts w:ascii="Arimo" w:cs="Arimo" w:eastAsia="Arimo" w:hAnsi="Arimo"/>
-          <w:rtl w:val="0"/>
-        </w:rPr>
-        <w:t xml:space="preserve">*After second year renewal the renewal fee will be calculated based on the second year renewal plus an inflation percentage.</w:t>
-      </w:r>
-    </w:p>
-    <w:p>
-      <w:pPr>
-        <w:spacing w:after="160" w:line="259" w:lineRule="auto"/>
-        <w:rPr>
-          <w:rFonts w:ascii="Arimo" w:cs="Arimo" w:eastAsia="Arimo" w:hAnsi="Arimo"/>
-        </w:rPr>
-      </w:pPr>
-      <w:r>
-        <w:rPr>
-          <w:rtl w:val="0"/>
-        </w:rPr>
-      </w:r>
-    </w:p>
-    <w:p>
-      <w:pPr>
-        <w:keepNext w:val="0"/>
-        <w:keepLines w:val="0"/>
-        <w:pageBreakBefore w:val="0"/>
-        <w:widowControl w:val="1"/>
-        <w:pBdr>
-          <w:top w:space="0" w:sz="0" w:val="nil"/>
-          <w:left w:space="0" w:sz="0" w:val="nil"/>
-          <w:bottom w:space="0" w:sz="0" w:val="nil"/>
-          <w:right w:space="0" w:sz="0" w:val="nil"/>
-          <w:between w:space="0" w:sz="0" w:val="nil"/>
-        </w:pBdr>
-        <w:shd w:fill="auto" w:val="clear"/>
-        <w:spacing w:after="160" w:before="0" w:line="259" w:lineRule="auto"/>
-        <w:ind w:left="0" w:right="0" w:firstLine="0"/>
-        <w:jc w:val="left"/>
-        <w:rPr>
-          <w:rFonts w:ascii="Helvetica Neue" w:cs="Helvetica Neue" w:eastAsia="Helvetica Neue" w:hAnsi="Helvetica Neue"/>
-          <w:b w:val="1"/>
-          <w:bCs w:val="1"/>
-          <w:i w:val="0"/>
-          <w:iCs w:val="0"/>
-          <w:smallCaps w:val="0"/>
-          <w:strike w:val="0"/>
-          <w:color w:val="000000"/>
-          <w:sz w:val="24"/>
-          <w:szCs w:val="24"/>
-          <w:u w:val="none"/>
-          <w:shd w:fill="auto" w:val="clear"/>
-          <w:vertAlign w:val="baseline"/>
-        </w:rPr>
-      </w:pPr>
-      <w:r>
-        <w:rPr>
-          <w:rFonts w:ascii="Arimo" w:cs="Arimo" w:eastAsia="Arimo" w:hAnsi="Arimo"/>
-          <w:b w:val="0"/>
-          <w:bCs w:val="0"/>
-          <w:i w:val="0"/>
-          <w:iCs w:val="0"/>
-          <w:smallCaps w:val="0"/>
-          <w:strike w:val="0"/>
-          <w:color w:val="000000"/>
-          <w:sz w:val="24"/>
-          <w:szCs w:val="24"/>
-          <w:u w:val="none"/>
-          <w:shd w:fill="auto" w:val="clear"/>
-          <w:vertAlign w:val="baseline"/>
-          <w:rtl w:val="0"/>
-        </w:rPr>
-        <w:t xml:space="preserve">Authorized Signatories</w:t>
-      </w:r>
-      <w:r>
-        <w:rPr>
-          <w:rtl w:val="0"/>
-        </w:rPr>
-      </w:r>
-    </w:p>
-    <w:p>
-      <w:pPr>
-        <w:keepNext w:val="0"/>
-        <w:keepLines w:val="0"/>
-        <w:pageBreakBefore w:val="0"/>
-        <w:widowControl w:val="1"/>
-        <w:pBdr>
-          <w:top w:space="0" w:sz="0" w:val="nil"/>
-          <w:left w:space="0" w:sz="0" w:val="nil"/>
-          <w:bottom w:space="0" w:sz="0" w:val="nil"/>
-          <w:right w:space="0" w:sz="0" w:val="nil"/>
-          <w:between w:space="0" w:sz="0" w:val="nil"/>
-        </w:pBdr>
-        <w:shd w:fill="auto" w:val="clear"/>
-        <w:spacing w:after="160" w:before="0" w:line="259" w:lineRule="auto"/>
-        <w:ind w:left="0" w:right="0" w:firstLine="0"/>
-        <w:jc w:val="left"/>
-        <w:rPr>
-          <w:rFonts w:ascii="Arimo" w:cs="Arimo" w:eastAsia="Arimo" w:hAnsi="Arimo"/>
-        </w:rPr>
-      </w:pPr>
-      <w:r>
-        <w:rPr>
-          <w:rtl w:val="0"/>
-        </w:rPr>
-      </w:r>
-    </w:p>
-    <w:p>
-      <w:pPr>
-        <w:keepNext w:val="0"/>
-        <w:keepLines w:val="0"/>
-        <w:pageBreakBefore w:val="0"/>
-        <w:widowControl w:val="1"/>
-        <w:pBdr>
-          <w:top w:space="0" w:sz="0" w:val="nil"/>
-          <w:left w:space="0" w:sz="0" w:val="nil"/>
-          <w:bottom w:space="0" w:sz="0" w:val="nil"/>
-          <w:right w:space="0" w:sz="0" w:val="nil"/>
-          <w:between w:space="0" w:sz="0" w:val="nil"/>
-        </w:pBdr>
-        <w:shd w:fill="auto" w:val="clear"/>
-        <w:spacing w:after="160" w:before="0" w:line="259" w:lineRule="auto"/>
-        <w:ind w:left="0" w:right="0" w:firstLine="0"/>
-        <w:jc w:val="left"/>
-        <w:rPr>
-          <w:rFonts w:ascii="Helvetica Neue" w:cs="Helvetica Neue" w:eastAsia="Helvetica Neue" w:hAnsi="Helvetica Neue"/>
-          <w:b w:val="0"/>
-          <w:bCs w:val="0"/>
-          <w:i w:val="0"/>
-          <w:iCs w:val="0"/>
-          <w:smallCaps w:val="0"/>
-          <w:strike w:val="0"/>
-          <w:color w:val="000000"/>
-          <w:sz w:val="24"/>
-          <w:szCs w:val="24"/>
-          <w:u w:val="none"/>
-          <w:shd w:fill="auto" w:val="clear"/>
-          <w:vertAlign w:val="baseline"/>
-        </w:rPr>
-      </w:pPr>
-      <w:r>
-        <w:rPr>
-          <w:rFonts w:ascii="Arimo" w:cs="Arimo" w:eastAsia="Arimo" w:hAnsi="Arimo"/>
-          <w:b w:val="0"/>
-          <w:bCs w:val="0"/>
-          <w:i w:val="0"/>
-          <w:iCs w:val="0"/>
-          <w:smallCaps w:val="0"/>
-          <w:strike w:val="0"/>
-          <w:color w:val="000000"/>
-          <w:sz w:val="24"/>
-          <w:szCs w:val="24"/>
-          <w:u w:val="none"/>
-          <w:shd w:fill="auto" w:val="clear"/>
-          <w:vertAlign w:val="baseline"/>
-          <w:rtl w:val="0"/>
-        </w:rPr>
-        <w:t xml:space="preserve">The below signed parties agree to the respective expectations outlined in the above Memorandum of Understanding. </w:t>
-      </w:r>
-      <w:r>
-        <w:rPr>
-          <w:rtl w:val="0"/>
-        </w:rPr>
-      </w:r>
-    </w:p>
-    <w:p>
-      <w:pPr>
-        <w:keepNext w:val="0"/>
-        <w:keepLines w:val="0"/>
-        <w:pageBreakBefore w:val="0"/>
-        <w:widowControl w:val="1"/>
-        <w:pBdr>
-          <w:top w:space="0" w:sz="0" w:val="nil"/>
-          <w:left w:space="0" w:sz="0" w:val="nil"/>
-          <w:bottom w:space="0" w:sz="0" w:val="nil"/>
-          <w:right w:space="0" w:sz="0" w:val="nil"/>
-          <w:between w:space="0" w:sz="0" w:val="nil"/>
-        </w:pBdr>
-        <w:shd w:fill="auto" w:val="clear"/>
-        <w:spacing w:after="160" w:before="0" w:line="259" w:lineRule="auto"/>
-        <w:ind w:left="0" w:right="0" w:firstLine="0"/>
-        <w:jc w:val="left"/>
-        <w:rPr>
-          <w:rFonts w:ascii="Helvetica Neue" w:cs="Helvetica Neue" w:eastAsia="Helvetica Neue" w:hAnsi="Helvetica Neue"/>
-          <w:b w:val="1"/>
-          <w:bCs w:val="1"/>
-          <w:i w:val="0"/>
-          <w:iCs w:val="0"/>
-          <w:smallCaps w:val="0"/>
-          <w:strike w:val="0"/>
-          <w:color w:val="000000"/>
-          <w:sz w:val="24"/>
-          <w:szCs w:val="24"/>
-          <w:u w:val="none"/>
-          <w:shd w:fill="auto" w:val="clear"/>
-          <w:vertAlign w:val="baseline"/>
-        </w:rPr>
-      </w:pPr>
-      <w:r>
-        <w:rPr>
-          <w:rtl w:val="0"/>
-        </w:rPr>
-      </w:r>
-      <w:r>
-        <w:drawing>
-          <wp:anchor allowOverlap="1" behindDoc="0" distB="0" distT="0" distL="114300" distR="114300" hidden="0" layoutInCell="1" locked="0" relativeHeight="0" simplePos="0">
-            <wp:simplePos x="0" y="0"/>
-            <wp:positionH relativeFrom="column">
-              <wp:posOffset>3257550</wp:posOffset>
-            </wp:positionH>
-            <wp:positionV relativeFrom="paragraph">
-              <wp:posOffset>23466</wp:posOffset>
-            </wp:positionV>
-            <wp:extent cx="1995777" cy="574895"/>
-            <wp:effectExtent b="0" l="0" r="0" t="0"/>
-            <wp:wrapNone/>
-            <wp:docPr descr="A close up of a logo&#10;&#10;Description automatically generated" id="1073741839" name="image1.png"/>
-            <a:graphic>
-              <a:graphicData uri="http://schemas.openxmlformats.org/drawingml/2006/picture">
-                <pic:pic>
-                  <pic:nvPicPr>
-                    <pic:cNvPr descr="A close up of a logo&#10;&#10;Description automatically generated" id="0" name="image1.png"/>
-                    <pic:cNvPicPr preferRelativeResize="0"/>
-                  </pic:nvPicPr>
-                  <pic:blipFill>
-                    <a:blip r:embed="rId9"/>
-                    <a:srcRect b="0" l="0" r="0" t="0"/>
-                    <a:stretch>
-                      <a:fillRect/>
-                    </a:stretch>
-                  </pic:blipFill>
-                  <pic:spPr>
-                    <a:xfrm>
-                      <a:off x="0" y="0"/>
-                      <a:ext cx="1995777" cy="574895"/>
-                    </a:xfrm>
-                    <a:prstGeom prst="rect"/>
-                    <a:ln/>
-                  </pic:spPr>
-                </pic:pic>
-              </a:graphicData>
-            </a:graphic>
-          </wp:anchor>
-        </w:drawing>
-      </w:r>
-    </w:p>
-    <w:p>
-      <w:pPr>
-        <w:keepNext w:val="0"/>
-        <w:keepLines w:val="0"/>
-        <w:pageBreakBefore w:val="0"/>
-        <w:widowControl w:val="1"/>
-        <w:pBdr>
-          <w:top w:space="0" w:sz="0" w:val="nil"/>
-          <w:left w:space="0" w:sz="0" w:val="nil"/>
-          <w:bottom w:space="0" w:sz="0" w:val="nil"/>
-          <w:right w:space="0" w:sz="0" w:val="nil"/>
-          <w:between w:space="0" w:sz="0" w:val="nil"/>
-        </w:pBdr>
-        <w:shd w:fill="auto" w:val="clear"/>
-        <w:spacing w:after="120" w:before="0" w:line="240" w:lineRule="auto"/>
-        <w:ind w:left="0" w:right="0" w:firstLine="0"/>
-        <w:jc w:val="left"/>
-        <w:rPr>
-          <w:rFonts w:ascii="Helvetica Neue" w:cs="Helvetica Neue" w:eastAsia="Helvetica Neue" w:hAnsi="Helvetica Neue"/>
-          <w:b w:val="0"/>
-          <w:bCs w:val="0"/>
-          <w:i w:val="0"/>
-          <w:iCs w:val="0"/>
-          <w:smallCaps w:val="0"/>
-          <w:strike w:val="0"/>
-          <w:color w:val="000000"/>
-          <w:sz w:val="24"/>
-          <w:szCs w:val="24"/>
-          <w:u w:val="none"/>
-          <w:shd w:fill="auto" w:val="clear"/>
-          <w:vertAlign w:val="baseline"/>
-        </w:rPr>
-      </w:pPr>
-      <w:r>
-        <w:rPr>
-          <w:rFonts w:ascii="Arimo" w:cs="Arimo" w:eastAsia="Arimo" w:hAnsi="Arimo"/>
-          <w:b w:val="0"/>
-          <w:bCs w:val="0"/>
-          <w:i w:val="0"/>
-          <w:iCs w:val="0"/>
-          <w:smallCaps w:val="0"/>
-          <w:strike w:val="0"/>
-          <w:color w:val="000000"/>
-          <w:sz w:val="24"/>
-          <w:szCs w:val="24"/>
-          <w:u w:val="none"/>
-          <w:shd w:fill="auto" w:val="clear"/>
-          <w:vertAlign w:val="baseline"/>
-          <w:rtl w:val="0"/>
-        </w:rPr>
-        <w:t>Dr. José Enriquez</w:t>
-        <w:tab/>
-        <w:tab/>
-        <w:t>{{lia_signature_date}}</w:t>
-        <w:tab/>
-        <w:tab/>
-        <w:tab/>
-        <w:tab/>
-        <w:t xml:space="preserve">                                     {{lia_signature_date}}</w:t>
-      </w:r>
-      <w:r>
-        <w:rPr>
-          <w:rtl w:val="0"/>
-        </w:rPr>
-      </w:r>
-      <w:r>
-        <mc:AlternateContent>
-          <mc:Choice Requires="wps">
-            <w:drawing>
-              <wp:anchor allowOverlap="1" behindDoc="0" distB="0" distT="0" distL="0" distR="0" hidden="0" layoutInCell="1" locked="0" relativeHeight="0" simplePos="0">
-                <wp:simplePos x="0" y="0"/>
-                <wp:positionH relativeFrom="column">
-                  <wp:posOffset>6350</wp:posOffset>
-                </wp:positionH>
-                <wp:positionV relativeFrom="paragraph">
-                  <wp:posOffset>208370</wp:posOffset>
-                </wp:positionV>
-                <wp:extent cx="0" cy="12700"/>
-                <wp:effectExtent b="0" l="0" r="0" t="0"/>
-                <wp:wrapSquare wrapText="bothSides" distB="0" distT="0" distL="0" distR="0"/>
-                <wp:docPr id="1073741833" name=""/>
-                <a:graphic>
-                  <a:graphicData uri="http://schemas.microsoft.com/office/word/2010/wordprocessingShape">
-                    <wps:wsp>
-                      <wps:cNvCnPr/>
-                      <wps:spPr>
-                        <a:xfrm>
-                          <a:off x="4087137" y="3780000"/>
-                          <a:ext cx="2517726" cy="0"/>
-                        </a:xfrm>
-                        <a:prstGeom prst="straightConnector1">
-                          <a:avLst/>
-                        </a:prstGeom>
-                        <a:noFill/>
-                        <a:ln cap="flat" cmpd="sng" w="12700">
-                          <a:solidFill>
-                            <a:srgbClr val="000000"/>
-                          </a:solidFill>
-                          <a:prstDash val="solid"/>
-                          <a:miter lim="4000"/>
-                          <a:headEnd len="sm" w="sm" type="none"/>
-                          <a:tailEnd len="sm" w="sm" type="none"/>
-                        </a:ln>
-                      </wps:spPr>
-                      <wps:bodyPr anchorCtr="0" anchor="ctr" bIns="91425" lIns="91425" spcFirstLastPara="1" rIns="91425" wrap="square" tIns="91425">
-                        <a:noAutofit/>
-                      </wps:bodyPr>
-                    </wps:wsp>
-                  </a:graphicData>
-                </a:graphic>
-              </wp:anchor>
-            </w:drawing>
-          </mc:Choice>
-          <mc:Fallback>
-            <w:drawing>
-              <wp:anchor allowOverlap="1" behindDoc="0" distB="0" distT="0" distL="0" distR="0" hidden="0" layoutInCell="1" locked="0" relativeHeight="0" simplePos="0">
-                <wp:simplePos x="0" y="0"/>
-                <wp:positionH relativeFrom="column">
-                  <wp:posOffset>6350</wp:posOffset>
-                </wp:positionH>
-                <wp:positionV relativeFrom="paragraph">
-                  <wp:posOffset>208370</wp:posOffset>
-                </wp:positionV>
-                <wp:extent cx="0" cy="12700"/>
-                <wp:effectExtent b="0" l="0" r="0" t="0"/>
-                <wp:wrapSquare wrapText="bothSides" distB="0" distT="0" distL="0" distR="0"/>
-                <wp:docPr id="1073741833" name="image6.png"/>
-                <a:graphic>
-                  <a:graphicData uri="http://schemas.openxmlformats.org/drawingml/2006/picture">
-                    <pic:pic>
-                      <pic:nvPicPr>
-                        <pic:cNvPr id="0" name="image6.png"/>
-                        <pic:cNvPicPr preferRelativeResize="0"/>
-                      </pic:nvPicPr>
-                      <pic:blipFill>
-                        <a:blip r:embed="rId8"/>
-                        <a:srcRect/>
-                        <a:stretch>
-                          <a:fillRect/>
-                        </a:stretch>
-                      </pic:blipFill>
-                      <pic:spPr>
-                        <a:xfrm>
-                          <a:off x="0" y="0"/>
-                          <a:ext cx="0" cy="12700"/>
-                        </a:xfrm>
-                        <a:prstGeom prst="rect"/>
-                        <a:ln/>
-                      </pic:spPr>
-                    </pic:pic>
-                  </a:graphicData>
-                </a:graphic>
-              </wp:anchor>
-            </w:drawing>
-          </mc:Fallback>
-        </mc:AlternateContent>
-      </w:r>
-      <w:r>
-        <mc:AlternateContent>
-          <mc:Choice Requires="wps">
-            <w:drawing>
-              <wp:anchor allowOverlap="1" behindDoc="0" distB="0" distT="0" distL="0" distR="0" hidden="0" layoutInCell="1" locked="0" relativeHeight="0" simplePos="0">
-                <wp:simplePos x="0" y="0"/>
-                <wp:positionH relativeFrom="column">
-                  <wp:posOffset>2962910</wp:posOffset>
-                </wp:positionH>
-                <wp:positionV relativeFrom="paragraph">
-                  <wp:posOffset>202020</wp:posOffset>
-                </wp:positionV>
-                <wp:extent cx="0" cy="12700"/>
-                <wp:effectExtent b="0" l="0" r="0" t="0"/>
-                <wp:wrapTopAndBottom distB="0" distT="0"/>
-                <wp:docPr id="1073741837" name=""/>
-                <a:graphic>
-                  <a:graphicData uri="http://schemas.microsoft.com/office/word/2010/wordprocessingShape">
-                    <wps:wsp>
-                      <wps:cNvCnPr/>
-                      <wps:spPr>
-                        <a:xfrm>
-                          <a:off x="3898852" y="3780000"/>
-                          <a:ext cx="2894296" cy="0"/>
-                        </a:xfrm>
-                        <a:prstGeom prst="straightConnector1">
-                          <a:avLst/>
-                        </a:prstGeom>
-                        <a:noFill/>
-                        <a:ln cap="flat" cmpd="sng" w="12700">
-                          <a:solidFill>
-                            <a:srgbClr val="000000"/>
-                          </a:solidFill>
-                          <a:prstDash val="solid"/>
-                          <a:miter lim="4000"/>
-                          <a:headEnd len="sm" w="sm" type="none"/>
-                          <a:tailEnd len="sm" w="sm" type="none"/>
-                        </a:ln>
-                      </wps:spPr>
-                      <wps:bodyPr anchorCtr="0" anchor="ctr" bIns="91425" lIns="91425" spcFirstLastPara="1" rIns="91425" wrap="square" tIns="91425">
-                        <a:noAutofit/>
-                      </wps:bodyPr>
-                    </wps:wsp>
-                  </a:graphicData>
-                </a:graphic>
-              </wp:anchor>
-            </w:drawing>
-          </mc:Choice>
-          <mc:Fallback>
-            <w:drawing>
-              <wp:anchor allowOverlap="1" behindDoc="0" distB="0" distT="0" distL="0" distR="0" hidden="0" layoutInCell="1" locked="0" relativeHeight="0" simplePos="0">
-                <wp:simplePos x="0" y="0"/>
-                <wp:positionH relativeFrom="column">
-                  <wp:posOffset>2962910</wp:posOffset>
-                </wp:positionH>
-                <wp:positionV relativeFrom="paragraph">
-                  <wp:posOffset>202020</wp:posOffset>
-                </wp:positionV>
-                <wp:extent cx="0" cy="12700"/>
-                <wp:effectExtent b="0" l="0" r="0" t="0"/>
-                <wp:wrapTopAndBottom distB="0" distT="0"/>
-                <wp:docPr id="1073741837" name="image10.png"/>
-                <a:graphic>
-                  <a:graphicData uri="http://schemas.openxmlformats.org/drawingml/2006/picture">
-                    <pic:pic>
-                      <pic:nvPicPr>
-                        <pic:cNvPr id="0" name="image10.png"/>
-                        <pic:cNvPicPr preferRelativeResize="0"/>
-                      </pic:nvPicPr>
-                      <pic:blipFill>
-                        <a:blip r:embed="rId8"/>
-                        <a:srcRect/>
-                        <a:stretch>
-                          <a:fillRect/>
-                        </a:stretch>
-                      </pic:blipFill>
-                      <pic:spPr>
-                        <a:xfrm>
-                          <a:off x="0" y="0"/>
-                          <a:ext cx="0" cy="12700"/>
-                        </a:xfrm>
-                        <a:prstGeom prst="rect"/>
-                        <a:ln/>
-                      </pic:spPr>
-                    </pic:pic>
-                  </a:graphicData>
-                </a:graphic>
-              </wp:anchor>
-            </w:drawing>
-          </mc:Fallback>
-        </mc:AlternateContent>
-      </w:r>
-    </w:p>
-    <w:p>
-      <w:pPr>
-        <w:keepNext w:val="0"/>
-        <w:keepLines w:val="0"/>
-        <w:pageBreakBefore w:val="0"/>
-        <w:widowControl w:val="1"/>
-        <w:pBdr>
-          <w:top w:space="0" w:sz="0" w:val="nil"/>
-          <w:left w:space="0" w:sz="0" w:val="nil"/>
-          <w:bottom w:space="0" w:sz="0" w:val="nil"/>
-          <w:right w:space="0" w:sz="0" w:val="nil"/>
-          <w:between w:space="0" w:sz="0" w:val="nil"/>
-        </w:pBdr>
-        <w:shd w:fill="auto" w:val="clear"/>
-        <w:tabs>
-          <w:tab w:val="left" w:leader="none" w:pos="540"/>
-          <w:tab w:val="left" w:leader="none" w:pos="1080"/>
-          <w:tab w:val="left" w:leader="none" w:pos="3510"/>
-          <w:tab w:val="left" w:leader="none" w:pos="4680"/>
-        </w:tabs>
-        <w:spacing w:after="1440" w:before="0" w:line="259" w:lineRule="auto"/>
-        <w:ind w:left="0" w:right="0" w:firstLine="0"/>
-        <w:jc w:val="left"/>
-        <w:rPr>
-          <w:rFonts w:ascii="Helvetica Neue" w:cs="Helvetica Neue" w:eastAsia="Helvetica Neue" w:hAnsi="Helvetica Neue"/>
-          <w:b w:val="0"/>
-          <w:bCs w:val="0"/>
-          <w:i w:val="0"/>
-          <w:iCs w:val="0"/>
-          <w:smallCaps w:val="0"/>
-          <w:strike w:val="0"/>
-          <w:color w:val="000000"/>
-          <w:sz w:val="24"/>
-          <w:szCs w:val="24"/>
-          <w:u w:val="none"/>
-          <w:shd w:fill="auto" w:val="clear"/>
-          <w:vertAlign w:val="baseline"/>
-        </w:rPr>
-      </w:pPr>
-      <w:r>
-        <w:rPr>
-          <w:rFonts w:ascii="Arimo" w:cs="Arimo" w:eastAsia="Arimo" w:hAnsi="Arimo"/>
-          <w:b w:val="0"/>
-          <w:bCs w:val="0"/>
-          <w:i w:val="0"/>
-          <w:iCs w:val="0"/>
-          <w:smallCaps w:val="0"/>
-          <w:strike w:val="0"/>
-          <w:color w:val="000000"/>
+      <w:r>
+        <w:rPr>
+          <w:rFonts w:ascii="Arimo" w:hAnsi="Arimo"/>
+          <w:b/>
+          <w:color w:val="222222"/>
           <w:sz w:val="20"/>
-          <w:szCs w:val="20"/>
-          <w:u w:val="none"/>
-          <w:shd w:fill="auto" w:val="clear"/>
-          <w:vertAlign w:val="baseline"/>
-          <w:rtl w:val="0"/>
-        </w:rPr>
-        <w:t xml:space="preserve">Latinos In Action CEO/Founder</w:t>
-        <w:tab/>
-        <w:t xml:space="preserve">Date</w:t>
-      </w:r>
-      <w:r>
-        <w:rPr>
-          <w:rFonts w:ascii="Arimo" w:cs="Arimo" w:eastAsia="Arimo" w:hAnsi="Arimo"/>
-          <w:b w:val="0"/>
-          <w:bCs w:val="0"/>
-          <w:i w:val="0"/>
-          <w:iCs w:val="0"/>
-          <w:smallCaps w:val="0"/>
-          <w:strike w:val="0"/>
-          <w:color w:val="000000"/>
-          <w:sz w:val="24"/>
-          <w:szCs w:val="24"/>
-          <w:u w:val="none"/>
-          <w:shd w:fill="auto" w:val="clear"/>
-          <w:vertAlign w:val="baseline"/>
-          <w:rtl w:val="0"/>
-        </w:rPr>
-        <w:tab/>
-      </w:r>
-      <w:r>
-        <w:rPr>
-          <w:rFonts w:ascii="Arimo" w:cs="Arimo" w:eastAsia="Arimo" w:hAnsi="Arimo"/>
-          <w:b w:val="0"/>
-          <w:bCs w:val="0"/>
-          <w:i w:val="0"/>
-          <w:iCs w:val="0"/>
-          <w:smallCaps w:val="0"/>
-          <w:strike w:val="0"/>
-          <w:color w:val="000000"/>
-          <w:sz w:val="20"/>
-          <w:szCs w:val="20"/>
-          <w:u w:val="none"/>
-          <w:shd w:fill="auto" w:val="clear"/>
-          <w:vertAlign w:val="baseline"/>
-          <w:rtl w:val="0"/>
-        </w:rPr>
-        <w:t xml:space="preserve">Latinos In Action CEO/Founder Signature</w:t>
-        <w:tab/>
-        <w:t xml:space="preserve">Date</w:t>
-      </w:r>
-      <w:r>
-        <w:rPr>
-          <w:rtl w:val="0"/>
-        </w:rPr>
-      </w:r>
-      <w:r>
-        <mc:AlternateContent>
-          <mc:Choice Requires="wps">
-            <w:drawing>
-              <wp:anchor allowOverlap="1" behindDoc="0" distB="0" distT="0" distL="0" distR="0" hidden="0" layoutInCell="1" locked="0" relativeHeight="0" simplePos="0">
-                <wp:simplePos x="0" y="0"/>
-                <wp:positionH relativeFrom="column">
-                  <wp:posOffset>25400</wp:posOffset>
-                </wp:positionH>
-                <wp:positionV relativeFrom="paragraph">
-                  <wp:posOffset>973455</wp:posOffset>
-                </wp:positionV>
-                <wp:extent cx="0" cy="12700"/>
-                <wp:effectExtent b="0" l="0" r="0" t="0"/>
-                <wp:wrapSquare wrapText="bothSides" distB="0" distT="0" distL="0" distR="0"/>
-                <wp:docPr id="1073741835" name=""/>
-                <a:graphic>
-                  <a:graphicData uri="http://schemas.microsoft.com/office/word/2010/wordprocessingShape">
-                    <wps:wsp>
-                      <wps:cNvCnPr/>
-                      <wps:spPr>
-                        <a:xfrm>
-                          <a:off x="4087137" y="3780000"/>
-                          <a:ext cx="2517726" cy="0"/>
-                        </a:xfrm>
-                        <a:prstGeom prst="straightConnector1">
-                          <a:avLst/>
-                        </a:prstGeom>
-                        <a:noFill/>
-                        <a:ln cap="flat" cmpd="sng" w="12700">
-                          <a:solidFill>
-                            <a:srgbClr val="000000"/>
-                          </a:solidFill>
-                          <a:prstDash val="solid"/>
-                          <a:miter lim="4000"/>
-                          <a:headEnd len="sm" w="sm" type="none"/>
-                          <a:tailEnd len="sm" w="sm" type="none"/>
-                        </a:ln>
-                      </wps:spPr>
-                      <wps:bodyPr anchorCtr="0" anchor="ctr" bIns="91425" lIns="91425" spcFirstLastPara="1" rIns="91425" wrap="square" tIns="91425">
-                        <a:noAutofit/>
-                      </wps:bodyPr>
-                    </wps:wsp>
-                  </a:graphicData>
-                </a:graphic>
-              </wp:anchor>
-            </w:drawing>
-          </mc:Choice>
-          <mc:Fallback>
-            <w:drawing>
-              <wp:anchor allowOverlap="1" behindDoc="0" distB="0" distT="0" distL="0" distR="0" hidden="0" layoutInCell="1" locked="0" relativeHeight="0" simplePos="0">
-                <wp:simplePos x="0" y="0"/>
-                <wp:positionH relativeFrom="column">
-                  <wp:posOffset>25400</wp:posOffset>
-                </wp:positionH>
-                <wp:positionV relativeFrom="paragraph">
-                  <wp:posOffset>973455</wp:posOffset>
-                </wp:positionV>
-                <wp:extent cx="0" cy="12700"/>
-                <wp:effectExtent b="0" l="0" r="0" t="0"/>
-                <wp:wrapSquare wrapText="bothSides" distB="0" distT="0" distL="0" distR="0"/>
-                <wp:docPr id="1073741835" name="image8.png"/>
-                <a:graphic>
-                  <a:graphicData uri="http://schemas.openxmlformats.org/drawingml/2006/picture">
-                    <pic:pic>
-                      <pic:nvPicPr>
-                        <pic:cNvPr id="0" name="image8.png"/>
-                        <pic:cNvPicPr preferRelativeResize="0"/>
-                      </pic:nvPicPr>
-                      <pic:blipFill>
-                        <a:blip r:embed="rId8"/>
-                        <a:srcRect/>
-                        <a:stretch>
-                          <a:fillRect/>
-                        </a:stretch>
-                      </pic:blipFill>
-                      <pic:spPr>
-                        <a:xfrm>
-                          <a:off x="0" y="0"/>
-                          <a:ext cx="0" cy="12700"/>
-                        </a:xfrm>
-                        <a:prstGeom prst="rect"/>
-                        <a:ln/>
-                      </pic:spPr>
-                    </pic:pic>
-                  </a:graphicData>
-                </a:graphic>
-              </wp:anchor>
-            </w:drawing>
-          </mc:Fallback>
-        </mc:AlternateContent>
-      </w:r>
-      <w:r>
-        <mc:AlternateContent>
-          <mc:Choice Requires="wps">
-            <w:drawing>
-              <wp:anchor allowOverlap="1" behindDoc="0" distB="0" distT="0" distL="0" distR="0" hidden="0" layoutInCell="1" locked="0" relativeHeight="0" simplePos="0">
-                <wp:simplePos x="0" y="0"/>
-                <wp:positionH relativeFrom="column">
-                  <wp:posOffset>2953385</wp:posOffset>
-                </wp:positionH>
-                <wp:positionV relativeFrom="paragraph">
-                  <wp:posOffset>951230</wp:posOffset>
-                </wp:positionV>
-                <wp:extent cx="0" cy="12700"/>
-                <wp:effectExtent b="0" l="0" r="0" t="0"/>
-                <wp:wrapTopAndBottom distB="0" distT="0"/>
-                <wp:docPr id="1073741836" name=""/>
-                <a:graphic>
-                  <a:graphicData uri="http://schemas.microsoft.com/office/word/2010/wordprocessingShape">
-                    <wps:wsp>
-                      <wps:cNvCnPr/>
-                      <wps:spPr>
-                        <a:xfrm>
-                          <a:off x="3898852" y="3780000"/>
-                          <a:ext cx="2894296" cy="0"/>
-                        </a:xfrm>
-                        <a:prstGeom prst="straightConnector1">
-                          <a:avLst/>
-                        </a:prstGeom>
-                        <a:noFill/>
-                        <a:ln cap="flat" cmpd="sng" w="12700">
-                          <a:solidFill>
-                            <a:srgbClr val="000000"/>
-                          </a:solidFill>
-                          <a:prstDash val="solid"/>
-                          <a:miter lim="4000"/>
-                          <a:headEnd len="sm" w="sm" type="none"/>
-                          <a:tailEnd len="sm" w="sm" type="none"/>
-                        </a:ln>
-                      </wps:spPr>
-                      <wps:bodyPr anchorCtr="0" anchor="ctr" bIns="91425" lIns="91425" spcFirstLastPara="1" rIns="91425" wrap="square" tIns="91425">
-                        <a:noAutofit/>
-                      </wps:bodyPr>
-                    </wps:wsp>
-                  </a:graphicData>
-                </a:graphic>
-              </wp:anchor>
-            </w:drawing>
-          </mc:Choice>
-          <mc:Fallback>
-            <w:drawing>
-              <wp:anchor allowOverlap="1" behindDoc="0" distB="0" distT="0" distL="0" distR="0" hidden="0" layoutInCell="1" locked="0" relativeHeight="0" simplePos="0">
-                <wp:simplePos x="0" y="0"/>
-                <wp:positionH relativeFrom="column">
-                  <wp:posOffset>2953385</wp:posOffset>
-                </wp:positionH>
-                <wp:positionV relativeFrom="paragraph">
-                  <wp:posOffset>951230</wp:posOffset>
-                </wp:positionV>
-                <wp:extent cx="0" cy="12700"/>
-                <wp:effectExtent b="0" l="0" r="0" t="0"/>
-                <wp:wrapTopAndBottom distB="0" distT="0"/>
-                <wp:docPr id="1073741836" name="image9.png"/>
-                <a:graphic>
-                  <a:graphicData uri="http://schemas.openxmlformats.org/drawingml/2006/picture">
-                    <pic:pic>
-                      <pic:nvPicPr>
-                        <pic:cNvPr id="0" name="image9.png"/>
-                        <pic:cNvPicPr preferRelativeResize="0"/>
-                      </pic:nvPicPr>
-                      <pic:blipFill>
-                        <a:blip r:embed="rId8"/>
-                        <a:srcRect/>
-                        <a:stretch>
-                          <a:fillRect/>
-                        </a:stretch>
-                      </pic:blipFill>
-                      <pic:spPr>
-                        <a:xfrm>
-                          <a:off x="0" y="0"/>
-                          <a:ext cx="0" cy="12700"/>
-                        </a:xfrm>
-                        <a:prstGeom prst="rect"/>
-                        <a:ln/>
-                      </pic:spPr>
-                    </pic:pic>
-                  </a:graphicData>
-                </a:graphic>
-              </wp:anchor>
-            </w:drawing>
-          </mc:Fallback>
-        </mc:AlternateContent>
-      </w:r>
-      <w:r>
-        <mc:AlternateContent>
-          <mc:Choice Requires="wpg">
-            <w:drawing>
-              <wp:anchor allowOverlap="1" behindDoc="0" distB="0" distT="0" distL="114300" distR="114300" hidden="0" layoutInCell="1" locked="0" relativeHeight="0" simplePos="0">
-                <wp:simplePos x="0" y="0"/>
-                <wp:positionH relativeFrom="column">
-                  <wp:posOffset>-4761</wp:posOffset>
-                </wp:positionH>
-                <wp:positionV relativeFrom="paragraph">
-                  <wp:posOffset>710825</wp:posOffset>
-                </wp:positionV>
-                <wp:extent cx="1377283" cy="163206"/>
-                <wp:effectExtent b="0" l="0" r="0" t="0"/>
-                <wp:wrapNone/>
-                <wp:docPr id="1073741834" name=""/>
-                <a:graphic>
-                  <a:graphicData uri="http://schemas.microsoft.com/office/word/2010/wordprocessingShape">
-                    <wps:wsp>
-                      <wps:cNvSpPr/>
-                      <wps:cNvPr id="5" name="Shape 5"/>
-                      <wps:spPr>
-                        <a:xfrm>
-                          <a:off x="4662121" y="3703160"/>
-                          <a:ext cx="1367758" cy="153681"/>
-                        </a:xfrm>
-                        <a:prstGeom prst="rect">
-                          <a:avLst/>
-                        </a:prstGeom>
-                        <a:noFill/>
-                        <a:ln>
-                          <a:noFill/>
-                        </a:ln>
-                      </wps:spPr>
-                      <wps:txbx>
-                        <w:txbxContent>
-                          <w:p>
-                            <w:pPr>
-                              <w:spacing w:after="0" w:before="0" w:line="240"/>
-                              <w:ind w:left="0" w:right="0" w:firstLine="0"/>
-                              <w:jc w:val="left"/>
-                              <w:textDirection w:val="btLr"/>
-                            </w:pPr>
-                          </w:p>
-                        </w:txbxContent>
-                      </wps:txbx>
-                      <wps:bodyPr anchorCtr="0" anchor="t" bIns="50800" lIns="50800" spcFirstLastPara="1" rIns="50800" wrap="square" tIns="50800">
-                        <a:noAutofit/>
-                      </wps:bodyPr>
-                    </wps:wsp>
-                  </a:graphicData>
-                </a:graphic>
-              </wp:anchor>
-            </w:drawing>
-          </mc:Choice>
-          <mc:Fallback>
-            <w:drawing>
-              <wp:anchor allowOverlap="1" behindDoc="0" distB="0" distT="0" distL="114300" distR="114300" hidden="0" layoutInCell="1" locked="0" relativeHeight="0" simplePos="0">
-                <wp:simplePos x="0" y="0"/>
-                <wp:positionH relativeFrom="column">
-                  <wp:posOffset>-4761</wp:posOffset>
-                </wp:positionH>
-                <wp:positionV relativeFrom="paragraph">
-                  <wp:posOffset>710825</wp:posOffset>
-                </wp:positionV>
-                <wp:extent cx="1377283" cy="163206"/>
-                <wp:effectExtent b="0" l="0" r="0" t="0"/>
-                <wp:wrapNone/>
-                <wp:docPr id="1073741834" name="image7.png"/>
-                <a:graphic>
-                  <a:graphicData uri="http://schemas.openxmlformats.org/drawingml/2006/picture">
-                    <pic:pic>
-                      <pic:nvPicPr>
-                        <pic:cNvPr id="0" name="image7.png"/>
-                        <pic:cNvPicPr preferRelativeResize="0"/>
-                      </pic:nvPicPr>
-                      <pic:blipFill>
-                        <a:blip r:embed="rId8"/>
-                        <a:srcRect/>
-                        <a:stretch>
-                          <a:fillRect/>
-                        </a:stretch>
-                      </pic:blipFill>
-                      <pic:spPr>
-                        <a:xfrm>
-                          <a:off x="0" y="0"/>
-                          <a:ext cx="1377283" cy="163206"/>
-                        </a:xfrm>
-                        <a:prstGeom prst="rect"/>
-                        <a:ln/>
-                      </pic:spPr>
-                    </pic:pic>
-                  </a:graphicData>
-                </a:graphic>
-              </wp:anchor>
-            </w:drawing>
-          </mc:Fallback>
-        </mc:AlternateContent>
-      </w:r>
-    </w:p>
-    <w:p>
-      <w:pPr>
-        <w:keepNext w:val="0"/>
-        <w:keepLines w:val="0"/>
-        <w:pageBreakBefore w:val="0"/>
-        <w:widowControl w:val="1"/>
-        <w:pBdr>
-          <w:top w:space="0" w:sz="0" w:val="nil"/>
-          <w:left w:space="0" w:sz="0" w:val="nil"/>
-          <w:bottom w:space="0" w:sz="0" w:val="nil"/>
-          <w:right w:space="0" w:sz="0" w:val="nil"/>
-          <w:between w:space="0" w:sz="0" w:val="nil"/>
-        </w:pBdr>
-        <w:shd w:fill="auto" w:val="clear"/>
-        <w:tabs>
-          <w:tab w:val="left" w:leader="none" w:pos="540"/>
-          <w:tab w:val="left" w:leader="none" w:pos="1080"/>
-          <w:tab w:val="left" w:leader="none" w:pos="3510"/>
-          <w:tab w:val="left" w:leader="none" w:pos="4680"/>
-        </w:tabs>
-        <w:spacing w:after="1440" w:before="0" w:line="259" w:lineRule="auto"/>
-        <w:ind w:left="0" w:right="0" w:firstLine="0"/>
-        <w:jc w:val="left"/>
-        <w:rPr>
-          <w:rFonts w:ascii="Helvetica Neue" w:cs="Helvetica Neue" w:eastAsia="Helvetica Neue" w:hAnsi="Helvetica Neue"/>
-          <w:b w:val="0"/>
-          <w:bCs w:val="0"/>
-          <w:i w:val="0"/>
-          <w:iCs w:val="0"/>
-          <w:smallCaps w:val="0"/>
-          <w:strike w:val="0"/>
-          <w:color w:val="000000"/>
-          <w:sz w:val="22"/>
-          <w:szCs w:val="22"/>
-          <w:u w:val="none"/>
-          <w:shd w:fill="auto" w:val="clear"/>
-          <w:vertAlign w:val="baseline"/>
-        </w:rPr>
-      </w:pPr>
-      <w:r>
-        <w:rPr>
-          <w:rFonts w:ascii="Arial" w:cs="Arial" w:eastAsia="Arial" w:hAnsi="Arial"/>
-          <w:b w:val="0"/>
-          <w:bCs w:val="0"/>
-          <w:i w:val="0"/>
-          <w:iCs w:val="0"/>
-          <w:smallCaps w:val="0"/>
-          <w:strike w:val="0"/>
-          <w:color w:val="000000"/>
-          <w:sz w:val="20"/>
-          <w:szCs w:val="20"/>
-          <w:highlight w:val="white"/>
-          <w:u w:val="none"/>
-          <w:vertAlign w:val="baseline"/>
-          <w:rtl w:val="0"/>
-        </w:rPr>
-        <w:t xml:space="preserve">Authorized Representative</w:t>
-        <w:tab/>
-        <w:t xml:space="preserve">Date</w:t>
-      </w:r>
-      <w:r>
-        <w:rPr>
-          <w:rFonts w:ascii="Arial" w:cs="Arial" w:eastAsia="Arial" w:hAnsi="Arial"/>
-          <w:b w:val="0"/>
-          <w:bCs w:val="0"/>
-          <w:i w:val="0"/>
-          <w:iCs w:val="0"/>
-          <w:smallCaps w:val="0"/>
-          <w:strike w:val="0"/>
-          <w:color w:val="000000"/>
-          <w:sz w:val="20"/>
-          <w:szCs w:val="20"/>
-          <w:u w:val="none"/>
-          <w:shd w:fill="auto" w:val="clear"/>
-          <w:vertAlign w:val="baseline"/>
-          <w:rtl w:val="0"/>
-        </w:rPr>
-        <w:tab/>
-      </w:r>
-      <w:r>
-        <w:rPr>
-          <w:rFonts w:ascii="Arimo" w:cs="Arimo" w:eastAsia="Arimo" w:hAnsi="Arimo"/>
-          <w:b w:val="0"/>
-          <w:bCs w:val="0"/>
-          <w:i w:val="0"/>
-          <w:iCs w:val="0"/>
-          <w:smallCaps w:val="0"/>
-          <w:strike w:val="0"/>
-          <w:color w:val="000000"/>
-          <w:sz w:val="20"/>
-          <w:szCs w:val="20"/>
-          <w:u w:val="none"/>
-          <w:shd w:fill="auto" w:val="clear"/>
-          <w:vertAlign w:val="baseline"/>
-          <w:rtl w:val="0"/>
-        </w:rPr>
-        <w:t xml:space="preserve"> Signature </w:t>
-        <w:tab/>
-        <w:tab/>
-        <w:tab/>
-        <w:tab/>
-        <w:tab/>
-        <w:t xml:space="preserve">Date</w:t>
-      </w:r>
-      <w:r>
-        <w:rPr>
-          <w:rtl w:val="0"/>
-        </w:rPr>
-      </w:r>
-    </w:p>
-    <w:p>
-      <w:pPr>
-        <w:keepNext w:val="0"/>
-        <w:keepLines w:val="0"/>
-        <w:pageBreakBefore w:val="0"/>
-        <w:widowControl w:val="1"/>
-        <w:pBdr>
-          <w:top w:space="0" w:sz="0" w:val="nil"/>
-          <w:left w:space="0" w:sz="0" w:val="nil"/>
-          <w:bottom w:space="0" w:sz="0" w:val="nil"/>
-          <w:right w:space="0" w:sz="0" w:val="nil"/>
-          <w:between w:space="0" w:sz="0" w:val="nil"/>
-        </w:pBdr>
-        <w:shd w:fill="auto" w:val="clear"/>
-        <w:spacing w:after="160" w:before="0" w:line="259" w:lineRule="auto"/>
-        <w:ind w:left="0" w:right="0" w:firstLine="0"/>
-        <w:jc w:val="left"/>
-        <w:rPr>
-          <w:rFonts w:ascii="Helvetica Neue" w:cs="Helvetica Neue" w:eastAsia="Helvetica Neue" w:hAnsi="Helvetica Neue"/>
-          <w:sz w:val="22"/>
-          <w:szCs w:val="22"/>
-        </w:rPr>
-      </w:pPr>
-      <w:r>
-        <w:rPr>
-          <w:rtl w:val="0"/>
-        </w:rPr>
-      </w:r>
-    </w:p>
-    <w:p>
-      <w:pPr>
-        <w:keepNext w:val="0"/>
-        <w:keepLines w:val="0"/>
-        <w:pageBreakBefore w:val="0"/>
-        <w:widowControl w:val="1"/>
-        <w:pBdr>
-          <w:top w:space="0" w:sz="0" w:val="nil"/>
-          <w:left w:space="0" w:sz="0" w:val="nil"/>
-          <w:bottom w:space="0" w:sz="0" w:val="nil"/>
-          <w:right w:space="0" w:sz="0" w:val="nil"/>
-          <w:between w:space="0" w:sz="0" w:val="nil"/>
-        </w:pBdr>
-        <w:shd w:fill="auto" w:val="clear"/>
-        <w:spacing w:after="160" w:before="0" w:line="259" w:lineRule="auto"/>
-        <w:ind w:left="0" w:right="0" w:firstLine="0"/>
-        <w:jc w:val="left"/>
-        <w:rPr>
-          <w:rFonts w:ascii="Helvetica Neue" w:cs="Helvetica Neue" w:eastAsia="Helvetica Neue" w:hAnsi="Helvetica Neue"/>
-          <w:sz w:val="22"/>
-          <w:szCs w:val="22"/>
-        </w:rPr>
-      </w:pPr>
-      <w:r>
-        <w:rPr>
-          <w:rtl w:val="0"/>
-        </w:rPr>
-      </w:r>
-    </w:p>
-    <w:p>
-      <w:pPr>
-        <w:keepNext w:val="0"/>
-        <w:keepLines w:val="0"/>
-        <w:pageBreakBefore w:val="0"/>
-        <w:widowControl w:val="1"/>
-        <w:pBdr>
-          <w:top w:space="0" w:sz="0" w:val="nil"/>
-          <w:left w:space="0" w:sz="0" w:val="nil"/>
-          <w:bottom w:space="0" w:sz="0" w:val="nil"/>
-          <w:right w:space="0" w:sz="0" w:val="nil"/>
-          <w:between w:space="0" w:sz="0" w:val="nil"/>
-        </w:pBdr>
-        <w:shd w:fill="auto" w:val="clear"/>
-        <w:spacing w:after="160" w:before="0" w:line="259" w:lineRule="auto"/>
-        <w:ind w:left="0" w:right="0" w:firstLine="0"/>
-        <w:jc w:val="left"/>
-        <w:rPr>
-          <w:rFonts w:ascii="Helvetica Neue" w:cs="Helvetica Neue" w:eastAsia="Helvetica Neue" w:hAnsi="Helvetica Neue"/>
-          <w:sz w:val="22"/>
-          <w:szCs w:val="22"/>
-        </w:rPr>
-      </w:pPr>
-      <w:r>
-        <w:rPr>
-          <w:rtl w:val="0"/>
-        </w:rPr>
-      </w:r>
-    </w:p>
-    <w:p>
-      <w:pPr>
-        <w:keepNext w:val="0"/>
-        <w:keepLines w:val="0"/>
-        <w:pageBreakBefore w:val="0"/>
-        <w:widowControl w:val="1"/>
-        <w:pBdr>
-          <w:top w:space="0" w:sz="0" w:val="nil"/>
-          <w:left w:space="0" w:sz="0" w:val="nil"/>
-          <w:bottom w:space="0" w:sz="0" w:val="nil"/>
-          <w:right w:space="0" w:sz="0" w:val="nil"/>
-          <w:between w:space="0" w:sz="0" w:val="nil"/>
-        </w:pBdr>
-        <w:shd w:fill="auto" w:val="clear"/>
-        <w:spacing w:after="160" w:before="0" w:line="259" w:lineRule="auto"/>
-        <w:ind w:left="0" w:right="0" w:firstLine="0"/>
-        <w:jc w:val="left"/>
-        <w:rPr>
-          <w:rFonts w:ascii="Helvetica Neue" w:cs="Helvetica Neue" w:eastAsia="Helvetica Neue" w:hAnsi="Helvetica Neue"/>
-          <w:b w:val="0"/>
-          <w:bCs w:val="0"/>
-          <w:i w:val="0"/>
-          <w:iCs w:val="0"/>
-          <w:smallCaps w:val="0"/>
-          <w:strike w:val="0"/>
-          <w:color w:val="000000"/>
-          <w:sz w:val="22"/>
-          <w:szCs w:val="22"/>
-          <w:u w:val="none"/>
-          <w:shd w:fill="auto" w:val="clear"/>
-          <w:vertAlign w:val="baseline"/>
-        </w:rPr>
-      </w:pPr>
-      <w:r>
-        <w:rPr>
-          <w:rtl w:val="0"/>
-        </w:rPr>
-      </w:r>
-    </w:p>
-    <w:p>
-      <w:pPr>
-        <w:rPr>
-          <w:rFonts w:ascii="Arial" w:cs="Arial" w:eastAsia="Arial" w:hAnsi="Arial"/>
-          <w:b w:val="1"/>
-          <w:bCs w:val="1"/>
-          <w:color w:val="000000"/>
-          <w:sz w:val="60"/>
-          <w:szCs w:val="60"/>
-        </w:rPr>
-      </w:pPr>
-      <w:r>
-        <w:rPr>
-          <w:rtl w:val="0"/>
-        </w:rPr>
-      </w:r>
-      <w:r>
-        <w:drawing>
-          <wp:anchor allowOverlap="1" behindDoc="0" distB="0" distT="0" distL="114300" distR="114300" hidden="0" layoutInCell="1" locked="0" relativeHeight="0" simplePos="0">
-            <wp:simplePos x="0" y="0"/>
-            <wp:positionH relativeFrom="column">
-              <wp:posOffset>3027459</wp:posOffset>
-            </wp:positionH>
-            <wp:positionV relativeFrom="paragraph">
-              <wp:posOffset>-7122</wp:posOffset>
-            </wp:positionV>
-            <wp:extent cx="803082" cy="803082"/>
-            <wp:effectExtent b="0" l="0" r="0" t="0"/>
-            <wp:wrapNone/>
-            <wp:docPr descr="A stop sign&#10;&#10;Description automatically generated" id="1073741838" name="image2.png"/>
-            <a:graphic>
-              <a:graphicData uri="http://schemas.openxmlformats.org/drawingml/2006/picture">
-                <pic:pic>
-                  <pic:nvPicPr>
-                    <pic:cNvPr descr="A stop sign&#10;&#10;Description automatically generated" id="0" name="image2.png"/>
-                    <pic:cNvPicPr preferRelativeResize="0"/>
-                  </pic:nvPicPr>
-                  <pic:blipFill>
-                    <a:blip r:embed="rId10"/>
-                    <a:srcRect b="0" l="0" r="0" t="0"/>
-                    <a:stretch>
-                      <a:fillRect/>
-                    </a:stretch>
-                  </pic:blipFill>
-                  <pic:spPr>
-                    <a:xfrm>
-                      <a:off x="0" y="0"/>
-                      <a:ext cx="803082" cy="803082"/>
-                    </a:xfrm>
-                    <a:prstGeom prst="rect"/>
-                    <a:ln/>
-                  </pic:spPr>
-                </pic:pic>
-              </a:graphicData>
-            </a:graphic>
-          </wp:anchor>
-        </w:drawing>
-      </w:r>
-    </w:p>
-    <w:p>
-      <w:pPr>
-        <w:rPr>
-          <w:rFonts w:ascii="Arial" w:cs="Arial" w:eastAsia="Arial" w:hAnsi="Arial"/>
-          <w:b w:val="1"/>
-          <w:bCs w:val="1"/>
-          <w:color w:val="000000"/>
-          <w:sz w:val="60"/>
-          <w:szCs w:val="60"/>
-        </w:rPr>
-      </w:pPr>
-      <w:r>
-        <w:rPr>
-          <w:rtl w:val="0"/>
-        </w:rPr>
-      </w:r>
-    </w:p>
-    <w:p>
-      <w:pPr>
-        <w:rPr>
-          <w:rFonts w:ascii="Arial" w:cs="Arial" w:eastAsia="Arial" w:hAnsi="Arial"/>
-          <w:b w:val="1"/>
-          <w:bCs w:val="1"/>
-          <w:color w:val="000000"/>
-          <w:sz w:val="60"/>
-          <w:szCs w:val="60"/>
-        </w:rPr>
-      </w:pPr>
-      <w:r>
-        <w:rPr>
-          <w:rtl w:val="0"/>
-        </w:rPr>
-      </w:r>
-    </w:p>
-    <w:p>
-      <w:pPr>
-        <w:jc w:val="center"/>
-        <w:rPr/>
-      </w:pPr>
-      <w:r>
-        <w:rPr>
-          <w:rFonts w:ascii="Arial" w:cs="Arial" w:eastAsia="Arial" w:hAnsi="Arial"/>
-          <w:b w:val="1"/>
-          <w:bCs w:val="1"/>
-          <w:color w:val="000000"/>
-          <w:sz w:val="60"/>
-          <w:szCs w:val="60"/>
-          <w:rtl w:val="0"/>
-        </w:rPr>
-        <w:t xml:space="preserve">INVOICE PROCESS</w:t>
-      </w:r>
-      <w:r>
-        <w:rPr>
-          <w:rtl w:val="0"/>
-        </w:rPr>
-      </w:r>
-    </w:p>
-    <w:p>
-      <w:pPr>
-        <w:spacing w:before="200" w:lineRule="auto"/>
-        <w:rPr>
-          <w:rFonts w:ascii="Open Sans" w:cs="Open Sans" w:eastAsia="Open Sans" w:hAnsi="Open Sans"/>
-          <w:b w:val="1"/>
-          <w:bCs w:val="1"/>
-          <w:color w:val="000000"/>
-        </w:rPr>
-      </w:pPr>
-      <w:r>
-        <w:rPr>
-          <w:rtl w:val="0"/>
-        </w:rPr>
-      </w:r>
-      <w:r>
-        <mc:AlternateContent>
-          <mc:Choice Requires="wpg">
-            <w:drawing>
-              <wp:anchor allowOverlap="1" behindDoc="0" distB="0" distT="0" distL="114300" distR="114300" hidden="0" layoutInCell="1" locked="0" relativeHeight="0" simplePos="0">
-                <wp:simplePos x="0" y="0"/>
-                <wp:positionH relativeFrom="column">
-                  <wp:posOffset>179428</wp:posOffset>
-                </wp:positionH>
-                <wp:positionV relativeFrom="paragraph">
-                  <wp:posOffset>113665</wp:posOffset>
-                </wp:positionV>
-                <wp:extent cx="6263971" cy="61954"/>
-                <wp:effectExtent b="0" l="0" r="0" t="0"/>
-                <wp:wrapNone/>
-                <wp:docPr id="1073741831" name=""/>
-                <a:graphic>
-                  <a:graphicData uri="http://schemas.microsoft.com/office/word/2010/wordprocessingShape">
-                    <wps:wsp>
-                      <wps:cNvCnPr/>
-                      <wps:spPr>
-                        <a:xfrm flipH="1" rot="10800000">
-                          <a:off x="2233065" y="3768073"/>
-                          <a:ext cx="6225871" cy="23854"/>
-                        </a:xfrm>
-                        <a:prstGeom prst="straightConnector1">
-                          <a:avLst/>
-                        </a:prstGeom>
-                        <a:noFill/>
-                        <a:ln cap="flat" cmpd="sng" w="38100">
-                          <a:solidFill>
-                            <a:srgbClr val="C00000"/>
-                          </a:solidFill>
-                          <a:prstDash val="solid"/>
-                          <a:round/>
-                          <a:headEnd len="sm" w="sm" type="none"/>
-                          <a:tailEnd len="sm" w="sm" type="none"/>
-                        </a:ln>
-                      </wps:spPr>
-                      <wps:bodyPr anchorCtr="0" anchor="ctr" bIns="91425" lIns="91425" spcFirstLastPara="1" rIns="91425" wrap="square" tIns="91425">
-                        <a:noAutofit/>
-                      </wps:bodyPr>
-                    </wps:wsp>
-                  </a:graphicData>
-                </a:graphic>
-              </wp:anchor>
-            </w:drawing>
-          </mc:Choice>
-          <mc:Fallback>
-            <w:drawing>
-              <wp:anchor allowOverlap="1" behindDoc="0" distB="0" distT="0" distL="114300" distR="114300" hidden="0" layoutInCell="1" locked="0" relativeHeight="0" simplePos="0">
-                <wp:simplePos x="0" y="0"/>
-                <wp:positionH relativeFrom="column">
-                  <wp:posOffset>179428</wp:posOffset>
-                </wp:positionH>
-                <wp:positionV relativeFrom="paragraph">
-                  <wp:posOffset>113665</wp:posOffset>
-                </wp:positionV>
-                <wp:extent cx="6263971" cy="61954"/>
-                <wp:effectExtent b="0" l="0" r="0" t="0"/>
-                <wp:wrapNone/>
-                <wp:docPr id="1073741831" name="image4.png"/>
-                <a:graphic>
-                  <a:graphicData uri="http://schemas.openxmlformats.org/drawingml/2006/picture">
-                    <pic:pic>
-                      <pic:nvPicPr>
-                        <pic:cNvPr id="0" name="image4.png"/>
-                        <pic:cNvPicPr preferRelativeResize="0"/>
-                      </pic:nvPicPr>
-                      <pic:blipFill>
-                        <a:blip r:embed="rId8"/>
-                        <a:srcRect/>
-                        <a:stretch>
-                          <a:fillRect/>
-                        </a:stretch>
-                      </pic:blipFill>
-                      <pic:spPr>
-                        <a:xfrm>
-                          <a:off x="0" y="0"/>
-                          <a:ext cx="6263971" cy="61954"/>
-                        </a:xfrm>
-                        <a:prstGeom prst="rect"/>
-                        <a:ln/>
-                      </pic:spPr>
-                    </pic:pic>
-                  </a:graphicData>
-                </a:graphic>
-              </wp:anchor>
-            </w:drawing>
-          </mc:Fallback>
-        </mc:AlternateContent>
-      </w:r>
-    </w:p>
-    <w:p>
-      <w:pPr>
-        <w:spacing w:before="200" w:lineRule="auto"/>
-        <w:rPr>
-          <w:sz w:val="22"/>
-          <w:szCs w:val="22"/>
-        </w:rPr>
-      </w:pPr>
-      <w:r>
-        <w:rPr>
-          <w:color w:val="000000"/>
-          <w:sz w:val="22"/>
-          <w:szCs w:val="22"/>
-          <w:rtl w:val="0"/>
-        </w:rPr>
-        <w:t xml:space="preserve">We are excited to know that you will be joining our LATINOS IN ACTION Familia and look forward to working with you! Once you have reviewed and signed the attached MOU, we will email you an invoice with the fees that were agreed upon. In order to understand and follow your district’s invoicing process, please provide the following information:</w:t>
-      </w:r>
-      <w:r>
-        <w:rPr>
-          <w:rtl w:val="0"/>
-        </w:rPr>
-      </w:r>
-    </w:p>
-    <w:p>
-      <w:pPr>
-        <w:numPr>
-          <w:ilvl w:val="0"/>
-          <w:numId w:val="20"/>
-        </w:numPr>
-        <w:pBdr>
-          <w:top w:color="000000" w:space="0" w:sz="0" w:val="none"/>
-          <w:left w:color="000000" w:space="0" w:sz="0" w:val="none"/>
-          <w:bottom w:color="000000" w:space="0" w:sz="0" w:val="none"/>
-          <w:right w:color="000000" w:space="0" w:sz="0" w:val="none"/>
-          <w:between w:color="000000" w:space="0" w:sz="0" w:val="none"/>
-        </w:pBdr>
-        <w:spacing w:before="200" w:lineRule="auto"/>
-        <w:ind w:left="720" w:hanging="360"/>
-        <w:rPr>
-          <w:color w:val="000000"/>
-        </w:rPr>
-      </w:pPr>
-      <w:r>
-        <w:rPr>
-          <w:b w:val="1"/>
-          <w:bCs w:val="1"/>
-          <w:color w:val="000000"/>
-          <w:sz w:val="22"/>
-          <w:szCs w:val="22"/>
-          <w:rtl w:val="0"/>
-        </w:rPr>
-        <w:t xml:space="preserve">Do you need to create a Purchase Order Number?   If so, </w:t>
-      </w:r>
-      <w:r>
-        <w:rPr>
-          <w:rtl w:val="0"/>
-        </w:rPr>
-      </w:r>
-    </w:p>
-    <w:p>
-      <w:pPr>
-        <w:spacing w:before="200" w:lineRule="auto"/>
-        <w:ind w:left="720" w:firstLine="0"/>
-        <w:rPr>
-          <w:color w:val="000000"/>
-          <w:sz w:val="22"/>
-          <w:szCs w:val="22"/>
-        </w:rPr>
-      </w:pPr>
-      <w:r>
-        <w:rPr>
-          <w:color w:val="000000"/>
-          <w:sz w:val="22"/>
-          <w:szCs w:val="22"/>
-          <w:rtl w:val="0"/>
-        </w:rPr>
-        <w:t xml:space="preserve"> </w:t>
-      </w:r>
-    </w:p>
-    <w:p>
-      <w:pPr>
-        <w:numPr>
-          <w:ilvl w:val="1"/>
-          <w:numId w:val="20"/>
-        </w:numPr>
-        <w:pBdr>
-          <w:top w:color="000000" w:space="0" w:sz="0" w:val="none"/>
-          <w:left w:color="000000" w:space="0" w:sz="0" w:val="none"/>
-          <w:bottom w:color="000000" w:space="0" w:sz="0" w:val="none"/>
-          <w:right w:color="000000" w:space="0" w:sz="0" w:val="none"/>
-          <w:between w:color="000000" w:space="0" w:sz="0" w:val="none"/>
-        </w:pBdr>
-        <w:ind w:left="1440" w:hanging="360"/>
-        <w:rPr>
-          <w:color w:val="000000"/>
-        </w:rPr>
-      </w:pPr>
-      <w:r>
-        <w:rPr>
-          <w:color w:val="000000"/>
-          <w:sz w:val="22"/>
-          <w:szCs w:val="22"/>
-          <w:rtl w:val="0"/>
-        </w:rPr>
-        <w:t xml:space="preserve">Name of person who receives quote to process PO# ______________________________________________</w:t>
-      </w:r>
-    </w:p>
-    <w:p>
-      <w:pPr>
-        <w:ind w:left="1440" w:firstLine="0"/>
-        <w:rPr>
-          <w:color w:val="000000"/>
-          <w:sz w:val="22"/>
-          <w:szCs w:val="22"/>
-        </w:rPr>
-      </w:pPr>
-      <w:r>
-        <w:rPr>
-          <w:rtl w:val="0"/>
-        </w:rPr>
-      </w:r>
-    </w:p>
-    <w:p>
-      <w:pPr>
-        <w:numPr>
-          <w:ilvl w:val="1"/>
-          <w:numId w:val="20"/>
-        </w:numPr>
-        <w:pBdr>
-          <w:top w:color="000000" w:space="0" w:sz="0" w:val="none"/>
-          <w:left w:color="000000" w:space="0" w:sz="0" w:val="none"/>
-          <w:bottom w:color="000000" w:space="0" w:sz="0" w:val="none"/>
-          <w:right w:color="000000" w:space="0" w:sz="0" w:val="none"/>
-          <w:between w:color="000000" w:space="0" w:sz="0" w:val="none"/>
-        </w:pBdr>
-        <w:ind w:left="1440" w:hanging="360"/>
-        <w:rPr>
-          <w:color w:val="000000"/>
-        </w:rPr>
-      </w:pPr>
-      <w:r>
-        <w:rPr>
-          <w:color w:val="000000"/>
-          <w:sz w:val="22"/>
-          <w:szCs w:val="22"/>
-          <w:rtl w:val="0"/>
-        </w:rPr>
-        <w:t xml:space="preserve">Email: ________________________________________</w:t>
-      </w:r>
-    </w:p>
-    <w:p>
-      <w:pPr>
-        <w:rPr>
-          <w:color w:val="000000"/>
-          <w:sz w:val="22"/>
-          <w:szCs w:val="22"/>
-        </w:rPr>
-      </w:pPr>
-      <w:r>
-        <w:rPr>
-          <w:rtl w:val="0"/>
-        </w:rPr>
-      </w:r>
-    </w:p>
-    <w:p>
-      <w:pPr>
-        <w:numPr>
-          <w:ilvl w:val="1"/>
-          <w:numId w:val="20"/>
-        </w:numPr>
-        <w:pBdr>
-          <w:top w:color="000000" w:space="0" w:sz="0" w:val="none"/>
-          <w:left w:color="000000" w:space="0" w:sz="0" w:val="none"/>
-          <w:bottom w:color="000000" w:space="0" w:sz="0" w:val="none"/>
-          <w:right w:color="000000" w:space="0" w:sz="0" w:val="none"/>
-          <w:between w:color="000000" w:space="0" w:sz="0" w:val="none"/>
-        </w:pBdr>
-        <w:ind w:left="1440" w:hanging="360"/>
-        <w:rPr>
-          <w:color w:val="000000"/>
-        </w:rPr>
-      </w:pPr>
-      <w:r>
-        <w:rPr>
-          <w:color w:val="000000"/>
-          <w:sz w:val="22"/>
-          <w:szCs w:val="22"/>
-          <w:rtl w:val="0"/>
-        </w:rPr>
-        <w:t xml:space="preserve">Contact Number: ________________________________</w:t>
-      </w:r>
-    </w:p>
-    <w:p>
-      <w:pPr>
-        <w:keepNext w:val="0"/>
-        <w:keepLines w:val="0"/>
-        <w:pageBreakBefore w:val="0"/>
-        <w:widowControl w:val="1"/>
-        <w:pBdr>
-          <w:top w:color="000000" w:space="0" w:sz="0" w:val="none"/>
-          <w:left w:color="000000" w:space="0" w:sz="0" w:val="none"/>
-          <w:bottom w:color="000000" w:space="0" w:sz="0" w:val="none"/>
-          <w:right w:color="000000" w:space="0" w:sz="0" w:val="none"/>
-          <w:between w:color="000000" w:space="0" w:sz="0" w:val="none"/>
-        </w:pBdr>
-        <w:shd w:fill="auto" w:val="clear"/>
-        <w:spacing w:after="160" w:before="0" w:line="259" w:lineRule="auto"/>
-        <w:ind w:left="720" w:right="0" w:firstLine="0"/>
-        <w:jc w:val="left"/>
-        <w:rPr>
-          <w:rFonts w:ascii="Times New Roman" w:cs="Times New Roman" w:eastAsia="Times New Roman" w:hAnsi="Times New Roman"/>
-          <w:b w:val="0"/>
-          <w:bCs w:val="0"/>
-          <w:i w:val="0"/>
-          <w:iCs w:val="0"/>
-          <w:smallCaps w:val="0"/>
-          <w:strike w:val="0"/>
-          <w:color w:val="000000"/>
-          <w:sz w:val="22"/>
-          <w:szCs w:val="22"/>
-          <w:u w:val="none"/>
-          <w:shd w:fill="auto" w:val="clear"/>
-          <w:vertAlign w:val="baseline"/>
-        </w:rPr>
-      </w:pPr>
-      <w:r>
-        <w:rPr>
-          <w:rtl w:val="0"/>
-        </w:rPr>
-      </w:r>
-    </w:p>
-    <w:p>
-      <w:pPr>
-        <w:ind w:left="1440" w:firstLine="0"/>
-        <w:rPr>
-          <w:color w:val="000000"/>
-          <w:sz w:val="22"/>
-          <w:szCs w:val="22"/>
-        </w:rPr>
-      </w:pPr>
-      <w:r>
-        <w:rPr>
-          <w:rtl w:val="0"/>
-        </w:rPr>
-      </w:r>
-    </w:p>
-    <w:p>
-      <w:pPr>
-        <w:keepNext w:val="0"/>
-        <w:keepLines w:val="0"/>
-        <w:pageBreakBefore w:val="0"/>
-        <w:widowControl w:val="1"/>
-        <w:numPr>
-          <w:ilvl w:val="0"/>
-          <w:numId w:val="20"/>
-        </w:numPr>
-        <w:pBdr>
-          <w:top w:color="000000" w:space="0" w:sz="0" w:val="none"/>
-          <w:left w:color="000000" w:space="0" w:sz="0" w:val="none"/>
-          <w:bottom w:color="000000" w:space="0" w:sz="0" w:val="none"/>
-          <w:right w:color="000000" w:space="0" w:sz="0" w:val="none"/>
-          <w:between w:color="000000" w:space="0" w:sz="0" w:val="none"/>
-        </w:pBdr>
-        <w:shd w:fill="auto" w:val="clear"/>
-        <w:spacing w:after="0" w:before="0" w:line="240" w:lineRule="auto"/>
-        <w:ind w:left="720" w:right="0" w:hanging="360"/>
-        <w:jc w:val="left"/>
-        <w:rPr>
-          <w:b w:val="0"/>
-          <w:bCs w:val="0"/>
-          <w:i w:val="0"/>
-          <w:iCs w:val="0"/>
-          <w:smallCaps w:val="0"/>
-          <w:strike w:val="0"/>
-          <w:color w:val="000000"/>
-          <w:u w:val="none"/>
-          <w:shd w:fill="auto" w:val="clear"/>
-          <w:vertAlign w:val="baseline"/>
-        </w:rPr>
-      </w:pPr>
-      <w:r>
-        <w:rPr>
-          <w:rFonts w:ascii="Times New Roman" w:cs="Times New Roman" w:eastAsia="Times New Roman" w:hAnsi="Times New Roman"/>
-          <w:b w:val="0"/>
-          <w:bCs w:val="0"/>
-          <w:i w:val="0"/>
-          <w:iCs w:val="0"/>
-          <w:smallCaps w:val="0"/>
-          <w:strike w:val="0"/>
-          <w:color w:val="000000"/>
-          <w:sz w:val="22"/>
-          <w:szCs w:val="22"/>
-          <w:u w:val="none"/>
-          <w:shd w:fill="auto" w:val="clear"/>
-          <w:vertAlign w:val="baseline"/>
-          <w:rtl w:val="0"/>
-        </w:rPr>
-        <w:t xml:space="preserve">Please provide what is needed on the quote to process PO #</w:t>
-      </w:r>
-    </w:p>
-    <w:p>
-      <w:pPr>
-        <w:rPr>
-          <w:color w:val="000000"/>
-          <w:sz w:val="22"/>
-          <w:szCs w:val="22"/>
-        </w:rPr>
-      </w:pPr>
-      <w:r>
-        <w:rPr>
-          <w:rtl w:val="0"/>
-        </w:rPr>
-      </w:r>
-    </w:p>
-    <w:p>
-      <w:pPr>
-        <w:rPr>
-          <w:color w:val="000000"/>
-          <w:sz w:val="22"/>
-          <w:szCs w:val="22"/>
-        </w:rPr>
-      </w:pPr>
-      <w:r>
-        <w:rPr>
-          <w:rtl w:val="0"/>
-        </w:rPr>
-      </w:r>
-    </w:p>
-    <w:p>
-      <w:pPr>
-        <w:ind w:left="1440" w:firstLine="0"/>
-        <w:rPr>
-          <w:color w:val="000000"/>
-          <w:sz w:val="22"/>
-          <w:szCs w:val="22"/>
-        </w:rPr>
-      </w:pPr>
-      <w:r>
-        <w:rPr>
-          <w:rtl w:val="0"/>
-        </w:rPr>
-      </w:r>
-    </w:p>
-    <w:p>
-      <w:pPr>
-        <w:numPr>
-          <w:ilvl w:val="0"/>
-          <w:numId w:val="20"/>
-        </w:numPr>
-        <w:pBdr>
-          <w:top w:color="000000" w:space="0" w:sz="0" w:val="none"/>
-          <w:left w:color="000000" w:space="0" w:sz="0" w:val="none"/>
-          <w:bottom w:color="000000" w:space="0" w:sz="0" w:val="none"/>
-          <w:right w:color="000000" w:space="0" w:sz="0" w:val="none"/>
-          <w:between w:color="000000" w:space="0" w:sz="0" w:val="none"/>
-        </w:pBdr>
-        <w:ind w:left="720" w:hanging="360"/>
-        <w:rPr>
-          <w:b w:val="1"/>
-          <w:bCs w:val="1"/>
-          <w:color w:val="000000"/>
-        </w:rPr>
-      </w:pPr>
-      <w:r>
-        <w:rPr>
-          <w:b w:val="1"/>
-          <w:bCs w:val="1"/>
-          <w:color w:val="000000"/>
-          <w:sz w:val="22"/>
-          <w:szCs w:val="22"/>
-          <w:rtl w:val="0"/>
-        </w:rPr>
-        <w:t xml:space="preserve">If you don’t need a PO, who do we email invoice to?</w:t>
-      </w:r>
-    </w:p>
-    <w:p>
-      <w:pPr>
-        <w:rPr>
-          <w:color w:val="000000"/>
-          <w:sz w:val="22"/>
-          <w:szCs w:val="22"/>
-        </w:rPr>
-      </w:pPr>
-      <w:r>
-        <w:rPr>
-          <w:rtl w:val="0"/>
-        </w:rPr>
-      </w:r>
-    </w:p>
-    <w:p>
-      <w:pPr>
-        <w:numPr>
-          <w:ilvl w:val="1"/>
-          <w:numId w:val="20"/>
-        </w:numPr>
-        <w:pBdr>
-          <w:top w:color="000000" w:space="0" w:sz="0" w:val="none"/>
-          <w:left w:color="000000" w:space="0" w:sz="0" w:val="none"/>
-          <w:bottom w:color="000000" w:space="0" w:sz="0" w:val="none"/>
-          <w:right w:color="000000" w:space="0" w:sz="0" w:val="none"/>
-          <w:between w:color="000000" w:space="0" w:sz="0" w:val="none"/>
-        </w:pBdr>
-        <w:ind w:left="1440" w:hanging="360"/>
-        <w:rPr>
-          <w:color w:val="000000"/>
-        </w:rPr>
-      </w:pPr>
-      <w:r>
-        <w:rPr>
-          <w:color w:val="000000"/>
-          <w:sz w:val="22"/>
-          <w:szCs w:val="22"/>
-          <w:rtl w:val="0"/>
-        </w:rPr>
-        <w:t xml:space="preserve">Name of person who receives invoice</w:t>
-      </w:r>
-    </w:p>
-    <w:p>
-      <w:pPr>
-        <w:pBdr>
-          <w:top w:color="000000" w:space="0" w:sz="0" w:val="none"/>
-          <w:left w:color="000000" w:space="0" w:sz="0" w:val="none"/>
-          <w:bottom w:color="000000" w:space="0" w:sz="0" w:val="none"/>
-          <w:right w:color="000000" w:space="0" w:sz="0" w:val="none"/>
-          <w:between w:color="000000" w:space="0" w:sz="0" w:val="none"/>
-        </w:pBdr>
-        <w:ind w:left="1440" w:firstLine="0"/>
-        <w:rPr>
-          <w:color w:val="000000"/>
-          <w:sz w:val="22"/>
-          <w:szCs w:val="22"/>
-        </w:rPr>
-      </w:pPr>
-      <w:r>
-        <w:rPr>
-          <w:color w:val="000000"/>
-          <w:sz w:val="22"/>
-          <w:szCs w:val="22"/>
-          <w:rtl w:val="0"/>
-        </w:rPr>
-        <w:t xml:space="preserve"> _______________________________________________</w:t>
-      </w:r>
-    </w:p>
-    <w:p>
-      <w:pPr>
-        <w:ind w:left="1440" w:firstLine="0"/>
-        <w:rPr>
-          <w:color w:val="000000"/>
-          <w:sz w:val="22"/>
-          <w:szCs w:val="22"/>
-        </w:rPr>
-      </w:pPr>
-      <w:r>
-        <w:rPr>
-          <w:rtl w:val="0"/>
-        </w:rPr>
-      </w:r>
-    </w:p>
-    <w:p>
-      <w:pPr>
-        <w:numPr>
-          <w:ilvl w:val="1"/>
-          <w:numId w:val="20"/>
-        </w:numPr>
-        <w:pBdr>
-          <w:top w:color="000000" w:space="0" w:sz="0" w:val="none"/>
-          <w:left w:color="000000" w:space="0" w:sz="0" w:val="none"/>
-          <w:bottom w:color="000000" w:space="0" w:sz="0" w:val="none"/>
-          <w:right w:color="000000" w:space="0" w:sz="0" w:val="none"/>
-          <w:between w:color="000000" w:space="0" w:sz="0" w:val="none"/>
-        </w:pBdr>
-        <w:ind w:left="1440" w:hanging="360"/>
-        <w:rPr>
-          <w:color w:val="000000"/>
-        </w:rPr>
-      </w:pPr>
-      <w:r>
-        <w:rPr>
-          <w:color w:val="000000"/>
-          <w:sz w:val="22"/>
-          <w:szCs w:val="22"/>
-          <w:rtl w:val="0"/>
-        </w:rPr>
-        <w:t xml:space="preserve">Email: _________________________________________</w:t>
-      </w:r>
-    </w:p>
-    <w:p>
-      <w:pPr>
-        <w:rPr>
-          <w:color w:val="000000"/>
-          <w:sz w:val="22"/>
-          <w:szCs w:val="22"/>
-        </w:rPr>
-      </w:pPr>
-      <w:r>
-        <w:rPr>
-          <w:rtl w:val="0"/>
-        </w:rPr>
-      </w:r>
-    </w:p>
-    <w:p>
-      <w:pPr>
-        <w:numPr>
-          <w:ilvl w:val="1"/>
-          <w:numId w:val="20"/>
-        </w:numPr>
-        <w:pBdr>
-          <w:top w:color="000000" w:space="0" w:sz="0" w:val="none"/>
-          <w:left w:color="000000" w:space="0" w:sz="0" w:val="none"/>
-          <w:bottom w:color="000000" w:space="0" w:sz="0" w:val="none"/>
-          <w:right w:color="000000" w:space="0" w:sz="0" w:val="none"/>
-          <w:between w:color="000000" w:space="0" w:sz="0" w:val="none"/>
-        </w:pBdr>
-        <w:ind w:left="1440" w:hanging="360"/>
-        <w:rPr>
-          <w:color w:val="000000"/>
-        </w:rPr>
-      </w:pPr>
-      <w:r>
-        <w:rPr>
-          <w:color w:val="000000"/>
-          <w:sz w:val="22"/>
-          <w:szCs w:val="22"/>
-          <w:rtl w:val="0"/>
-        </w:rPr>
-        <w:t xml:space="preserve">Contact Number: _________________________________</w:t>
-      </w:r>
-    </w:p>
-    <w:p>
-      <w:pPr>
-        <w:rPr>
-          <w:color w:val="000000"/>
-          <w:sz w:val="22"/>
-          <w:szCs w:val="22"/>
-        </w:rPr>
-      </w:pPr>
-      <w:r>
-        <w:rPr>
-          <w:rtl w:val="0"/>
-        </w:rPr>
-      </w:r>
-    </w:p>
-    <w:p>
-      <w:pPr>
-        <w:numPr>
-          <w:ilvl w:val="0"/>
-          <w:numId w:val="20"/>
-        </w:numPr>
-        <w:pBdr>
-          <w:top w:color="000000" w:space="0" w:sz="0" w:val="none"/>
-          <w:left w:color="000000" w:space="0" w:sz="0" w:val="none"/>
-          <w:bottom w:color="000000" w:space="0" w:sz="0" w:val="none"/>
-          <w:right w:color="000000" w:space="0" w:sz="0" w:val="none"/>
-          <w:between w:color="000000" w:space="0" w:sz="0" w:val="none"/>
-        </w:pBdr>
-        <w:ind w:left="720" w:hanging="360"/>
-        <w:rPr>
-          <w:b w:val="1"/>
-          <w:bCs w:val="1"/>
-          <w:color w:val="000000"/>
-        </w:rPr>
-      </w:pPr>
-      <w:r>
-        <w:rPr>
-          <w:b w:val="1"/>
-          <w:bCs w:val="1"/>
-          <w:color w:val="000000"/>
-          <w:sz w:val="22"/>
-          <w:szCs w:val="22"/>
-          <w:rtl w:val="0"/>
-        </w:rPr>
-        <w:t xml:space="preserve">Do we need to become/apply to be a vendor? If so, </w:t>
-      </w:r>
-    </w:p>
-    <w:p>
-      <w:pPr>
-        <w:rPr>
-          <w:color w:val="000000"/>
-          <w:sz w:val="22"/>
-          <w:szCs w:val="22"/>
-        </w:rPr>
-      </w:pPr>
-      <w:r>
-        <w:rPr>
-          <w:rtl w:val="0"/>
-        </w:rPr>
-      </w:r>
-    </w:p>
-    <w:p>
-      <w:pPr>
-        <w:keepNext w:val="0"/>
-        <w:keepLines w:val="0"/>
-        <w:pageBreakBefore w:val="0"/>
-        <w:widowControl w:val="1"/>
-        <w:numPr>
-          <w:ilvl w:val="0"/>
-          <w:numId w:val="21"/>
-        </w:numPr>
-        <w:pBdr>
-          <w:top w:color="000000" w:space="0" w:sz="0" w:val="none"/>
-          <w:left w:color="000000" w:space="0" w:sz="0" w:val="none"/>
-          <w:bottom w:color="000000" w:space="0" w:sz="0" w:val="none"/>
-          <w:right w:color="000000" w:space="0" w:sz="0" w:val="none"/>
-          <w:between w:color="000000" w:space="0" w:sz="0" w:val="none"/>
-        </w:pBdr>
-        <w:shd w:fill="auto" w:val="clear"/>
-        <w:spacing w:after="0" w:before="0" w:line="240" w:lineRule="auto"/>
-        <w:ind w:left="1080" w:right="0" w:hanging="360"/>
-        <w:jc w:val="left"/>
-        <w:rPr>
-          <w:b w:val="0"/>
-          <w:bCs w:val="0"/>
-          <w:i w:val="0"/>
-          <w:iCs w:val="0"/>
-          <w:smallCaps w:val="0"/>
-          <w:strike w:val="0"/>
-          <w:color w:val="000000"/>
-          <w:sz w:val="22"/>
-          <w:szCs w:val="22"/>
-          <w:u w:val="none"/>
-          <w:shd w:fill="auto" w:val="clear"/>
-          <w:vertAlign w:val="baseline"/>
-        </w:rPr>
-      </w:pPr>
-      <w:r>
-        <w:rPr>
-          <w:rFonts w:ascii="Times New Roman" w:cs="Times New Roman" w:eastAsia="Times New Roman" w:hAnsi="Times New Roman"/>
-          <w:b w:val="0"/>
-          <w:bCs w:val="0"/>
-          <w:i w:val="0"/>
-          <w:iCs w:val="0"/>
-          <w:smallCaps w:val="0"/>
-          <w:strike w:val="0"/>
-          <w:color w:val="000000"/>
-          <w:sz w:val="22"/>
-          <w:szCs w:val="22"/>
-          <w:u w:val="none"/>
-          <w:shd w:fill="auto" w:val="clear"/>
-          <w:vertAlign w:val="baseline"/>
-          <w:rtl w:val="0"/>
-        </w:rPr>
-        <w:t xml:space="preserve">Please provide required forms/documents </w:t>
-      </w:r>
-    </w:p>
-    <w:p>
-      <w:pPr>
-        <w:rPr>
-          <w:color w:val="000000"/>
-          <w:sz w:val="22"/>
-          <w:szCs w:val="22"/>
-        </w:rPr>
-      </w:pPr>
-      <w:r>
-        <w:rPr>
-          <w:rtl w:val="0"/>
-        </w:rPr>
-      </w:r>
-    </w:p>
-    <w:p>
-      <w:pPr>
-        <w:rPr>
-          <w:b w:val="1"/>
-          <w:bCs w:val="1"/>
-          <w:i w:val="1"/>
-          <w:iCs w:val="1"/>
-          <w:color w:val="000000"/>
-          <w:sz w:val="22"/>
-          <w:szCs w:val="22"/>
-        </w:rPr>
-      </w:pPr>
-      <w:r>
-        <w:rPr>
-          <w:b w:val="1"/>
-          <w:bCs w:val="1"/>
-          <w:i w:val="1"/>
-          <w:iCs w:val="1"/>
-          <w:color w:val="000000"/>
-          <w:sz w:val="22"/>
-          <w:szCs w:val="22"/>
-          <w:rtl w:val="0"/>
-        </w:rPr>
-        <w:t xml:space="preserve">Email form to: Robert Herrera at robert@latinosinaction.org</w:t>
-      </w:r>
-    </w:p>
-    <w:p>
-      <w:pPr>
-        <w:rPr>
-          <w:color w:val="000000"/>
-          <w:sz w:val="22"/>
-          <w:szCs w:val="22"/>
-        </w:rPr>
-      </w:pPr>
-      <w:r>
-        <w:rPr>
-          <w:rtl w:val="0"/>
-        </w:rPr>
-      </w:r>
-    </w:p>
-    <w:p>
-      <w:pPr>
-        <w:rPr>
-          <w:color w:val="000000"/>
-          <w:sz w:val="22"/>
-          <w:szCs w:val="22"/>
-        </w:rPr>
-      </w:pPr>
-      <w:r>
-        <w:rPr>
-          <w:rtl w:val="0"/>
-        </w:rPr>
-      </w:r>
-    </w:p>
-    <w:p>
-      <w:pPr>
-        <w:rPr>
-          <w:color w:val="000000"/>
-          <w:sz w:val="22"/>
-          <w:szCs w:val="22"/>
-        </w:rPr>
-      </w:pPr>
-      <w:r>
-        <w:rPr>
-          <w:color w:val="000000"/>
-          <w:sz w:val="22"/>
-          <w:szCs w:val="22"/>
-          <w:rtl w:val="0"/>
-        </w:rPr>
-        <w:t xml:space="preserve">Muchas Gracias, </w:t>
-      </w:r>
-    </w:p>
-    <w:p>
-      <w:pPr>
-        <w:rPr>
-          <w:color w:val="000000"/>
-          <w:sz w:val="22"/>
-          <w:szCs w:val="22"/>
-        </w:rPr>
-      </w:pPr>
-      <w:r>
-        <w:rPr>
-          <w:color w:val="000000"/>
-          <w:sz w:val="22"/>
-          <w:szCs w:val="22"/>
-          <w:rtl w:val="0"/>
-        </w:rPr>
-        <w:t xml:space="preserve">LATINOS IN ACTION</w:t>
+        </w:rPr>
+        <w:t>Muchas gracias,</w:t>
+        <w:br/>
+        <w:t>LATINOS IN ACTION</w:t>
       </w:r>
     </w:p>
     <w:sectPr>
       <w:headerReference r:id="rId11" w:type="default"/>
       <w:footerReference r:id="rId12" w:type="default"/>
+      <w:footerReference w:type="first" r:id="rId13"/>
+      <w:footerReference w:type="even" r:id="rId14"/>
       <w:pgSz w:h="15840" w:w="12240" w:orient="portrait"/>
       <w:pgMar w:bottom="720" w:top="720" w:left="720" w:right="720" w:header="360" w:footer="360"/>
       <w:pgNumType w:start="1"/>
@@ -11255,92 +11102,26 @@
         <w:vertAlign w:val="baseline"/>
       </w:rPr>
     </w:pPr>
-    <w:r>
-      <w:rPr>
-        <w:rFonts w:ascii="Arimo" w:cs="Arimo" w:eastAsia="Arimo" w:hAnsi="Arimo"/>
-        <w:b w:val="0"/>
-        <w:bCs w:val="0"/>
-        <w:i w:val="0"/>
-        <w:iCs w:val="0"/>
-        <w:smallCaps w:val="0"/>
-        <w:strike w:val="0"/>
-        <w:color w:val="000000"/>
-        <w:sz w:val="20"/>
-        <w:szCs w:val="20"/>
-        <w:u w:val="none"/>
-        <w:shd w:fill="auto" w:val="clear"/>
-        <w:vertAlign w:val="baseline"/>
-        <w:rtl w:val="0"/>
-      </w:rPr>
-      <w:tab/>
-      <w:tab/>
-    </w:r>
-    <w:r>
-      <w:rPr>
-        <w:rFonts w:ascii="Helvetica Neue" w:cs="Helvetica Neue" w:eastAsia="Helvetica Neue" w:hAnsi="Helvetica Neue"/>
-        <w:b w:val="0"/>
-        <w:bCs w:val="0"/>
-        <w:i w:val="0"/>
-        <w:iCs w:val="0"/>
-        <w:smallCaps w:val="0"/>
-        <w:strike w:val="0"/>
-        <w:color w:val="000000"/>
-        <w:sz w:val="20"/>
-        <w:szCs w:val="20"/>
-        <w:u w:val="none"/>
-        <w:shd w:fill="auto" w:val="clear"/>
-        <w:vertAlign w:val="baseline"/>
-      </w:rPr>
-      <w:fldChar w:fldCharType="begin"/>
-      <w:instrText xml:space="preserve">PAGE</w:instrText>
-      <w:fldChar w:fldCharType="separate"/>
-      <w:fldChar w:fldCharType="end"/>
-    </w:r>
-    <w:r>
-      <w:rPr>
-        <w:rFonts w:ascii="Arimo" w:cs="Arimo" w:eastAsia="Arimo" w:hAnsi="Arimo"/>
-        <w:b w:val="0"/>
-        <w:bCs w:val="0"/>
-        <w:i w:val="0"/>
-        <w:iCs w:val="0"/>
-        <w:smallCaps w:val="0"/>
-        <w:strike w:val="0"/>
-        <w:color w:val="000000"/>
-        <w:sz w:val="20"/>
-        <w:szCs w:val="20"/>
-        <w:u w:val="none"/>
-        <w:shd w:fill="auto" w:val="clear"/>
-        <w:vertAlign w:val="baseline"/>
-        <w:rtl w:val="0"/>
-      </w:rPr>
-      <w:t xml:space="preserve"> of </w:t>
-    </w:r>
-    <w:r>
-      <w:rPr>
-        <w:rFonts w:ascii="Helvetica Neue" w:cs="Helvetica Neue" w:eastAsia="Helvetica Neue" w:hAnsi="Helvetica Neue"/>
-        <w:b w:val="0"/>
-        <w:bCs w:val="0"/>
-        <w:i w:val="0"/>
-        <w:iCs w:val="0"/>
-        <w:smallCaps w:val="0"/>
-        <w:strike w:val="0"/>
-        <w:color w:val="000000"/>
-        <w:sz w:val="20"/>
-        <w:szCs w:val="20"/>
-        <w:u w:val="none"/>
-        <w:shd w:fill="auto" w:val="clear"/>
-        <w:vertAlign w:val="baseline"/>
-      </w:rPr>
-      <w:fldChar w:fldCharType="begin"/>
-      <w:instrText xml:space="preserve">NUMPAGES</w:instrText>
-      <w:fldChar w:fldCharType="separate"/>
-      <w:fldChar w:fldCharType="end"/>
-    </w:r>
-    <w:r>
-      <w:rPr>
-        <w:rtl w:val="0"/>
-      </w:rPr>
-    </w:r>
+  </w:p>
+</w:ftr>
+</file>
+
+<file path=word/footer2.xml><?xml version="1.0" encoding="utf-8"?>
+<w:ftr xmlns:m="http://schemas.openxmlformats.org/officeDocument/2006/math" xmlns:mc="http://schemas.openxmlformats.org/markup-compatibility/2006" xmlns:mo="http://schemas.microsoft.com/office/mac/office/2008/main" xmlns:mv="urn:schemas-microsoft-com:mac:vml" xmlns:o="urn:schemas-microsoft-com:office:office" xmlns:r="http://schemas.openxmlformats.org/officeDocument/2006/relationships" xmlns:v="urn:schemas-microsoft-com:vml" xmlns:w10="urn:schemas-microsoft-com:office:word" xmlns:w14="http://schemas.microsoft.com/office/word/2010/wordml" xmlns:w="http://schemas.openxmlformats.org/wordprocessingml/2006/main" xmlns:wne="http://schemas.microsoft.com/office/word/2006/wordml" xmlns:wp14="http://schemas.microsoft.com/office/word/2010/wordprocessingDrawing" xmlns:wp="http://schemas.openxmlformats.org/drawingml/2006/wordprocessingDrawing" xmlns:wpc="http://schemas.microsoft.com/office/word/2010/wordprocessingCanvas" xmlns:wpg="http://schemas.microsoft.com/office/word/2010/wordprocessingGroup" xmlns:wpi="http://schemas.microsoft.com/office/word/2010/wordprocessingInk" xmlns:wps="http://schemas.microsoft.com/office/word/2010/wordprocessingShape" mc:Ignorable="w14 wp14">
+  <w:p>
+    <w:pPr>
+      <w:pStyle w:val="Footer"/>
+    </w:pPr>
+  </w:p>
+</w:ftr>
+</file>
+
+<file path=word/footer3.xml><?xml version="1.0" encoding="utf-8"?>
+<w:ftr xmlns:m="http://schemas.openxmlformats.org/officeDocument/2006/math" xmlns:mc="http://schemas.openxmlformats.org/markup-compatibility/2006" xmlns:mo="http://schemas.microsoft.com/office/mac/office/2008/main" xmlns:mv="urn:schemas-microsoft-com:mac:vml" xmlns:o="urn:schemas-microsoft-com:office:office" xmlns:r="http://schemas.openxmlformats.org/officeDocument/2006/relationships" xmlns:v="urn:schemas-microsoft-com:vml" xmlns:w10="urn:schemas-microsoft-com:office:word" xmlns:w14="http://schemas.microsoft.com/office/word/2010/wordml" xmlns:w="http://schemas.openxmlformats.org/wordprocessingml/2006/main" xmlns:wne="http://schemas.microsoft.com/office/word/2006/wordml" xmlns:wp14="http://schemas.microsoft.com/office/word/2010/wordprocessingDrawing" xmlns:wp="http://schemas.openxmlformats.org/drawingml/2006/wordprocessingDrawing" xmlns:wpc="http://schemas.microsoft.com/office/word/2010/wordprocessingCanvas" xmlns:wpg="http://schemas.microsoft.com/office/word/2010/wordprocessingGroup" xmlns:wpi="http://schemas.microsoft.com/office/word/2010/wordprocessingInk" xmlns:wps="http://schemas.microsoft.com/office/word/2010/wordprocessingShape" mc:Ignorable="w14 wp14">
+  <w:p>
+    <w:pPr>
+      <w:pStyle w:val="Footer"/>
+    </w:pPr>
   </w:p>
 </w:ftr>
 </file>

</xml_diff>

<commit_message>
Added MOU workflow up until docusign evelope email, which is waiting on decision
</commit_message>
<xml_diff>
--- a/templates/mou/lia-mou-automation-template.docx
+++ b/templates/mou/lia-mou-automation-template.docx
@@ -3,334 +3,154 @@
 <w:document xmlns:mc="http://schemas.openxmlformats.org/markup-compatibility/2006" xmlns:o="urn:schemas-microsoft-com:office:office" xmlns:r="http://schemas.openxmlformats.org/officeDocument/2006/relationships" xmlns:m="http://schemas.openxmlformats.org/officeDocument/2006/math" xmlns:v="urn:schemas-microsoft-com:vml" xmlns:wp="http://schemas.openxmlformats.org/drawingml/2006/wordprocessingDrawing" xmlns:w10="urn:schemas-microsoft-com:office:word" xmlns:w="http://schemas.openxmlformats.org/wordprocessingml/2006/main" xmlns:wne="http://schemas.microsoft.com/office/word/2006/wordml" xmlns:sl="http://schemas.openxmlformats.org/schemaLibrary/2006/main" xmlns:a="http://schemas.openxmlformats.org/drawingml/2006/main" xmlns:pic="http://schemas.openxmlformats.org/drawingml/2006/picture" xmlns:c="http://schemas.openxmlformats.org/drawingml/2006/chart" xmlns:lc="http://schemas.openxmlformats.org/drawingml/2006/lockedCanvas" xmlns:dgm="http://schemas.openxmlformats.org/drawingml/2006/diagram" xmlns:wps="http://schemas.microsoft.com/office/word/2010/wordprocessingShape" xmlns:wpg="http://schemas.microsoft.com/office/word/2010/wordprocessingGroup" xmlns:w14="http://schemas.microsoft.com/office/word/2010/wordml" xmlns:w15="http://schemas.microsoft.com/office/word/2012/wordml" xmlns:w16="http://schemas.microsoft.com/office/word/2018/wordml" xmlns:w16cex="http://schemas.microsoft.com/office/word/2018/wordml/cex" xmlns:w16cid="http://schemas.microsoft.com/office/word/2016/wordml/cid" xmlns="http://schemas.microsoft.com/office/tasks/2019/documenttasks" xmlns:cr="http://schemas.microsoft.com/office/comments/2020/reactions">
   <w:background w:color="FFFFFF"/>
   <w:body>
-    <w:p>
-      <w:pPr>
-        <w:keepNext w:val="0"/>
-        <w:keepLines w:val="0"/>
-        <w:pageBreakBefore w:val="0"/>
-        <w:widowControl w:val="1"/>
-        <w:pBdr>
-          <w:top w:space="0" w:sz="0" w:val="nil"/>
-          <w:left w:space="0" w:sz="0" w:val="nil"/>
-          <w:bottom w:space="0" w:sz="0" w:val="nil"/>
-          <w:right w:space="0" w:sz="0" w:val="nil"/>
-          <w:between w:space="0" w:sz="0" w:val="nil"/>
-        </w:pBdr>
-        <w:shd w:fill="auto" w:val="clear"/>
-        <w:spacing w:after="0" w:before="0" w:line="259" w:lineRule="auto"/>
-        <w:ind w:left="0" w:right="0" w:firstLine="0"/>
-        <w:jc w:val="center"/>
-        <w:rPr>
-          <w:rFonts w:ascii="Helvetica Neue" w:cs="Helvetica Neue" w:eastAsia="Helvetica Neue" w:hAnsi="Helvetica Neue"/>
-          <w:b w:val="1"/>
-          <w:bCs w:val="1"/>
-          <w:i w:val="0"/>
-          <w:iCs w:val="0"/>
-          <w:smallCaps w:val="0"/>
-          <w:strike w:val="0"/>
-          <w:color w:val="000000"/>
-          <w:sz w:val="24"/>
-          <w:szCs w:val="24"/>
-          <w:u w:val="none"/>
-          <w:shd w:fill="auto" w:val="clear"/>
-          <w:vertAlign w:val="baseline"/>
-        </w:rPr>
-      </w:pPr>
-      <w:r>
-        <w:rPr>
-          <w:rFonts w:ascii="Helvetica Neue" w:cs="Helvetica Neue" w:eastAsia="Helvetica Neue" w:hAnsi="Helvetica Neue"/>
-          <w:b w:val="1"/>
-          <w:bCs w:val="1"/>
-          <w:i w:val="0"/>
-          <w:iCs w:val="0"/>
-          <w:smallCaps w:val="0"/>
-          <w:strike w:val="0"/>
-          <w:color w:val="000000"/>
-          <w:sz w:val="24"/>
-          <w:szCs w:val="24"/>
-          <w:u w:val="none"/>
-          <w:shd w:fill="auto" w:val="clear"/>
-          <w:vertAlign w:val="baseline"/>
-        </w:rPr>
-        <w:drawing>
-          <wp:anchor allowOverlap="1" behindDoc="0" distB="50800" distT="50800" distL="50800" distR="50800" hidden="0" layoutInCell="1" locked="0" relativeHeight="0" simplePos="0">
-            <wp:simplePos x="0" y="0"/>
-            <wp:positionH relativeFrom="margin">
-              <wp:posOffset>2823864</wp:posOffset>
-            </wp:positionH>
-            <wp:positionV relativeFrom="page">
-              <wp:posOffset>264158</wp:posOffset>
-            </wp:positionV>
-            <wp:extent cx="740371" cy="740371"/>
-            <wp:effectExtent b="0" l="0" r="0" t="0"/>
-            <wp:wrapSquare wrapText="bothSides" distB="50800" distT="50800" distL="50800" distR="50800"/>
-            <wp:docPr id="1073741840" name="image3.png"/>
-            <a:graphic>
-              <a:graphicData uri="http://schemas.openxmlformats.org/drawingml/2006/picture">
-                <pic:pic>
-                  <pic:nvPicPr>
-                    <pic:cNvPr id="0" name="image3.png"/>
-                    <pic:cNvPicPr preferRelativeResize="0"/>
-                  </pic:nvPicPr>
-                  <pic:blipFill>
-                    <a:blip r:embed="rId7"/>
-                    <a:srcRect b="0" l="0" r="0" t="0"/>
-                    <a:stretch>
-                      <a:fillRect/>
-                    </a:stretch>
-                  </pic:blipFill>
-                  <pic:spPr>
-                    <a:xfrm>
-                      <a:off x="0" y="0"/>
-                      <a:ext cx="740371" cy="740371"/>
-                    </a:xfrm>
-                    <a:prstGeom prst="rect"/>
-                    <a:ln/>
-                  </pic:spPr>
-                </pic:pic>
-              </a:graphicData>
-            </a:graphic>
-          </wp:anchor>
-        </w:drawing>
-      </w:r>
-      <w:r>
-        <w:rPr>
-          <w:rtl w:val="0"/>
-        </w:rPr>
-      </w:r>
-    </w:p>
-    <w:p>
-      <w:pPr>
-        <w:keepNext w:val="0"/>
-        <w:keepLines w:val="0"/>
-        <w:pageBreakBefore w:val="0"/>
-        <w:widowControl w:val="1"/>
-        <w:pBdr>
-          <w:top w:space="0" w:sz="0" w:val="nil"/>
-          <w:left w:space="0" w:sz="0" w:val="nil"/>
-          <w:bottom w:space="0" w:sz="0" w:val="nil"/>
-          <w:right w:space="0" w:sz="0" w:val="nil"/>
-          <w:between w:space="0" w:sz="0" w:val="nil"/>
-        </w:pBdr>
-        <w:shd w:fill="auto" w:val="clear"/>
-        <w:spacing w:after="120" w:before="0" w:line="240" w:lineRule="auto"/>
-        <w:ind w:left="0" w:right="0" w:firstLine="0"/>
-        <w:jc w:val="center"/>
-        <w:rPr>
-          <w:rFonts w:ascii="Helvetica Neue" w:cs="Helvetica Neue" w:eastAsia="Helvetica Neue" w:hAnsi="Helvetica Neue"/>
-          <w:b w:val="1"/>
-          <w:bCs w:val="1"/>
-          <w:i w:val="0"/>
-          <w:iCs w:val="0"/>
-          <w:smallCaps w:val="0"/>
-          <w:strike w:val="0"/>
-          <w:color w:val="000000"/>
-          <w:sz w:val="22"/>
-          <w:szCs w:val="22"/>
-          <w:u w:val="none"/>
-          <w:shd w:fill="auto" w:val="clear"/>
-          <w:vertAlign w:val="baseline"/>
-        </w:rPr>
-      </w:pPr>
-      <w:r>
-        <w:rPr>
-          <w:rtl w:val="0"/>
-        </w:rPr>
-      </w:r>
-    </w:p>
-    <w:p>
-      <w:pPr>
-        <w:keepNext w:val="0"/>
-        <w:keepLines w:val="0"/>
-        <w:pageBreakBefore w:val="0"/>
-        <w:widowControl w:val="1"/>
-        <w:pBdr>
-          <w:top w:space="0" w:sz="0" w:val="nil"/>
-          <w:left w:space="0" w:sz="0" w:val="nil"/>
-          <w:bottom w:space="0" w:sz="0" w:val="nil"/>
-          <w:right w:space="0" w:sz="0" w:val="nil"/>
-          <w:between w:space="0" w:sz="0" w:val="nil"/>
-        </w:pBdr>
-        <w:shd w:fill="auto" w:val="clear"/>
-        <w:spacing w:after="120" w:before="0" w:line="240" w:lineRule="auto"/>
-        <w:ind w:left="0" w:right="0" w:firstLine="0"/>
-        <w:jc w:val="center"/>
-        <w:rPr>
-          <w:rFonts w:ascii="Arimo" w:cs="Arimo" w:eastAsia="Arimo" w:hAnsi="Arimo"/>
-          <w:b w:val="0"/>
-          <w:bCs w:val="0"/>
-          <w:i w:val="0"/>
-          <w:iCs w:val="0"/>
-          <w:smallCaps w:val="0"/>
-          <w:strike w:val="0"/>
-          <w:color w:val="000000"/>
-          <w:sz w:val="36"/>
-          <w:szCs w:val="36"/>
-          <w:u w:val="none"/>
-          <w:shd w:fill="auto" w:val="clear"/>
-          <w:vertAlign w:val="baseline"/>
-        </w:rPr>
-      </w:pPr>
-      <w:r>
-        <w:rPr>
-          <w:rtl w:val="0"/>
-        </w:rPr>
-      </w:r>
-    </w:p>
-    <w:p>
-      <w:pPr>
-        <w:keepNext w:val="0"/>
-        <w:keepLines w:val="0"/>
-        <w:pageBreakBefore w:val="0"/>
-        <w:widowControl w:val="1"/>
-        <w:pBdr>
-          <w:top w:space="0" w:sz="0" w:val="nil"/>
-          <w:left w:space="0" w:sz="0" w:val="nil"/>
-          <w:bottom w:space="0" w:sz="0" w:val="nil"/>
-          <w:right w:space="0" w:sz="0" w:val="nil"/>
-          <w:between w:space="0" w:sz="0" w:val="nil"/>
-        </w:pBdr>
-        <w:shd w:fill="auto" w:val="clear"/>
-        <w:spacing w:after="120" w:before="0" w:line="240" w:lineRule="auto"/>
-        <w:ind w:left="0" w:right="0" w:firstLine="0"/>
-        <w:jc w:val="center"/>
-        <w:rPr>
-          <w:rFonts w:ascii="Helvetica Neue" w:cs="Helvetica Neue" w:eastAsia="Helvetica Neue" w:hAnsi="Helvetica Neue"/>
-          <w:b w:val="1"/>
-          <w:bCs w:val="1"/>
-          <w:i w:val="0"/>
-          <w:iCs w:val="0"/>
-          <w:smallCaps w:val="0"/>
-          <w:strike w:val="0"/>
-          <w:color w:val="000000"/>
-          <w:sz w:val="36"/>
-          <w:szCs w:val="36"/>
-          <w:u w:val="none"/>
-          <w:shd w:fill="auto" w:val="clear"/>
-          <w:vertAlign w:val="baseline"/>
-        </w:rPr>
-      </w:pPr>
-      <w:r>
-        <w:rPr>
-          <w:rFonts w:ascii="Arimo" w:cs="Arimo" w:eastAsia="Arimo" w:hAnsi="Arimo"/>
-          <w:b w:val="0"/>
-          <w:bCs w:val="0"/>
-          <w:i w:val="0"/>
-          <w:iCs w:val="0"/>
-          <w:smallCaps w:val="0"/>
-          <w:strike w:val="0"/>
-          <w:color w:val="000000"/>
-          <w:sz w:val="36"/>
-          <w:szCs w:val="36"/>
-          <w:u w:val="none"/>
-          <w:shd w:fill="auto" w:val="clear"/>
-          <w:vertAlign w:val="baseline"/>
-          <w:rtl w:val="0"/>
-        </w:rPr>
-        <w:t xml:space="preserve">MEMORANDUM OF UNDERSTANDING</w:t>
-      </w:r>
-      <w:r>
-        <w:rPr>
-          <w:rtl w:val="0"/>
-        </w:rPr>
-      </w:r>
-    </w:p>
-    <w:p>
-      <w:pPr>
-        <w:keepNext w:val="0"/>
-        <w:keepLines w:val="0"/>
-        <w:pageBreakBefore w:val="0"/>
-        <w:widowControl w:val="1"/>
-        <w:pBdr>
-          <w:top w:space="0" w:sz="0" w:val="nil"/>
-          <w:left w:space="0" w:sz="0" w:val="nil"/>
-          <w:bottom w:space="0" w:sz="0" w:val="nil"/>
-          <w:right w:space="0" w:sz="0" w:val="nil"/>
-          <w:between w:space="0" w:sz="0" w:val="nil"/>
-        </w:pBdr>
-        <w:shd w:fill="auto" w:val="clear"/>
-        <w:spacing w:after="640" w:before="0" w:line="240" w:lineRule="auto"/>
-        <w:ind w:left="0" w:right="0" w:firstLine="0"/>
-        <w:jc w:val="center"/>
-        <w:rPr>
-          <w:rFonts w:ascii="Helvetica Neue" w:cs="Helvetica Neue" w:eastAsia="Helvetica Neue" w:hAnsi="Helvetica Neue"/>
-          <w:b w:val="1"/>
-          <w:bCs w:val="1"/>
-          <w:i w:val="0"/>
-          <w:iCs w:val="0"/>
-          <w:smallCaps w:val="0"/>
-          <w:strike w:val="0"/>
-          <w:color w:val="cd1c00"/>
-          <w:sz w:val="24"/>
-          <w:szCs w:val="24"/>
-          <w:u w:val="none"/>
-          <w:shd w:fill="auto" w:val="clear"/>
-          <w:vertAlign w:val="baseline"/>
-        </w:rPr>
-      </w:pPr>
-      <w:r>
-        <w:rPr>
-          <w:rFonts w:ascii="Arimo" w:cs="Arimo" w:eastAsia="Arimo" w:hAnsi="Arimo"/>
-          <w:b w:val="0"/>
-          <w:bCs w:val="0"/>
-          <w:i w:val="0"/>
-          <w:iCs w:val="0"/>
-          <w:smallCaps w:val="0"/>
-          <w:strike w:val="0"/>
-          <w:color w:val="000000"/>
-          <w:sz w:val="24"/>
-          <w:szCs w:val="24"/>
-          <w:u w:val="none"/>
-          <w:shd w:fill="auto" w:val="clear"/>
-          <w:vertAlign w:val="baseline"/>
-          <w:rtl w:val="0"/>
-        </w:rPr>
-        <w:t xml:space="preserve">Between </w:t>
-      </w:r>
-      <w:r>
-        <w:rPr>
-          <w:rFonts w:ascii="Arimo" w:cs="Arimo" w:eastAsia="Arimo" w:hAnsi="Arimo"/>
-          <w:b w:val="1"/>
-          <w:bCs w:val="1"/>
-          <w:i w:val="0"/>
-          <w:iCs w:val="0"/>
-          <w:smallCaps w:val="0"/>
-          <w:strike w:val="0"/>
-          <w:color w:val="000000"/>
-          <w:sz w:val="24"/>
-          <w:szCs w:val="24"/>
-          <w:u w:val="none"/>
-          <w:shd w:fill="auto" w:val="clear"/>
-          <w:vertAlign w:val="baseline"/>
-          <w:rtl w:val="0"/>
-        </w:rPr>
-        <w:t xml:space="preserve">{{contracting_party_name}} </w:t>
-      </w:r>
-      <w:r>
-        <w:rPr>
-          <w:rFonts w:ascii="Arimo" w:cs="Arimo" w:eastAsia="Arimo" w:hAnsi="Arimo"/>
-          <w:b w:val="0"/>
-          <w:bCs w:val="0"/>
-          <w:i w:val="0"/>
-          <w:iCs w:val="0"/>
-          <w:smallCaps w:val="0"/>
-          <w:strike w:val="0"/>
-          <w:color w:val="000000"/>
-          <w:sz w:val="24"/>
-          <w:szCs w:val="24"/>
-          <w:u w:val="none"/>
-          <w:shd w:fill="auto" w:val="clear"/>
-          <w:vertAlign w:val="baseline"/>
-          <w:rtl w:val="0"/>
-        </w:rPr>
-        <w:t xml:space="preserve">and Latinos In Action</w:t>
-      </w:r>
-      <w:r>
-        <w:rPr>
-          <w:rtl w:val="0"/>
-        </w:rPr>
-      </w:r>
-    </w:p>
+    <w:tbl>
+      <w:tblPr>
+        <w:tblW w:type="dxa" w:w="10725"/>
+        <w:tblLayout w:type="fixed"/>
+        <w:tblLook w:firstColumn="1" w:firstRow="1" w:lastColumn="0" w:lastRow="0" w:noHBand="0" w:noVBand="1" w:val="04A0"/>
+        <w:tblBorders>
+          <w:top w:val="nil"/>
+          <w:left w:val="nil"/>
+          <w:bottom w:val="nil"/>
+          <w:right w:val="nil"/>
+          <w:insideH w:val="nil"/>
+          <w:insideV w:val="nil"/>
+        </w:tblBorders>
+      </w:tblPr>
+      <w:tblGrid>
+        <w:gridCol w:w="1300"/>
+        <w:gridCol w:w="8125"/>
+        <w:gridCol w:w="1300"/>
+      </w:tblGrid>
+      <w:tr>
+        <w:tc>
+          <w:tcPr>
+            <w:tcW w:type="dxa" w:w="1300"/>
+            <w:vAlign w:val="center"/>
+            <w:tcMar>
+              <w:top w:w="0" w:type="dxa"/>
+              <w:start w:w="0" w:type="dxa"/>
+              <w:bottom w:w="0" w:type="dxa"/>
+              <w:end w:w="0" w:type="dxa"/>
+            </w:tcMar>
+          </w:tcPr>
+          <w:p>
+            <w:pPr>
+              <w:spacing w:before="0" w:after="0"/>
+              <w:jc w:val="center"/>
+            </w:pPr>
+            <w:r/>
+            <w:r>
+              <w:drawing>
+                <wp:inline>
+                  <wp:extent cx="749808" cy="749808"/>
+                  <wp:docPr id="1073741842" name="Picture 1073741842"/>
+                  <wp:cNvGraphicFramePr>
+                    <a:graphicFrameLocks noChangeAspect="1"/>
+                  </wp:cNvGraphicFramePr>
+                  <a:graphic>
+                    <a:graphicData uri="http://schemas.openxmlformats.org/drawingml/2006/picture">
+                      <pic:pic>
+                        <pic:nvPicPr>
+                          <pic:cNvPr id="0" name="image.png"/>
+                          <pic:cNvPicPr/>
+                        </pic:nvPicPr>
+                        <pic:blipFill>
+                          <a:blip r:embed="rId7"/>
+                          <a:stretch>
+                            <a:fillRect/>
+                          </a:stretch>
+                        </pic:blipFill>
+                        <pic:spPr>
+                          <a:xfrm>
+                            <a:off x="0" y="0"/>
+                            <a:ext cx="749808" cy="749808"/>
+                          </a:xfrm>
+                          <a:prstGeom prst="rect"/>
+                        </pic:spPr>
+                      </pic:pic>
+                    </a:graphicData>
+                  </a:graphic>
+                </wp:inline>
+              </w:drawing>
+            </w:r>
+          </w:p>
+        </w:tc>
+        <w:tc>
+          <w:tcPr>
+            <w:tcW w:type="dxa" w:w="8125"/>
+            <w:vAlign w:val="center"/>
+            <w:tcMar>
+              <w:top w:w="0" w:type="dxa"/>
+              <w:start w:w="0" w:type="dxa"/>
+              <w:bottom w:w="0" w:type="dxa"/>
+              <w:end w:w="0" w:type="dxa"/>
+            </w:tcMar>
+          </w:tcPr>
+          <w:p>
+            <w:pPr>
+              <w:spacing w:before="0" w:after="40"/>
+              <w:jc w:val="center"/>
+            </w:pPr>
+            <w:r/>
+            <w:r>
+              <w:rPr>
+                <w:rFonts w:ascii="Arimo" w:hAnsi="Arimo"/>
+                <w:color w:val="000000"/>
+                <w:sz w:val="36"/>
+              </w:rPr>
+              <w:t>MEMORANDUM OF UNDERSTANDING</w:t>
+            </w:r>
+          </w:p>
+          <w:p>
+            <w:pPr>
+              <w:spacing w:before="0" w:after="0"/>
+              <w:jc w:val="center"/>
+            </w:pPr>
+            <w:r>
+              <w:rPr>
+                <w:rFonts w:ascii="Arimo" w:hAnsi="Arimo"/>
+                <w:b w:val="0"/>
+                <w:color w:val="222222"/>
+                <w:sz w:val="24"/>
+              </w:rPr>
+              <w:t xml:space="preserve">Between </w:t>
+            </w:r>
+            <w:r>
+              <w:rPr>
+                <w:rFonts w:ascii="Arimo" w:hAnsi="Arimo"/>
+                <w:b/>
+                <w:color w:val="222222"/>
+                <w:sz w:val="24"/>
+              </w:rPr>
+              <w:t>{{contracting_party_name}}</w:t>
+            </w:r>
+            <w:r>
+              <w:rPr>
+                <w:rFonts w:ascii="Arimo" w:hAnsi="Arimo"/>
+                <w:b w:val="0"/>
+                <w:color w:val="222222"/>
+                <w:sz w:val="24"/>
+              </w:rPr>
+              <w:t xml:space="preserve"> and Latinos In Action</w:t>
+            </w:r>
+          </w:p>
+        </w:tc>
+        <w:tc>
+          <w:tcPr>
+            <w:tcW w:type="dxa" w:w="1300"/>
+            <w:vAlign w:val="center"/>
+            <w:tcMar>
+              <w:top w:w="0" w:type="dxa"/>
+              <w:start w:w="0" w:type="dxa"/>
+              <w:bottom w:w="0" w:type="dxa"/>
+              <w:end w:w="0" w:type="dxa"/>
+            </w:tcMar>
+          </w:tcPr>
+          <w:p/>
+        </w:tc>
+      </w:tr>
+    </w:tbl>
     <w:p>
       <w:pPr>
         <w:keepNext w:val="0"/>
@@ -3468,7 +3288,7 @@
     </w:p>
     <w:p>
       <w:pPr>
-        <w:keepNext w:val="0"/>
+        <w:keepNext/>
         <w:keepLines w:val="0"/>
         <w:pageBreakBefore w:val="0"/>
         <w:widowControl w:val="1"/>
@@ -3480,7 +3300,7 @@
           <w:between w:space="0" w:sz="0" w:val="nil"/>
         </w:pBdr>
         <w:shd w:fill="auto" w:val="clear"/>
-        <w:spacing w:after="160" w:before="0" w:line="264" w:lineRule="auto"/>
+        <w:spacing w:after="120" w:before="160" w:line="264" w:lineRule="auto"/>
         <w:ind w:left="0" w:right="0" w:firstLine="0"/>
         <w:jc w:val="left"/>
         <w:rPr>
@@ -3502,24 +3322,28 @@
       <w:r>
         <w:rPr>
           <w:rFonts w:ascii="Arimo" w:cs="Arimo" w:eastAsia="Arimo" w:hAnsi="Arimo"/>
-          <w:b w:val="1"/>
+          <w:b/>
           <w:bCs w:val="1"/>
           <w:i w:val="0"/>
           <w:iCs w:val="0"/>
           <w:smallCaps w:val="0"/>
           <w:strike w:val="0"/>
-          <w:color w:val="000000"/>
-          <w:sz w:val="24"/>
-          <w:szCs w:val="24"/>
-          <w:u w:val="none"/>
-          <w:shd w:fill="auto" w:val="clear"/>
-          <w:vertAlign w:val="baseline"/>
-          <w:rtl w:val="0"/>
-        </w:rPr>
-        <w:t>{{contracting_party_name}}</w:t>
-      </w:r>
-      <w:r>
-        <w:rPr>
+          <w:color w:val="222222"/>
+          <w:sz w:val="28"/>
+          <w:szCs w:val="24"/>
+          <w:u w:val="none"/>
+          <w:shd w:fill="auto" w:val="clear"/>
+          <w:vertAlign w:val="baseline"/>
+          <w:rtl w:val="0"/>
+        </w:rPr>
+        <w:t>SCHOOL / DISTRICT RESPONSIBILITIES</w:t>
+      </w:r>
+      <w:r>
+        <w:rPr>
+          <w:rFonts w:ascii="Arimo" w:hAnsi="Arimo"/>
+          <w:b/>
+          <w:color w:val="222222"/>
+          <w:sz w:val="28"/>
           <w:rtl w:val="0"/>
         </w:rPr>
       </w:r>
@@ -3743,6 +3567,62 @@
     </w:p>
     <w:p>
       <w:pPr>
+        <w:keepNext/>
+        <w:keepLines w:val="0"/>
+        <w:pageBreakBefore w:val="0"/>
+        <w:widowControl w:val="1"/>
+        <w:numPr>
+          <w:ilvl w:val="2"/>
+          <w:numId w:val="7"/>
+        </w:numPr>
+        <w:pBdr>
+          <w:top w:space="0" w:sz="0" w:val="nil"/>
+          <w:left w:space="0" w:sz="0" w:val="nil"/>
+          <w:bottom w:space="0" w:sz="0" w:val="nil"/>
+          <w:right w:space="0" w:sz="0" w:val="nil"/>
+          <w:between w:space="0" w:sz="0" w:val="nil"/>
+        </w:pBdr>
+        <w:shd w:fill="auto" w:val="clear"/>
+        <w:spacing w:after="120" w:before="160" w:line="240" w:lineRule="auto"/>
+        <w:ind w:left="0" w:right="0" w:hanging="215.99999999999994"/>
+        <w:jc w:val="left"/>
+        <w:rPr>
+          <w:sz w:val="24"/>
+          <w:szCs w:val="24"/>
+          <w:u w:val="none"/>
+        </w:rPr>
+      </w:pPr>
+      <w:r>
+        <w:rPr>
+          <w:rFonts w:ascii="Arimo" w:cs="Arimo" w:eastAsia="Arimo" w:hAnsi="Arimo"/>
+          <w:b/>
+          <w:bCs w:val="0"/>
+          <w:i w:val="0"/>
+          <w:iCs w:val="0"/>
+          <w:smallCaps w:val="0"/>
+          <w:strike w:val="0"/>
+          <w:color w:val="222222"/>
+          <w:sz w:val="28"/>
+          <w:szCs w:val="24"/>
+          <w:u w:val="none"/>
+          <w:shd w:fill="auto" w:val="clear"/>
+          <w:vertAlign w:val="baseline"/>
+          <w:rtl w:val="0"/>
+        </w:rPr>
+        <w:t xml:space="preserve">Substitute teacher(s) for each LIA teacher 1x/semester for a collaboration day</w:t>
+      </w:r>
+      <w:r>
+        <w:rPr>
+          <w:rFonts w:ascii="Arimo" w:hAnsi="Arimo"/>
+          <w:b/>
+          <w:color w:val="222222"/>
+          <w:sz w:val="28"/>
+          <w:rtl w:val="0"/>
+        </w:rPr>
+      </w:r>
+    </w:p>
+    <w:p>
+      <w:pPr>
         <w:keepNext w:val="0"/>
         <w:keepLines w:val="0"/>
         <w:pageBreakBefore w:val="0"/>
@@ -3759,7 +3639,7 @@
           <w:between w:space="0" w:sz="0" w:val="nil"/>
         </w:pBdr>
         <w:shd w:fill="auto" w:val="clear"/>
-        <w:spacing w:after="40" w:before="0" w:line="240" w:lineRule="auto"/>
+        <w:spacing w:after="160" w:before="0" w:line="240" w:lineRule="auto"/>
         <w:ind w:left="1296" w:right="0" w:hanging="215.99999999999994"/>
         <w:jc w:val="left"/>
         <w:rPr>
@@ -3785,7 +3665,7 @@
           <w:vertAlign w:val="baseline"/>
           <w:rtl w:val="0"/>
         </w:rPr>
-        <w:t xml:space="preserve">Substitute teacher(s) for each LIA teacher 1x/semester for a collaboration day</w:t>
+        <w:t xml:space="preserve">Activities budget for each participating school</w:t>
       </w:r>
       <w:r>
         <w:rPr>
@@ -3811,58 +3691,6 @@
           <w:between w:space="0" w:sz="0" w:val="nil"/>
         </w:pBdr>
         <w:shd w:fill="auto" w:val="clear"/>
-        <w:spacing w:after="40" w:before="0" w:line="240" w:lineRule="auto"/>
-        <w:ind w:left="1296" w:right="0" w:hanging="215.99999999999994"/>
-        <w:jc w:val="left"/>
-        <w:rPr>
-          <w:sz w:val="24"/>
-          <w:szCs w:val="24"/>
-          <w:u w:val="none"/>
-        </w:rPr>
-      </w:pPr>
-      <w:r>
-        <w:rPr>
-          <w:rFonts w:ascii="Arimo" w:cs="Arimo" w:eastAsia="Arimo" w:hAnsi="Arimo"/>
-          <w:b w:val="0"/>
-          <w:bCs w:val="0"/>
-          <w:i w:val="0"/>
-          <w:iCs w:val="0"/>
-          <w:smallCaps w:val="0"/>
-          <w:strike w:val="0"/>
-          <w:color w:val="000000"/>
-          <w:sz w:val="24"/>
-          <w:szCs w:val="24"/>
-          <w:u w:val="none"/>
-          <w:shd w:fill="auto" w:val="clear"/>
-          <w:vertAlign w:val="baseline"/>
-          <w:rtl w:val="0"/>
-        </w:rPr>
-        <w:t xml:space="preserve">Activities budget for each participating school</w:t>
-      </w:r>
-      <w:r>
-        <w:rPr>
-          <w:rtl w:val="0"/>
-        </w:rPr>
-      </w:r>
-    </w:p>
-    <w:p>
-      <w:pPr>
-        <w:keepNext w:val="0"/>
-        <w:keepLines w:val="0"/>
-        <w:pageBreakBefore w:val="0"/>
-        <w:widowControl w:val="1"/>
-        <w:numPr>
-          <w:ilvl w:val="2"/>
-          <w:numId w:val="7"/>
-        </w:numPr>
-        <w:pBdr>
-          <w:top w:space="0" w:sz="0" w:val="nil"/>
-          <w:left w:space="0" w:sz="0" w:val="nil"/>
-          <w:bottom w:space="0" w:sz="0" w:val="nil"/>
-          <w:right w:space="0" w:sz="0" w:val="nil"/>
-          <w:between w:space="0" w:sz="0" w:val="nil"/>
-        </w:pBdr>
-        <w:shd w:fill="auto" w:val="clear"/>
         <w:spacing w:after="160" w:before="0" w:line="240" w:lineRule="auto"/>
         <w:ind w:left="1296" w:right="0" w:hanging="215.99999999999994"/>
         <w:jc w:val="left"/>
@@ -4317,7 +4145,7 @@
     </w:p>
     <w:p>
       <w:pPr>
-        <w:keepNext w:val="0"/>
+        <w:keepNext/>
         <w:keepLines w:val="0"/>
         <w:pageBreakBefore w:val="0"/>
         <w:widowControl w:val="1"/>
@@ -4333,7 +4161,7 @@
           <w:between w:space="0" w:sz="0" w:val="nil"/>
         </w:pBdr>
         <w:shd w:fill="auto" w:val="clear"/>
-        <w:spacing w:after="120" w:before="0" w:line="240" w:lineRule="auto"/>
+        <w:spacing w:after="80" w:before="0" w:line="240" w:lineRule="auto"/>
         <w:ind w:left="990" w:right="0" w:hanging="360"/>
         <w:jc w:val="left"/>
         <w:rPr>
@@ -4384,25 +4212,140 @@
           <w:between w:space="0" w:sz="0" w:val="nil"/>
         </w:pBdr>
         <w:shd w:fill="auto" w:val="clear"/>
+        <w:spacing w:after="240" w:before="0" w:line="240" w:lineRule="auto"/>
+        <w:ind w:left="1080" w:right="0" w:firstLine="0"/>
+        <w:jc w:val="left"/>
+        <w:rPr>
+          <w:rFonts w:ascii="Helvetica Neue" w:cs="Helvetica Neue" w:eastAsia="Helvetica Neue" w:hAnsi="Helvetica Neue"/>
+          <w:b w:val="0"/>
+          <w:bCs w:val="0"/>
+          <w:i w:val="0"/>
+          <w:iCs w:val="0"/>
+          <w:smallCaps w:val="0"/>
+          <w:strike w:val="0"/>
+          <w:color w:val="000000"/>
+          <w:sz w:val="24"/>
+          <w:szCs w:val="24"/>
+          <w:u w:val="none"/>
+          <w:shd w:fill="auto" w:val="clear"/>
+          <w:vertAlign w:val="baseline"/>
+        </w:rPr>
+      </w:pPr>
+      <w:r>
+        <w:rPr>
+          <w:rFonts w:ascii="Arimo" w:cs="Arimo" w:eastAsia="Arimo" w:hAnsi="Arimo"/>
+          <w:b w:val="0"/>
+          <w:bCs w:val="0"/>
+          <w:i w:val="0"/>
+          <w:iCs w:val="0"/>
+          <w:smallCaps w:val="0"/>
+          <w:strike w:val="0"/>
+          <w:color w:val="000000"/>
+          <w:sz w:val="24"/>
+          <w:szCs w:val="24"/>
+          <w:u w:val="none"/>
+          <w:shd w:fill="auto" w:val="clear"/>
+          <w:vertAlign w:val="baseline"/>
+          <w:rtl w:val="0"/>
+        </w:rPr>
+        <w:t xml:space="preserve">A request to implement the LIA program at additional schools within the district must be approved in writing by LIA and </w:t>
+      </w:r>
+      <w:r>
+        <w:rPr>
+          <w:rFonts w:ascii="Arimo" w:cs="Arimo" w:eastAsia="Arimo" w:hAnsi="Arimo"/>
+          <w:b w:val="1"/>
+          <w:bCs w:val="1"/>
+          <w:i w:val="0"/>
+          <w:iCs w:val="0"/>
+          <w:smallCaps w:val="0"/>
+          <w:strike w:val="0"/>
+          <w:color w:val="000000"/>
+          <w:sz w:val="24"/>
+          <w:szCs w:val="24"/>
+          <w:u w:val="none"/>
+          <w:shd w:fill="auto" w:val="clear"/>
+          <w:vertAlign w:val="baseline"/>
+          <w:rtl w:val="0"/>
+        </w:rPr>
+        <w:t xml:space="preserve">{{contracting_party_name}} </w:t>
+      </w:r>
+      <w:r>
+        <w:rPr>
+          <w:rFonts w:ascii="Arimo" w:cs="Arimo" w:eastAsia="Arimo" w:hAnsi="Arimo"/>
+          <w:b w:val="0"/>
+          <w:bCs w:val="0"/>
+          <w:i w:val="0"/>
+          <w:iCs w:val="0"/>
+          <w:smallCaps w:val="0"/>
+          <w:strike w:val="0"/>
+          <w:color w:val="000000"/>
+          <w:sz w:val="24"/>
+          <w:szCs w:val="24"/>
+          <w:u w:val="none"/>
+          <w:shd w:fill="auto" w:val="clear"/>
+          <w:vertAlign w:val="baseline"/>
+          <w:rtl w:val="0"/>
+        </w:rPr>
+        <w:t xml:space="preserve">prior to program implementation at the new school(s). Any additional school approvals must be attached to this agreement as an amendment.</w:t>
+      </w:r>
+      <w:r>
+        <w:rPr>
+          <w:rtl w:val="0"/>
+        </w:rPr>
+      </w:r>
+    </w:p>
+    <w:p>
+      <w:pPr>
+        <w:keepNext w:val="1"/>
+        <w:keepLines w:val="0"/>
+        <w:pageBreakBefore w:val="0"/>
+        <w:widowControl w:val="1"/>
+        <w:pBdr>
+          <w:top w:space="0" w:sz="0" w:val="nil"/>
+          <w:left w:space="0" w:sz="0" w:val="nil"/>
+          <w:bottom w:space="0" w:sz="0" w:val="nil"/>
+          <w:right w:space="0" w:sz="0" w:val="nil"/>
+          <w:between w:space="0" w:sz="0" w:val="nil"/>
+        </w:pBdr>
+        <w:shd w:fill="auto" w:val="clear"/>
         <w:spacing w:after="120" w:before="0" w:line="240" w:lineRule="auto"/>
         <w:ind w:left="0" w:right="0" w:firstLine="0"/>
         <w:jc w:val="left"/>
         <w:rPr>
           <w:rFonts w:ascii="Helvetica Neue" w:cs="Helvetica Neue" w:eastAsia="Helvetica Neue" w:hAnsi="Helvetica Neue"/>
-          <w:b w:val="1"/>
-          <w:bCs w:val="1"/>
-          <w:i w:val="0"/>
-          <w:iCs w:val="0"/>
-          <w:smallCaps w:val="0"/>
-          <w:strike w:val="0"/>
-          <w:color w:val="000000"/>
-          <w:sz w:val="24"/>
-          <w:szCs w:val="24"/>
-          <w:u w:val="none"/>
-          <w:shd w:fill="auto" w:val="clear"/>
-          <w:vertAlign w:val="baseline"/>
-        </w:rPr>
-      </w:pPr>
+          <w:b w:val="0"/>
+          <w:bCs w:val="0"/>
+          <w:i w:val="0"/>
+          <w:iCs w:val="0"/>
+          <w:smallCaps w:val="0"/>
+          <w:strike w:val="0"/>
+          <w:color w:val="000000"/>
+          <w:sz w:val="32"/>
+          <w:szCs w:val="32"/>
+          <w:u w:val="none"/>
+          <w:shd w:fill="auto" w:val="clear"/>
+          <w:vertAlign w:val="baseline"/>
+        </w:rPr>
+      </w:pPr>
+      <w:r>
+        <w:rPr>
+          <w:rFonts w:ascii="Arimo" w:cs="Arimo" w:eastAsia="Arimo" w:hAnsi="Arimo"/>
+          <w:b w:val="0"/>
+          <w:bCs w:val="0"/>
+          <w:i w:val="0"/>
+          <w:iCs w:val="0"/>
+          <w:smallCaps w:val="0"/>
+          <w:strike w:val="0"/>
+          <w:color w:val="000000"/>
+          <w:sz w:val="32"/>
+          <w:szCs w:val="32"/>
+          <w:u w:val="single"/>
+          <w:shd w:fill="auto" w:val="clear"/>
+          <w:vertAlign w:val="baseline"/>
+          <w:rtl w:val="0"/>
+        </w:rPr>
+        <w:t xml:space="preserve">INDIVIDUAL SCHOOL INVOLVEMENT</w:t>
+      </w:r>
       <w:r>
         <w:rPr>
           <w:rtl w:val="0"/>
@@ -4423,47 +4366,11 @@
           <w:between w:space="0" w:sz="0" w:val="nil"/>
         </w:pBdr>
         <w:shd w:fill="auto" w:val="clear"/>
-        <w:spacing w:after="480" w:before="0" w:line="240" w:lineRule="auto"/>
-        <w:ind w:left="1080" w:right="0" w:firstLine="0"/>
+        <w:spacing w:after="60" w:before="0" w:line="240" w:lineRule="auto"/>
+        <w:ind w:left="0" w:right="0" w:firstLine="0"/>
         <w:jc w:val="left"/>
         <w:rPr>
           <w:rFonts w:ascii="Helvetica Neue" w:cs="Helvetica Neue" w:eastAsia="Helvetica Neue" w:hAnsi="Helvetica Neue"/>
-          <w:b w:val="0"/>
-          <w:bCs w:val="0"/>
-          <w:i w:val="0"/>
-          <w:iCs w:val="0"/>
-          <w:smallCaps w:val="0"/>
-          <w:strike w:val="0"/>
-          <w:color w:val="000000"/>
-          <w:sz w:val="24"/>
-          <w:szCs w:val="24"/>
-          <w:u w:val="none"/>
-          <w:shd w:fill="auto" w:val="clear"/>
-          <w:vertAlign w:val="baseline"/>
-        </w:rPr>
-      </w:pPr>
-      <w:r>
-        <w:rPr>
-          <w:rFonts w:ascii="Arimo" w:cs="Arimo" w:eastAsia="Arimo" w:hAnsi="Arimo"/>
-          <w:b w:val="0"/>
-          <w:bCs w:val="0"/>
-          <w:i w:val="0"/>
-          <w:iCs w:val="0"/>
-          <w:smallCaps w:val="0"/>
-          <w:strike w:val="0"/>
-          <w:color w:val="000000"/>
-          <w:sz w:val="24"/>
-          <w:szCs w:val="24"/>
-          <w:u w:val="none"/>
-          <w:shd w:fill="auto" w:val="clear"/>
-          <w:vertAlign w:val="baseline"/>
-          <w:rtl w:val="0"/>
-        </w:rPr>
-        <w:t xml:space="preserve">A request to implement the LIA program at additional schools within the district must be approved in writing by LIA and </w:t>
-      </w:r>
-      <w:r>
-        <w:rPr>
-          <w:rFonts w:ascii="Arimo" w:cs="Arimo" w:eastAsia="Arimo" w:hAnsi="Arimo"/>
           <w:b w:val="1"/>
           <w:bCs w:val="1"/>
           <w:i w:val="0"/>
@@ -4476,86 +4383,26 @@
           <w:u w:val="none"/>
           <w:shd w:fill="auto" w:val="clear"/>
           <w:vertAlign w:val="baseline"/>
-          <w:rtl w:val="0"/>
-        </w:rPr>
-        <w:t xml:space="preserve">{{contracting_party_name}} </w:t>
-      </w:r>
-      <w:r>
-        <w:rPr>
-          <w:rFonts w:ascii="Arimo" w:cs="Arimo" w:eastAsia="Arimo" w:hAnsi="Arimo"/>
-          <w:b w:val="0"/>
-          <w:bCs w:val="0"/>
-          <w:i w:val="0"/>
-          <w:iCs w:val="0"/>
-          <w:smallCaps w:val="0"/>
-          <w:strike w:val="0"/>
-          <w:color w:val="000000"/>
-          <w:sz w:val="24"/>
-          <w:szCs w:val="24"/>
-          <w:u w:val="none"/>
-          <w:shd w:fill="auto" w:val="clear"/>
-          <w:vertAlign w:val="baseline"/>
-          <w:rtl w:val="0"/>
-        </w:rPr>
-        <w:t xml:space="preserve">prior to program implementation at the new school(s). Any additional school approvals must be attached to this agreement as an amendment.</w:t>
-      </w:r>
-      <w:r>
-        <w:rPr>
-          <w:rtl w:val="0"/>
-        </w:rPr>
-      </w:r>
-    </w:p>
-    <w:p>
-      <w:pPr>
-        <w:keepNext w:val="1"/>
-        <w:keepLines w:val="0"/>
-        <w:pageBreakBefore w:val="0"/>
-        <w:widowControl w:val="1"/>
-        <w:pBdr>
-          <w:top w:space="0" w:sz="0" w:val="nil"/>
-          <w:left w:space="0" w:sz="0" w:val="nil"/>
-          <w:bottom w:space="0" w:sz="0" w:val="nil"/>
-          <w:right w:space="0" w:sz="0" w:val="nil"/>
-          <w:between w:space="0" w:sz="0" w:val="nil"/>
-        </w:pBdr>
-        <w:shd w:fill="auto" w:val="clear"/>
-        <w:spacing w:after="120" w:before="0" w:line="240" w:lineRule="auto"/>
-        <w:ind w:left="0" w:right="0" w:firstLine="0"/>
-        <w:jc w:val="left"/>
-        <w:rPr>
-          <w:rFonts w:ascii="Helvetica Neue" w:cs="Helvetica Neue" w:eastAsia="Helvetica Neue" w:hAnsi="Helvetica Neue"/>
-          <w:b w:val="0"/>
-          <w:bCs w:val="0"/>
-          <w:i w:val="0"/>
-          <w:iCs w:val="0"/>
-          <w:smallCaps w:val="0"/>
-          <w:strike w:val="0"/>
-          <w:color w:val="000000"/>
-          <w:sz w:val="32"/>
-          <w:szCs w:val="32"/>
-          <w:u w:val="none"/>
-          <w:shd w:fill="auto" w:val="clear"/>
-          <w:vertAlign w:val="baseline"/>
-        </w:rPr>
-      </w:pPr>
-      <w:r>
-        <w:rPr>
-          <w:rFonts w:ascii="Arimo" w:cs="Arimo" w:eastAsia="Arimo" w:hAnsi="Arimo"/>
-          <w:b w:val="0"/>
-          <w:bCs w:val="0"/>
-          <w:i w:val="0"/>
-          <w:iCs w:val="0"/>
-          <w:smallCaps w:val="0"/>
-          <w:strike w:val="0"/>
-          <w:color w:val="000000"/>
-          <w:sz w:val="32"/>
-          <w:szCs w:val="32"/>
-          <w:u w:val="single"/>
-          <w:shd w:fill="auto" w:val="clear"/>
-          <w:vertAlign w:val="baseline"/>
-          <w:rtl w:val="0"/>
-        </w:rPr>
-        <w:t xml:space="preserve">INDIVIDUAL SCHOOL INVOLVEMENT</w:t>
+        </w:rPr>
+      </w:pPr>
+      <w:r>
+        <w:rPr>
+          <w:rFonts w:ascii="Arimo" w:cs="Arimo" w:eastAsia="Arimo" w:hAnsi="Arimo"/>
+          <w:b w:val="0"/>
+          <w:bCs w:val="0"/>
+          <w:i w:val="0"/>
+          <w:iCs w:val="0"/>
+          <w:smallCaps w:val="0"/>
+          <w:strike w:val="0"/>
+          <w:color w:val="000000"/>
+          <w:sz w:val="24"/>
+          <w:szCs w:val="24"/>
+          <w:u w:val="none"/>
+          <w:shd w:fill="auto" w:val="clear"/>
+          <w:vertAlign w:val="baseline"/>
+          <w:rtl w:val="0"/>
+        </w:rPr>
+        <w:t xml:space="preserve">Program Implementation</w:t>
       </w:r>
       <w:r>
         <w:rPr>
@@ -4577,43 +4424,43 @@
           <w:between w:space="0" w:sz="0" w:val="nil"/>
         </w:pBdr>
         <w:shd w:fill="auto" w:val="clear"/>
-        <w:spacing w:after="60" w:before="0" w:line="240" w:lineRule="auto"/>
+        <w:spacing w:after="120" w:before="0" w:line="240" w:lineRule="auto"/>
         <w:ind w:left="0" w:right="0" w:firstLine="0"/>
         <w:jc w:val="left"/>
         <w:rPr>
           <w:rFonts w:ascii="Helvetica Neue" w:cs="Helvetica Neue" w:eastAsia="Helvetica Neue" w:hAnsi="Helvetica Neue"/>
-          <w:b w:val="1"/>
-          <w:bCs w:val="1"/>
-          <w:i w:val="0"/>
-          <w:iCs w:val="0"/>
-          <w:smallCaps w:val="0"/>
-          <w:strike w:val="0"/>
-          <w:color w:val="000000"/>
-          <w:sz w:val="24"/>
-          <w:szCs w:val="24"/>
-          <w:u w:val="none"/>
-          <w:shd w:fill="auto" w:val="clear"/>
-          <w:vertAlign w:val="baseline"/>
-        </w:rPr>
-      </w:pPr>
-      <w:r>
-        <w:rPr>
-          <w:rFonts w:ascii="Arimo" w:cs="Arimo" w:eastAsia="Arimo" w:hAnsi="Arimo"/>
-          <w:b w:val="0"/>
-          <w:bCs w:val="0"/>
-          <w:i w:val="0"/>
-          <w:iCs w:val="0"/>
-          <w:smallCaps w:val="0"/>
-          <w:strike w:val="0"/>
-          <w:color w:val="000000"/>
-          <w:sz w:val="24"/>
-          <w:szCs w:val="24"/>
-          <w:u w:val="none"/>
-          <w:shd w:fill="auto" w:val="clear"/>
-          <w:vertAlign w:val="baseline"/>
-          <w:rtl w:val="0"/>
-        </w:rPr>
-        <w:t xml:space="preserve">Program Implementation</w:t>
+          <w:b w:val="0"/>
+          <w:bCs w:val="0"/>
+          <w:i w:val="0"/>
+          <w:iCs w:val="0"/>
+          <w:smallCaps w:val="0"/>
+          <w:strike w:val="0"/>
+          <w:color w:val="000000"/>
+          <w:sz w:val="24"/>
+          <w:szCs w:val="24"/>
+          <w:u w:val="none"/>
+          <w:shd w:fill="auto" w:val="clear"/>
+          <w:vertAlign w:val="baseline"/>
+        </w:rPr>
+      </w:pPr>
+      <w:r>
+        <w:rPr>
+          <w:rFonts w:ascii="Arimo" w:cs="Arimo" w:eastAsia="Arimo" w:hAnsi="Arimo"/>
+          <w:b w:val="0"/>
+          <w:bCs w:val="0"/>
+          <w:i w:val="0"/>
+          <w:iCs w:val="0"/>
+          <w:smallCaps w:val="0"/>
+          <w:strike w:val="0"/>
+          <w:color w:val="000000"/>
+          <w:sz w:val="24"/>
+          <w:szCs w:val="24"/>
+          <w:u w:val="none"/>
+          <w:shd w:fill="auto" w:val="clear"/>
+          <w:vertAlign w:val="baseline"/>
+          <w:rtl w:val="0"/>
+        </w:rPr>
+        <w:t xml:space="preserve">Each LIA classroom commits to the following:</w:t>
       </w:r>
       <w:r>
         <w:rPr>
@@ -4623,10 +4470,14 @@
     </w:p>
     <w:p>
       <w:pPr>
-        <w:keepNext w:val="0"/>
+        <w:keepNext/>
         <w:keepLines w:val="0"/>
         <w:pageBreakBefore w:val="0"/>
         <w:widowControl w:val="1"/>
+        <w:numPr>
+          <w:ilvl w:val="2"/>
+          <w:numId w:val="3"/>
+        </w:numPr>
         <w:pBdr>
           <w:top w:space="0" w:sz="0" w:val="nil"/>
           <w:left w:space="0" w:sz="0" w:val="nil"/>
@@ -4635,43 +4486,33 @@
           <w:between w:space="0" w:sz="0" w:val="nil"/>
         </w:pBdr>
         <w:shd w:fill="auto" w:val="clear"/>
-        <w:spacing w:after="120" w:before="0" w:line="240" w:lineRule="auto"/>
-        <w:ind w:left="0" w:right="0" w:firstLine="0"/>
+        <w:spacing w:after="80" w:before="0" w:line="240" w:lineRule="auto"/>
+        <w:ind w:left="1080" w:right="0" w:hanging="360"/>
         <w:jc w:val="left"/>
         <w:rPr>
-          <w:rFonts w:ascii="Helvetica Neue" w:cs="Helvetica Neue" w:eastAsia="Helvetica Neue" w:hAnsi="Helvetica Neue"/>
-          <w:b w:val="0"/>
-          <w:bCs w:val="0"/>
-          <w:i w:val="0"/>
-          <w:iCs w:val="0"/>
-          <w:smallCaps w:val="0"/>
-          <w:strike w:val="0"/>
-          <w:color w:val="000000"/>
-          <w:sz w:val="24"/>
-          <w:szCs w:val="24"/>
-          <w:u w:val="none"/>
-          <w:shd w:fill="auto" w:val="clear"/>
-          <w:vertAlign w:val="baseline"/>
-        </w:rPr>
-      </w:pPr>
-      <w:r>
-        <w:rPr>
-          <w:rFonts w:ascii="Arimo" w:cs="Arimo" w:eastAsia="Arimo" w:hAnsi="Arimo"/>
-          <w:b w:val="0"/>
-          <w:bCs w:val="0"/>
-          <w:i w:val="0"/>
-          <w:iCs w:val="0"/>
-          <w:smallCaps w:val="0"/>
-          <w:strike w:val="0"/>
-          <w:color w:val="000000"/>
-          <w:sz w:val="24"/>
-          <w:szCs w:val="24"/>
-          <w:u w:val="none"/>
-          <w:shd w:fill="auto" w:val="clear"/>
-          <w:vertAlign w:val="baseline"/>
-          <w:rtl w:val="0"/>
-        </w:rPr>
-        <w:t xml:space="preserve">Each LIA classroom commits to the following:</w:t>
+          <w:sz w:val="24"/>
+          <w:szCs w:val="24"/>
+          <w:u w:val="none"/>
+        </w:rPr>
+      </w:pPr>
+      <w:r>
+        <w:rPr>
+          <w:rFonts w:ascii="Arimo" w:cs="Arimo" w:eastAsia="Arimo" w:hAnsi="Arimo"/>
+          <w:b w:val="0"/>
+          <w:bCs w:val="0"/>
+          <w:i w:val="0"/>
+          <w:iCs w:val="0"/>
+          <w:smallCaps w:val="0"/>
+          <w:strike w:val="0"/>
+          <w:color w:val="000000"/>
+          <w:sz w:val="24"/>
+          <w:szCs w:val="24"/>
+          <w:u w:val="none"/>
+          <w:shd w:fill="auto" w:val="clear"/>
+          <w:vertAlign w:val="baseline"/>
+          <w:rtl w:val="0"/>
+        </w:rPr>
+        <w:t xml:space="preserve">Operate as a yearlong elective course with a maximum capacity of 30 students.</w:t>
       </w:r>
       <w:r>
         <w:rPr>
@@ -4697,7 +4538,7 @@
           <w:between w:space="0" w:sz="0" w:val="nil"/>
         </w:pBdr>
         <w:shd w:fill="auto" w:val="clear"/>
-        <w:spacing w:after="60" w:before="0" w:line="240" w:lineRule="auto"/>
+        <w:spacing w:after="240" w:before="0" w:line="240" w:lineRule="auto"/>
         <w:ind w:left="1080" w:right="0" w:hanging="360"/>
         <w:jc w:val="left"/>
         <w:rPr>
@@ -4723,7 +4564,7 @@
           <w:vertAlign w:val="baseline"/>
           <w:rtl w:val="0"/>
         </w:rPr>
-        <w:t xml:space="preserve">Operate as a yearlong elective course with a maximum capacity of 30 students.</w:t>
+        <w:t xml:space="preserve">Understanding and agreement by the teacher, counselors, and school administration that LIA is not to be utilized as a remedial course, an ELD class, or a language class.  </w:t>
       </w:r>
       <w:r>
         <w:rPr>
@@ -4775,7 +4616,7 @@
           <w:vertAlign w:val="baseline"/>
           <w:rtl w:val="0"/>
         </w:rPr>
-        <w:t xml:space="preserve">Understanding and agreement by the teacher, counselors, and school administration that LIA is not to be utilized as a remedial course, an ELD class, or a language class.  </w:t>
+        <w:t xml:space="preserve">Avoidance of political ideology. It should NOT be taught in LIA classrooms; the focus is personal and cultural assets, education, service, and leadership. </w:t>
       </w:r>
       <w:r>
         <w:rPr>
@@ -4827,7 +4668,7 @@
           <w:vertAlign w:val="baseline"/>
           <w:rtl w:val="0"/>
         </w:rPr>
-        <w:t xml:space="preserve">Avoidance of political ideology. It should NOT be taught in LIA classrooms; the focus is personal and cultural assets, education, service, and leadership. </w:t>
+        <w:t xml:space="preserve">The Latinos In Action model, curriculum, and brand are trademarked and may only be used through a subscription with Latinos In Action.</w:t>
       </w:r>
       <w:r>
         <w:rPr>
@@ -4879,58 +4720,6 @@
           <w:vertAlign w:val="baseline"/>
           <w:rtl w:val="0"/>
         </w:rPr>
-        <w:t xml:space="preserve">The Latinos In Action model, curriculum, and brand are trademarked and may only be used through a subscription with Latinos In Action.</w:t>
-      </w:r>
-      <w:r>
-        <w:rPr>
-          <w:rtl w:val="0"/>
-        </w:rPr>
-      </w:r>
-    </w:p>
-    <w:p>
-      <w:pPr>
-        <w:keepNext w:val="0"/>
-        <w:keepLines w:val="0"/>
-        <w:pageBreakBefore w:val="0"/>
-        <w:widowControl w:val="1"/>
-        <w:numPr>
-          <w:ilvl w:val="2"/>
-          <w:numId w:val="3"/>
-        </w:numPr>
-        <w:pBdr>
-          <w:top w:space="0" w:sz="0" w:val="nil"/>
-          <w:left w:space="0" w:sz="0" w:val="nil"/>
-          <w:bottom w:space="0" w:sz="0" w:val="nil"/>
-          <w:right w:space="0" w:sz="0" w:val="nil"/>
-          <w:between w:space="0" w:sz="0" w:val="nil"/>
-        </w:pBdr>
-        <w:shd w:fill="auto" w:val="clear"/>
-        <w:spacing w:after="60" w:before="0" w:line="240" w:lineRule="auto"/>
-        <w:ind w:left="1080" w:right="0" w:hanging="360"/>
-        <w:jc w:val="left"/>
-        <w:rPr>
-          <w:sz w:val="24"/>
-          <w:szCs w:val="24"/>
-          <w:u w:val="none"/>
-        </w:rPr>
-      </w:pPr>
-      <w:r>
-        <w:rPr>
-          <w:rFonts w:ascii="Arimo" w:cs="Arimo" w:eastAsia="Arimo" w:hAnsi="Arimo"/>
-          <w:b w:val="0"/>
-          <w:bCs w:val="0"/>
-          <w:i w:val="0"/>
-          <w:iCs w:val="0"/>
-          <w:smallCaps w:val="0"/>
-          <w:strike w:val="0"/>
-          <w:color w:val="000000"/>
-          <w:sz w:val="24"/>
-          <w:szCs w:val="24"/>
-          <w:u w:val="none"/>
-          <w:shd w:fill="auto" w:val="clear"/>
-          <w:vertAlign w:val="baseline"/>
-          <w:rtl w:val="0"/>
-        </w:rPr>
         <w:t xml:space="preserve">Highly Qualified teacher: A certified teacher, not a paraprofessional. Chosen with advisement of the LIA administrative staff by June 1 prior to the start of the school year.</w:t>
       </w:r>
       <w:r>
@@ -8493,6 +8282,9 @@
         <w:rPr>
           <w:rFonts w:ascii="Arimo" w:cs="Arimo" w:eastAsia="Arimo" w:hAnsi="Arimo"/>
         </w:rPr>
+        <w:pageBreakBefore/>
+        <w:pageBreakBefore/>
+        <w:pageBreakBefore/>
         <w:pageBreakBefore/>
         <w:pageBreakBefore/>
       </w:pPr>
@@ -10261,7 +10053,7 @@
               <w:drawing>
                 <wp:inline>
                   <wp:extent cx="1920240" cy="552069"/>
-                  <wp:docPr id="1073741841" name="Picture 1073741841"/>
+                  <wp:docPr id="1073741843" name="Picture 1073741843"/>
                   <wp:cNvGraphicFramePr>
                     <a:graphicFrameLocks noChangeAspect="1"/>
                   </wp:cNvGraphicFramePr>

</xml_diff>

<commit_message>
changed mou template wording
</commit_message>
<xml_diff>
--- a/templates/mou/lia-mou-automation-template.docx
+++ b/templates/mou/lia-mou-automation-template.docx
@@ -123,7 +123,7 @@
                 <w:color w:val="222222"/>
                 <w:sz w:val="24"/>
               </w:rPr>
-              <w:t>{{contracting_party_name}}</w:t>
+              <w:t>{{school_name}}</w:t>
             </w:r>
             <w:r>
               <w:rPr>
@@ -544,7 +544,7 @@
           <w:vertAlign w:val="baseline"/>
           <w:rtl w:val="0"/>
         </w:rPr>
-        <w:t xml:space="preserve">{{contracting_party_name}} </w:t>
+        <w:t xml:space="preserve">{{school_name}} </w:t>
       </w:r>
       <w:r>
         <w:rPr>
@@ -1306,7 +1306,7 @@
           <w:vertAlign w:val="baseline"/>
           <w:rtl w:val="0"/>
         </w:rPr>
-        <w:t xml:space="preserve">{{contracting_party_name}} </w:t>
+        <w:t xml:space="preserve">{{school_name}} </w:t>
       </w:r>
       <w:r>
         <w:rPr>
@@ -3962,7 +3962,7 @@
           <w:vertAlign w:val="baseline"/>
           <w:rtl w:val="0"/>
         </w:rPr>
-        <w:t xml:space="preserve">{{contracting_party_name}} </w:t>
+        <w:t xml:space="preserve">{{school_name}} </w:t>
       </w:r>
       <w:r>
         <w:rPr>
@@ -4116,7 +4116,7 @@
           <w:vertAlign w:val="baseline"/>
           <w:rtl w:val="0"/>
         </w:rPr>
-        <w:t xml:space="preserve">{{contracting_party_name}} </w:t>
+        <w:t xml:space="preserve">{{school_name}} </w:t>
       </w:r>
       <w:r>
         <w:rPr>
@@ -4267,7 +4267,7 @@
           <w:vertAlign w:val="baseline"/>
           <w:rtl w:val="0"/>
         </w:rPr>
-        <w:t xml:space="preserve">{{contracting_party_name}} </w:t>
+        <w:t xml:space="preserve">{{school_name}} </w:t>
       </w:r>
       <w:r>
         <w:rPr>
@@ -6423,7 +6423,7 @@
           <w:vertAlign w:val="baseline"/>
           <w:rtl w:val="0"/>
         </w:rPr>
-        <w:t xml:space="preserve">{{contracting_party_name}} </w:t>
+        <w:t xml:space="preserve">{{school_name}} </w:t>
       </w:r>
       <w:r>
         <w:rPr>
@@ -6539,7 +6539,7 @@
           <w:vertAlign w:val="baseline"/>
           <w:rtl w:val="0"/>
         </w:rPr>
-        <w:t xml:space="preserve">{{contracting_party_name}} </w:t>
+        <w:t xml:space="preserve">{{school_name}} </w:t>
       </w:r>
       <w:r>
         <w:rPr>
@@ -6577,7 +6577,7 @@
           <w:vertAlign w:val="baseline"/>
           <w:rtl w:val="0"/>
         </w:rPr>
-        <w:t xml:space="preserve">{{contracting_party_name}} </w:t>
+        <w:t xml:space="preserve">{{school_name}} </w:t>
       </w:r>
       <w:r>
         <w:rPr>
@@ -6838,7 +6838,7 @@
           <w:vertAlign w:val="baseline"/>
           <w:rtl w:val="0"/>
         </w:rPr>
-        <w:t>Nothing contained in this MOU will be construed to create the relationship of employer and employee, principal and agent, partnership or joint venture, or any other fiduciary relationship between {{contracting_party_name}} and LIA, or between the District and LIA’s employees, agents, or independent contractors. LIA and its employees, agents, or independent contractors do not have authority to act as agent for, or on behalf of, the District, to represent the District, or to bind the District in any manner. LIA will be solely responsible for the activities of its employees, agents and independent contractors, and its role pursuant to this MOU.</w:t>
+        <w:t>Nothing contained in this MOU will be construed to create the relationship of employer and employee, principal and agent, partnership or joint venture, or any other fiduciary relationship between {{school_name}} and LIA, or between the District and LIA’s employees, agents, or independent contractors. LIA and its employees, agents, or independent contractors do not have authority to act as agent for, or on behalf of, the District, to represent the District, or to bind the District in any manner. LIA will be solely responsible for the activities of its employees, agents and independent contractors, and its role pursuant to this MOU.</w:t>
       </w:r>
     </w:p>
     <w:p>
@@ -7196,7 +7196,7 @@
           <w:vertAlign w:val="baseline"/>
           <w:rtl w:val="0"/>
         </w:rPr>
-        <w:t>Latinos In Action (“LIA”) is permitted to use video footage and/or images captured at {{contracting_party_name}} for program-related purposes, including training, reporting, communications, and promotional materials, provided that a valid and signed photo/video waiver has been obtained from the parent or legal guardian of any student depicted. The {{contracting_party_name}}, including its teachers and staff, is responsible for obtaining, maintaining, and securely filing all required photo/video waivers and ensuring that only students with signed waivers are included in any footage or images shared with LIA.</w:t>
+        <w:t>Latinos In Action (“LIA”) is permitted to use video footage and/or images captured at {{school_name}} for program-related purposes, including training, reporting, communications, and promotional materials, provided that a valid and signed photo/video waiver has been obtained from the parent or legal guardian of any student depicted. The {{school_name}}, including its teachers and staff, is responsible for obtaining, maintaining, and securely filing all required photo/video waivers and ensuring that only students with signed waivers are included in any footage or images shared with LIA.</w:t>
       </w:r>
     </w:p>
     <w:p>
@@ -7418,7 +7418,7 @@
           <w:vertAlign w:val="baseline"/>
           <w:rtl w:val="0"/>
         </w:rPr>
-        <w:t>The {{contracting_party_name}} is granted a limited, non-exclusive, non-transferable permission to use LIA materials solely for the purpose of implementing the Latinos In Action program at the authorized school(s) during the term of this Memorandum of Understanding. The {{contracting_party_name}} agrees not to reproduce, distribute, modify, publish, or share LIA materials with third parties outside the scope of the authorized program without prior written permission from Latinos In Action.</w:t>
+        <w:t>The {{school_name}} is granted a limited, non-exclusive, non-transferable permission to use LIA materials solely for the purpose of implementing the Latinos In Action program at the authorized school(s) during the term of this Memorandum of Understanding. The {{school_name}} agrees not to reproduce, distribute, modify, publish, or share LIA materials with third parties outside the scope of the authorized program without prior written permission from Latinos In Action.</w:t>
       </w:r>
     </w:p>
     <w:p>
@@ -7529,7 +7529,7 @@
           <w:vertAlign w:val="baseline"/>
           <w:rtl w:val="0"/>
         </w:rPr>
-        <w:t>The {{contracting_party_name}} agrees to take reasonable steps to protect the confidentiality and integrity of Latinos In Action materials. LIA curriculum, lesson materials, training resources, and related content may not be uploaded to shared district repositories, learning management systems, or publicly accessible platforms, nor distributed to other schools, programs, or educators who are not participating in an authorized Latinos In Action program, without prior written permission from Latinos In Action.</w:t>
+        <w:t>The {{school_name}} agrees to take reasonable steps to protect the confidentiality and integrity of Latinos In Action materials. LIA curriculum, lesson materials, training resources, and related content may not be uploaded to shared district repositories, learning management systems, or publicly accessible platforms, nor distributed to other schools, programs, or educators who are not participating in an authorized Latinos In Action program, without prior written permission from Latinos In Action.</w:t>
       </w:r>
     </w:p>
     <w:p>
@@ -7640,7 +7640,7 @@
           <w:vertAlign w:val="baseline"/>
           <w:rtl w:val="0"/>
         </w:rPr>
-        <w:t>The {{contracting_party_name}} agrees not to use the Latinos In Action name, logo, or branding in connection with any program, curriculum, or activity that is not part of an authorized Latinos In Action program. The {{contracting_party_name}} further agrees not to replicate, adapt, rebrand, or create derivative programs based on the Latinos In Action program model, curriculum, or materials outside the scope of an active agreement with Latinos In Action.</w:t>
+        <w:t>The {{school_name}} agrees not to use the Latinos In Action name, logo, or branding in connection with any program, curriculum, or activity that is not part of an authorized Latinos In Action program. The {{school_name}} further agrees not to replicate, adapt, rebrand, or create derivative programs based on the Latinos In Action program model, curriculum, or materials outside the scope of an active agreement with Latinos In Action.</w:t>
       </w:r>
     </w:p>
     <w:p>
@@ -7751,7 +7751,7 @@
           <w:vertAlign w:val="baseline"/>
           <w:rtl w:val="0"/>
         </w:rPr>
-        <w:t>The {{contracting_party_name}} will make reasonable efforts to ensure that educators, staff members, or contractors who have access to LIA materials understand that these materials are provided solely for use within the authorized Latinos In Action program and may not be transferred, reused, or implemented in other schools, districts, or programs without written authorization from Latinos In Action.</w:t>
+        <w:t>The {{school_name}} will make reasonable efforts to ensure that educators, staff members, or contractors who have access to LIA materials understand that these materials are provided solely for use within the authorized Latinos In Action program and may not be transferred, reused, or implemented in other schools, districts, or programs without written authorization from Latinos In Action.</w:t>
       </w:r>
     </w:p>
     <w:p>
@@ -7862,7 +7862,7 @@
           <w:vertAlign w:val="baseline"/>
           <w:rtl w:val="0"/>
         </w:rPr>
-        <w:t>Upon termination or expiration of this agreement, the {{contracting_party_name}} agrees to discontinue use of all Latinos In Action curriculum, materials, and branding, including the LIA name and logo, unless otherwise authorized in writing by Latinos In Action. The {{contracting_party_name}} will make reasonable efforts to ensure that copies of LIA materials are not retained, redistributed, or used outside the scope of the program after the agreement ends.</w:t>
+        <w:t>Upon termination or expiration of this agreement, the {{school_name}} agrees to discontinue use of all Latinos In Action curriculum, materials, and branding, including the LIA name and logo, unless otherwise authorized in writing by Latinos In Action. The {{school_name}} will make reasonable efforts to ensure that copies of LIA materials are not retained, redistributed, or used outside the scope of the program after the agreement ends.</w:t>
       </w:r>
     </w:p>
     <w:p>
@@ -7973,7 +7973,7 @@
           <w:vertAlign w:val="baseline"/>
           <w:rtl w:val="0"/>
         </w:rPr>
-        <w:t>Nothing in this agreement shall be interpreted as transferring ownership of Latinos In Action intellectual property to the {{contracting_party_name}}. Educators may apply general instructional strategies learned through the program; however, the Latinos In Action curriculum, program structure, and branded materials may only be used within an authorized Latinos In Action partnership.</w:t>
+        <w:t>Nothing in this agreement shall be interpreted as transferring ownership of Latinos In Action intellectual property to the {{school_name}}. Educators may apply general instructional strategies learned through the program; however, the Latinos In Action curriculum, program structure, and branded materials may only be used within an authorized Latinos In Action partnership.</w:t>
       </w:r>
     </w:p>
     <w:p>
@@ -8084,7 +8084,7 @@
           <w:vertAlign w:val="baseline"/>
           <w:rtl w:val="0"/>
         </w:rPr>
-        <w:t>Professional development content, training materials, and implementation guidance provided by Latinos In Action are intended solely to support educators participating in an authorized Latinos In Action program during the term of this agreement. The {{contracting_party_name}} agrees not to use these materials to independently train additional educators, expand the program to additional schools, or support implementation of a similar program outside of an active agreement with Latinos In Action without prior written authorization from Latinos In Action.</w:t>
+        <w:t>Professional development content, training materials, and implementation guidance provided by Latinos In Action are intended solely to support educators participating in an authorized Latinos In Action program during the term of this agreement. The {{school_name}} agrees not to use these materials to independently train additional educators, expand the program to additional schools, or support implementation of a similar program outside of an active agreement with Latinos In Action without prior written authorization from Latinos In Action.</w:t>
       </w:r>
     </w:p>
     <w:p>

</xml_diff>

<commit_message>
Deleted sentence from MOU
</commit_message>
<xml_diff>
--- a/templates/mou/lia-mou-automation-template.docx
+++ b/templates/mou/lia-mou-automation-template.docx
@@ -9864,20 +9864,6 @@
       </w:tr>
     </w:tbl>
     <w:p>
-      <w:pPr>
-        <w:spacing w:before="200" w:after="0"/>
-      </w:pPr>
-      <w:r>
-        <w:rPr>
-          <w:rFonts w:ascii="Arimo" w:hAnsi="Arimo"/>
-          <w:b w:val="0"/>
-          <w:color w:val="222222"/>
-          <w:sz w:val="18"/>
-        </w:rPr>
-        <w:t>*After the second-year renewal, future renewal pricing will be based on the second-year renewal amount plus the applicable inflation percentage.</w:t>
-      </w:r>
-    </w:p>
-    <w:p>
       <w:r>
         <w:br w:type="page"/>
       </w:r>

</xml_diff>